<commit_message>
Semana 5: Builder en módulo de reportes
- ReporteFinca (producto inmutable), ReporteBuilder, ReporteConsolaBuilder
  y DirectorReportes con las recetas de turno y gerencial.
- MainDemoBuilder con 6 pruebas y capturas 13 a 18.
- Se integra con las semanas 3 (Singleton) y 4 (Factory Method).
- Word regenerado con la sección Semana 5.
</commit_message>
<xml_diff>
--- a/Patrones-de-Software-E195.docx
+++ b/Patrones-de-Software-E195.docx
@@ -7958,6 +7958,2935 @@
         </w:tc>
       </w:tr>
     </w:tbl>
+    <w:p>
+      <w:pPr>
+        <w:pStyle w:val="Heading1"/>
+      </w:pPr>
+      <w:r>
+        <w:t xml:space="preserve">Semana 5 — Patrón Builder</w:t>
+      </w:r>
+    </w:p>
+    <w:p>
+      <w:pPr>
+        <w:pStyle w:val="FirstParagraph"/>
+      </w:pPr>
+      <w:r>
+        <w:t xml:space="preserve">Aplicación del patrón</w:t>
+      </w:r>
+      <w:r>
+        <w:t xml:space="preserve"> </w:t>
+      </w:r>
+      <w:r>
+        <w:rPr>
+          <w:b/>
+          <w:bCs/>
+        </w:rPr>
+        <w:t xml:space="preserve">Builder</w:t>
+      </w:r>
+      <w:r>
+        <w:t xml:space="preserve"> </w:t>
+      </w:r>
+      <w:r>
+        <w:t xml:space="preserve">en el módulo de reportes del prototipo</w:t>
+      </w:r>
+      <w:r>
+        <w:t xml:space="preserve"> </w:t>
+      </w:r>
+      <w:r>
+        <w:rPr>
+          <w:b/>
+          <w:bCs/>
+        </w:rPr>
+        <w:t xml:space="preserve">AgroPrecisión</w:t>
+      </w:r>
+      <w:r>
+        <w:t xml:space="preserve">.</w:t>
+      </w:r>
+      <w:r>
+        <w:t xml:space="preserve"> </w:t>
+      </w:r>
+      <w:r>
+        <w:t xml:space="preserve">Permite armar un reporte de estado de la finca por partes —encabezado, lecturas, alertas,</w:t>
+      </w:r>
+      <w:r>
+        <w:t xml:space="preserve"> </w:t>
+      </w:r>
+      <w:r>
+        <w:t xml:space="preserve">inventario, resumen— y obtener reportes distintos (el de turno del operario, el gerencial) con el</w:t>
+      </w:r>
+      <w:r>
+        <w:t xml:space="preserve"> </w:t>
+      </w:r>
+      <w:r>
+        <w:t xml:space="preserve">mismo proceso de construcción, sin constructores con ocho parámetros ni banderas booleanas.</w:t>
+      </w:r>
+    </w:p>
+    <w:p>
+      <w:pPr>
+        <w:pStyle w:val="BodyText"/>
+      </w:pPr>
+      <w:r>
+        <w:rPr>
+          <w:b/>
+          <w:bCs/>
+        </w:rPr>
+        <w:t xml:space="preserve">Estudiantes:</w:t>
+      </w:r>
+      <w:r>
+        <w:t xml:space="preserve"> </w:t>
+      </w:r>
+      <w:r>
+        <w:t xml:space="preserve">Jeisson Stewen Berdugo Cely · Darwin Felipe Gil López</w:t>
+      </w:r>
+      <w:r>
+        <w:t xml:space="preserve"> </w:t>
+      </w:r>
+      <w:r>
+        <w:rPr>
+          <w:b/>
+          <w:bCs/>
+        </w:rPr>
+        <w:t xml:space="preserve">Grupo:</w:t>
+      </w:r>
+      <w:r>
+        <w:t xml:space="preserve"> </w:t>
+      </w:r>
+      <w:r>
+        <w:t xml:space="preserve">E-195</w:t>
+      </w:r>
+    </w:p>
+    <w:p>
+      <w:pPr>
+        <w:pStyle w:val="BodyText"/>
+      </w:pPr>
+      <w:r>
+        <w:rPr>
+          <w:b/>
+          <w:bCs/>
+        </w:rPr>
+        <w:t xml:space="preserve">Código:</w:t>
+      </w:r>
+      <w:r>
+        <w:t xml:space="preserve"> </w:t>
+      </w:r>
+      <w:r>
+        <w:rPr>
+          <w:rStyle w:val="VerbatimChar"/>
+        </w:rPr>
+        <w:t xml:space="preserve">ReporteFinca.java</w:t>
+      </w:r>
+      <w:r>
+        <w:t xml:space="preserve"> </w:t>
+      </w:r>
+      <w:r>
+        <w:t xml:space="preserve">(producto) ·</w:t>
+      </w:r>
+      <w:r>
+        <w:t xml:space="preserve"> </w:t>
+      </w:r>
+      <w:r>
+        <w:rPr>
+          <w:rStyle w:val="VerbatimChar"/>
+        </w:rPr>
+        <w:t xml:space="preserve">ReporteBuilder.java</w:t>
+      </w:r>
+      <w:r>
+        <w:t xml:space="preserve"> </w:t>
+      </w:r>
+      <w:r>
+        <w:t xml:space="preserve">(builder) ·</w:t>
+      </w:r>
+      <w:r>
+        <w:t xml:space="preserve"> </w:t>
+      </w:r>
+      <w:r>
+        <w:rPr>
+          <w:rStyle w:val="VerbatimChar"/>
+        </w:rPr>
+        <w:t xml:space="preserve">ReporteConsolaBuilder.java</w:t>
+      </w:r>
+      <w:r>
+        <w:t xml:space="preserve"> </w:t>
+      </w:r>
+      <w:r>
+        <w:t xml:space="preserve">(builder concreto) ·</w:t>
+      </w:r>
+      <w:r>
+        <w:t xml:space="preserve"> </w:t>
+      </w:r>
+      <w:r>
+        <w:rPr>
+          <w:rStyle w:val="VerbatimChar"/>
+        </w:rPr>
+        <w:t xml:space="preserve">DirectorReportes.java</w:t>
+      </w:r>
+      <w:r>
+        <w:t xml:space="preserve"> </w:t>
+      </w:r>
+      <w:r>
+        <w:t xml:space="preserve">(director) ·</w:t>
+      </w:r>
+      <w:r>
+        <w:t xml:space="preserve"> </w:t>
+      </w:r>
+      <w:r>
+        <w:rPr>
+          <w:rStyle w:val="VerbatimChar"/>
+        </w:rPr>
+        <w:t xml:space="preserve">MainDemoBuilder.java</w:t>
+      </w:r>
+      <w:r>
+        <w:t xml:space="preserve"> </w:t>
+      </w:r>
+      <w:r>
+        <w:t xml:space="preserve">(demo)</w:t>
+      </w:r>
+    </w:p>
+    <w:p>
+      <w:pPr>
+        <w:pStyle w:val="BodyText"/>
+      </w:pPr>
+      <w:r>
+        <w:rPr>
+          <w:b/>
+          <w:bCs/>
+        </w:rPr>
+        <w:t xml:space="preserve">Para ejecutar:</w:t>
+      </w:r>
+    </w:p>
+    <w:p>
+      <w:pPr>
+        <w:pStyle w:val="SourceCode"/>
+      </w:pPr>
+      <w:r>
+        <w:rPr>
+          <w:rStyle w:val="VerbatimChar"/>
+        </w:rPr>
+        <w:t xml:space="preserve">cd semana-5-builder/src &amp;&amp; javac *.java &amp;&amp; java MainDemoBuilder</w:t>
+      </w:r>
+    </w:p>
+    <w:p>
+      <w:pPr>
+        <w:pStyle w:val="FirstParagraph"/>
+      </w:pPr>
+      <w:r>
+        <w:t xml:space="preserve">Las clases</w:t>
+      </w:r>
+      <w:r>
+        <w:t xml:space="preserve"> </w:t>
+      </w:r>
+      <w:r>
+        <w:rPr>
+          <w:rStyle w:val="VerbatimChar"/>
+        </w:rPr>
+        <w:t xml:space="preserve">SesionUsuario</w:t>
+      </w:r>
+      <w:r>
+        <w:t xml:space="preserve">,</w:t>
+      </w:r>
+      <w:r>
+        <w:t xml:space="preserve"> </w:t>
+      </w:r>
+      <w:r>
+        <w:rPr>
+          <w:rStyle w:val="VerbatimChar"/>
+        </w:rPr>
+        <w:t xml:space="preserve">ConfiguracionSistema</w:t>
+      </w:r>
+      <w:r>
+        <w:t xml:space="preserve">,</w:t>
+      </w:r>
+      <w:r>
+        <w:t xml:space="preserve"> </w:t>
+      </w:r>
+      <w:r>
+        <w:rPr>
+          <w:rStyle w:val="VerbatimChar"/>
+        </w:rPr>
+        <w:t xml:space="preserve">Lectura</w:t>
+      </w:r>
+      <w:r>
+        <w:t xml:space="preserve">,</w:t>
+      </w:r>
+      <w:r>
+        <w:t xml:space="preserve"> </w:t>
+      </w:r>
+      <w:r>
+        <w:rPr>
+          <w:rStyle w:val="VerbatimChar"/>
+        </w:rPr>
+        <w:t xml:space="preserve">Sensor</w:t>
+      </w:r>
+      <w:r>
+        <w:t xml:space="preserve">, los sensores y los</w:t>
+      </w:r>
+      <w:r>
+        <w:t xml:space="preserve"> </w:t>
+      </w:r>
+      <w:r>
+        <w:t xml:space="preserve">creadores están copiadas de las semanas 3 y 4 para que esta carpeta compile por sí sola. No se</w:t>
+      </w:r>
+      <w:r>
+        <w:t xml:space="preserve"> </w:t>
+      </w:r>
+      <w:r>
+        <w:t xml:space="preserve">modificó nada de su contenido.</w:t>
+      </w:r>
+    </w:p>
+    <w:p>
+      <w:r>
+        <w:pict>
+          <v:rect style="width:0;height:1.5pt" o:hralign="center" o:hrstd="t" o:hr="t"/>
+        </w:pict>
+      </w:r>
+    </w:p>
+    <w:p>
+      <w:pPr>
+        <w:pStyle w:val="Heading2"/>
+      </w:pPr>
+      <w:r>
+        <w:t xml:space="preserve">El problema</w:t>
+      </w:r>
+    </w:p>
+    <w:p>
+      <w:pPr>
+        <w:pStyle w:val="FirstParagraph"/>
+      </w:pPr>
+      <w:r>
+        <w:t xml:space="preserve">El módulo de reportes imprime por consola el estado de la finca. Pero no hay</w:t>
+      </w:r>
+      <w:r>
+        <w:t xml:space="preserve"> </w:t>
+      </w:r>
+      <w:r>
+        <w:rPr>
+          <w:i/>
+          <w:iCs/>
+        </w:rPr>
+        <w:t xml:space="preserve">un</w:t>
+      </w:r>
+      <w:r>
+        <w:t xml:space="preserve"> </w:t>
+      </w:r>
+      <w:r>
+        <w:t xml:space="preserve">reporte: el</w:t>
+      </w:r>
+      <w:r>
+        <w:t xml:space="preserve"> </w:t>
+      </w:r>
+      <w:r>
+        <w:t xml:space="preserve">operario de riego necesita al empezar el turno solo las lecturas y las alertas; la gerencia quiere</w:t>
+      </w:r>
+      <w:r>
+        <w:t xml:space="preserve"> </w:t>
+      </w:r>
+      <w:r>
+        <w:t xml:space="preserve">además el encabezado con el responsable, el inventario y un resumen con totales. Y mañana puede</w:t>
+      </w:r>
+      <w:r>
+        <w:t xml:space="preserve"> </w:t>
+      </w:r>
+      <w:r>
+        <w:t xml:space="preserve">aparecer otro con solo el inventario para el bodeguero.</w:t>
+      </w:r>
+    </w:p>
+    <w:p>
+      <w:pPr>
+        <w:pStyle w:val="BodyText"/>
+      </w:pPr>
+      <w:r>
+        <w:t xml:space="preserve">Sin patrón, la clase</w:t>
+      </w:r>
+      <w:r>
+        <w:t xml:space="preserve"> </w:t>
+      </w:r>
+      <w:r>
+        <w:rPr>
+          <w:rStyle w:val="VerbatimChar"/>
+        </w:rPr>
+        <w:t xml:space="preserve">ReporteFinca</w:t>
+      </w:r>
+      <w:r>
+        <w:t xml:space="preserve"> </w:t>
+      </w:r>
+      <w:r>
+        <w:t xml:space="preserve">termina con un constructor así:</w:t>
+      </w:r>
+    </w:p>
+    <w:p>
+      <w:pPr>
+        <w:pStyle w:val="SourceCode"/>
+      </w:pPr>
+      <w:r>
+        <w:rPr>
+          <w:rStyle w:val="VerbatimChar"/>
+        </w:rPr>
+        <w:t xml:space="preserve">new ReporteFinca("Reporte gerencial", "Finca La Esperanza", "admin",</w:t>
+      </w:r>
+      <w:r>
+        <w:br/>
+      </w:r>
+      <w:r>
+        <w:rPr>
+          <w:rStyle w:val="VerbatimChar"/>
+        </w:rPr>
+        <w:t xml:space="preserve">                 lecturas, alertas, inventario, true);</w:t>
+      </w:r>
+    </w:p>
+    <w:p>
+      <w:pPr>
+        <w:pStyle w:val="FirstParagraph"/>
+      </w:pPr>
+      <w:r>
+        <w:t xml:space="preserve">Siete parámetros, la mitad opcionales, y para el reporte del operario habría que pasar</w:t>
+      </w:r>
+      <w:r>
+        <w:t xml:space="preserve"> </w:t>
+      </w:r>
+      <w:r>
+        <w:rPr>
+          <w:rStyle w:val="VerbatimChar"/>
+        </w:rPr>
+        <w:t xml:space="preserve">null</w:t>
+      </w:r>
+      <w:r>
+        <w:t xml:space="preserve">,</w:t>
+      </w:r>
+      <w:r>
+        <w:t xml:space="preserve"> </w:t>
+      </w:r>
+      <w:r>
+        <w:rPr>
+          <w:rStyle w:val="VerbatimChar"/>
+        </w:rPr>
+        <w:t xml:space="preserve">null</w:t>
+      </w:r>
+      <w:r>
+        <w:t xml:space="preserve">, listas vacías y</w:t>
+      </w:r>
+      <w:r>
+        <w:t xml:space="preserve"> </w:t>
+      </w:r>
+      <w:r>
+        <w:rPr>
+          <w:rStyle w:val="VerbatimChar"/>
+        </w:rPr>
+        <w:t xml:space="preserve">false</w:t>
+      </w:r>
+      <w:r>
+        <w:t xml:space="preserve">. Es el</w:t>
+      </w:r>
+      <w:r>
+        <w:t xml:space="preserve"> </w:t>
+      </w:r>
+      <w:r>
+        <w:rPr>
+          <w:i/>
+          <w:iCs/>
+        </w:rPr>
+        <w:t xml:space="preserve">code smell</w:t>
+      </w:r>
+      <w:r>
+        <w:t xml:space="preserve"> </w:t>
+      </w:r>
+      <w:r>
+        <w:t xml:space="preserve">de</w:t>
+      </w:r>
+      <w:r>
+        <w:t xml:space="preserve"> </w:t>
+      </w:r>
+      <w:r>
+        <w:rPr>
+          <w:b/>
+          <w:bCs/>
+        </w:rPr>
+        <w:t xml:space="preserve">Long Parameter List</w:t>
+      </w:r>
+      <w:r>
+        <w:t xml:space="preserve"> </w:t>
+      </w:r>
+      <w:r>
+        <w:t xml:space="preserve">que analizamos en la</w:t>
+      </w:r>
+      <w:r>
+        <w:t xml:space="preserve"> </w:t>
+      </w:r>
+      <w:r>
+        <w:t xml:space="preserve">Semana 2, y con cada sección nueva el constructor crece. La alternativa de sobrecargar</w:t>
+      </w:r>
+      <w:r>
+        <w:t xml:space="preserve"> </w:t>
+      </w:r>
+      <w:r>
+        <w:t xml:space="preserve">constructores (el</w:t>
+      </w:r>
+      <w:r>
+        <w:t xml:space="preserve"> </w:t>
+      </w:r>
+      <w:r>
+        <w:t xml:space="preserve">“constructor telescópico”</w:t>
+      </w:r>
+      <w:r>
+        <w:t xml:space="preserve">) multiplica combinaciones y no escala.</w:t>
+      </w:r>
+    </w:p>
+    <w:p>
+      <w:pPr>
+        <w:pStyle w:val="Heading2"/>
+      </w:pPr>
+      <w:r>
+        <w:t xml:space="preserve">Qué es el Builder</w:t>
+      </w:r>
+    </w:p>
+    <w:p>
+      <w:pPr>
+        <w:pStyle w:val="FirstParagraph"/>
+      </w:pPr>
+      <w:r>
+        <w:t xml:space="preserve">Es un patrón creacional. Su intención, según el GoF, es separar la construcción de un objeto</w:t>
+      </w:r>
+      <w:r>
+        <w:t xml:space="preserve"> </w:t>
+      </w:r>
+      <w:r>
+        <w:t xml:space="preserve">complejo de su representación, de modo que el mismo proceso de construcción pueda crear</w:t>
+      </w:r>
+      <w:r>
+        <w:t xml:space="preserve"> </w:t>
+      </w:r>
+      <w:r>
+        <w:t xml:space="preserve">representaciones diferentes. Tiene cuatro roles: el</w:t>
+      </w:r>
+      <w:r>
+        <w:t xml:space="preserve"> </w:t>
+      </w:r>
+      <w:r>
+        <w:rPr>
+          <w:b/>
+          <w:bCs/>
+        </w:rPr>
+        <w:t xml:space="preserve">producto</w:t>
+      </w:r>
+      <w:r>
+        <w:t xml:space="preserve">, el</w:t>
+      </w:r>
+      <w:r>
+        <w:t xml:space="preserve"> </w:t>
+      </w:r>
+      <w:r>
+        <w:rPr>
+          <w:b/>
+          <w:bCs/>
+        </w:rPr>
+        <w:t xml:space="preserve">builder</w:t>
+      </w:r>
+      <w:r>
+        <w:t xml:space="preserve"> </w:t>
+      </w:r>
+      <w:r>
+        <w:t xml:space="preserve">que declara los</w:t>
+      </w:r>
+      <w:r>
+        <w:t xml:space="preserve"> </w:t>
+      </w:r>
+      <w:r>
+        <w:t xml:space="preserve">pasos de construcción, el</w:t>
+      </w:r>
+      <w:r>
+        <w:t xml:space="preserve"> </w:t>
+      </w:r>
+      <w:r>
+        <w:rPr>
+          <w:b/>
+          <w:bCs/>
+        </w:rPr>
+        <w:t xml:space="preserve">builder concreto</w:t>
+      </w:r>
+      <w:r>
+        <w:t xml:space="preserve"> </w:t>
+      </w:r>
+      <w:r>
+        <w:t xml:space="preserve">que los implementa y guarda el estado parcial, y el</w:t>
+      </w:r>
+      <w:r>
+        <w:t xml:space="preserve"> </w:t>
+      </w:r>
+      <w:r>
+        <w:rPr>
+          <w:b/>
+          <w:bCs/>
+        </w:rPr>
+        <w:t xml:space="preserve">director</w:t>
+      </w:r>
+      <w:r>
+        <w:t xml:space="preserve">, que conoce las recetas —qué pasos y en qué orden— para los productos habituales.</w:t>
+      </w:r>
+    </w:p>
+    <w:p>
+      <w:pPr>
+        <w:pStyle w:val="Heading2"/>
+      </w:pPr>
+      <w:r>
+        <w:t xml:space="preserve">Cómo lo aplicamos</w:t>
+      </w:r>
+    </w:p>
+    <w:tbl>
+      <w:tblPr>
+        <w:tblStyle w:val="Table"/>
+        <w:tblW w:type="pct" w:w="5000"/>
+        <w:tblLayout w:type="fixed"/>
+        <w:tblLook w:firstRow="1" w:lastRow="0" w:firstColumn="0" w:lastColumn="0" w:noHBand="0" w:noVBand="0" w:val="0020"/>
+      </w:tblPr>
+      <w:tblGrid>
+        <w:gridCol w:w="3960"/>
+        <w:gridCol w:w="3960"/>
+      </w:tblGrid>
+      <w:tr>
+        <w:trPr>
+          <w:tblHeader w:val="on"/>
+        </w:trPr>
+        <w:tc>
+          <w:tcPr/>
+          <w:p>
+            <w:pPr>
+              <w:pStyle w:val="Compact"/>
+            </w:pPr>
+            <w:r>
+              <w:t xml:space="preserve">Rol en el patrón</w:t>
+            </w:r>
+          </w:p>
+        </w:tc>
+        <w:tc>
+          <w:tcPr/>
+          <w:p>
+            <w:pPr>
+              <w:pStyle w:val="Compact"/>
+            </w:pPr>
+            <w:r>
+              <w:t xml:space="preserve">Clases</w:t>
+            </w:r>
+          </w:p>
+        </w:tc>
+      </w:tr>
+      <w:tr>
+        <w:tc>
+          <w:tcPr/>
+          <w:p>
+            <w:pPr>
+              <w:pStyle w:val="Compact"/>
+            </w:pPr>
+            <w:r>
+              <w:t xml:space="preserve">Producto</w:t>
+            </w:r>
+          </w:p>
+        </w:tc>
+        <w:tc>
+          <w:tcPr/>
+          <w:p>
+            <w:pPr>
+              <w:pStyle w:val="Compact"/>
+            </w:pPr>
+            <w:r>
+              <w:rPr>
+                <w:rStyle w:val="VerbatimChar"/>
+              </w:rPr>
+              <w:t xml:space="preserve">ReporteFinca.java</w:t>
+            </w:r>
+            <w:r>
+              <w:t xml:space="preserve"> </w:t>
+            </w:r>
+            <w:r>
+              <w:t xml:space="preserve">— inmutable, con secciones opcionales</w:t>
+            </w:r>
+          </w:p>
+        </w:tc>
+      </w:tr>
+      <w:tr>
+        <w:tc>
+          <w:tcPr/>
+          <w:p>
+            <w:pPr>
+              <w:pStyle w:val="Compact"/>
+            </w:pPr>
+            <w:r>
+              <w:t xml:space="preserve">Builder</w:t>
+            </w:r>
+          </w:p>
+        </w:tc>
+        <w:tc>
+          <w:tcPr/>
+          <w:p>
+            <w:pPr>
+              <w:pStyle w:val="Compact"/>
+            </w:pPr>
+            <w:r>
+              <w:rPr>
+                <w:rStyle w:val="VerbatimChar"/>
+              </w:rPr>
+              <w:t xml:space="preserve">ReporteBuilder.java</w:t>
+            </w:r>
+            <w:r>
+              <w:t xml:space="preserve"> </w:t>
+            </w:r>
+            <w:r>
+              <w:t xml:space="preserve">— interfaz con un método por sección y</w:t>
+            </w:r>
+            <w:r>
+              <w:t xml:space="preserve"> </w:t>
+            </w:r>
+            <w:r>
+              <w:rPr>
+                <w:rStyle w:val="VerbatimChar"/>
+              </w:rPr>
+              <w:t xml:space="preserve">construir()</w:t>
+            </w:r>
+          </w:p>
+        </w:tc>
+      </w:tr>
+      <w:tr>
+        <w:tc>
+          <w:tcPr/>
+          <w:p>
+            <w:pPr>
+              <w:pStyle w:val="Compact"/>
+            </w:pPr>
+            <w:r>
+              <w:t xml:space="preserve">Builder concreto</w:t>
+            </w:r>
+          </w:p>
+        </w:tc>
+        <w:tc>
+          <w:tcPr/>
+          <w:p>
+            <w:pPr>
+              <w:pStyle w:val="Compact"/>
+            </w:pPr>
+            <w:r>
+              <w:rPr>
+                <w:rStyle w:val="VerbatimChar"/>
+              </w:rPr>
+              <w:t xml:space="preserve">ReporteConsolaBuilder.java</w:t>
+            </w:r>
+            <w:r>
+              <w:t xml:space="preserve"> </w:t>
+            </w:r>
+            <w:r>
+              <w:t xml:space="preserve">— acumula las partes, valida y crea el producto</w:t>
+            </w:r>
+          </w:p>
+        </w:tc>
+      </w:tr>
+      <w:tr>
+        <w:tc>
+          <w:tcPr/>
+          <w:p>
+            <w:pPr>
+              <w:pStyle w:val="Compact"/>
+            </w:pPr>
+            <w:r>
+              <w:t xml:space="preserve">Director</w:t>
+            </w:r>
+          </w:p>
+        </w:tc>
+        <w:tc>
+          <w:tcPr/>
+          <w:p>
+            <w:pPr>
+              <w:pStyle w:val="Compact"/>
+            </w:pPr>
+            <w:r>
+              <w:rPr>
+                <w:rStyle w:val="VerbatimChar"/>
+              </w:rPr>
+              <w:t xml:space="preserve">DirectorReportes.java</w:t>
+            </w:r>
+            <w:r>
+              <w:t xml:space="preserve"> </w:t>
+            </w:r>
+            <w:r>
+              <w:t xml:space="preserve">— recetas</w:t>
+            </w:r>
+            <w:r>
+              <w:t xml:space="preserve"> </w:t>
+            </w:r>
+            <w:r>
+              <w:rPr>
+                <w:rStyle w:val="VerbatimChar"/>
+              </w:rPr>
+              <w:t xml:space="preserve">reporteOperario()</w:t>
+            </w:r>
+            <w:r>
+              <w:t xml:space="preserve"> </w:t>
+            </w:r>
+            <w:r>
+              <w:t xml:space="preserve">y</w:t>
+            </w:r>
+            <w:r>
+              <w:t xml:space="preserve"> </w:t>
+            </w:r>
+            <w:r>
+              <w:rPr>
+                <w:rStyle w:val="VerbatimChar"/>
+              </w:rPr>
+              <w:t xml:space="preserve">reporteGerencial()</w:t>
+            </w:r>
+          </w:p>
+        </w:tc>
+      </w:tr>
+      <w:tr>
+        <w:tc>
+          <w:tcPr/>
+          <w:p>
+            <w:pPr>
+              <w:pStyle w:val="Compact"/>
+            </w:pPr>
+            <w:r>
+              <w:t xml:space="preserve">Demo</w:t>
+            </w:r>
+          </w:p>
+        </w:tc>
+        <w:tc>
+          <w:tcPr/>
+          <w:p>
+            <w:pPr>
+              <w:pStyle w:val="Compact"/>
+            </w:pPr>
+            <w:r>
+              <w:rPr>
+                <w:rStyle w:val="VerbatimChar"/>
+              </w:rPr>
+              <w:t xml:space="preserve">MainDemoBuilder.java</w:t>
+            </w:r>
+          </w:p>
+        </w:tc>
+      </w:tr>
+    </w:tbl>
+    <w:p>
+      <w:pPr>
+        <w:pStyle w:val="BodyText"/>
+      </w:pPr>
+      <w:r>
+        <w:t xml:space="preserve">Tres decisiones de diseño sostienen la implementación:</w:t>
+      </w:r>
+    </w:p>
+    <w:p>
+      <w:pPr>
+        <w:pStyle w:val="Compact"/>
+        <w:numPr>
+          <w:ilvl w:val="0"/>
+          <w:numId w:val="1002"/>
+        </w:numPr>
+      </w:pPr>
+      <w:r>
+        <w:rPr>
+          <w:b/>
+          <w:bCs/>
+        </w:rPr>
+        <w:t xml:space="preserve">El producto solo se puede crear desde el builder.</w:t>
+      </w:r>
+      <w:r>
+        <w:t xml:space="preserve"> </w:t>
+      </w:r>
+      <w:r>
+        <w:t xml:space="preserve">El constructor de</w:t>
+      </w:r>
+      <w:r>
+        <w:t xml:space="preserve"> </w:t>
+      </w:r>
+      <w:r>
+        <w:rPr>
+          <w:rStyle w:val="VerbatimChar"/>
+        </w:rPr>
+        <w:t xml:space="preserve">ReporteFinca</w:t>
+      </w:r>
+      <w:r>
+        <w:t xml:space="preserve"> </w:t>
+      </w:r>
+      <w:r>
+        <w:t xml:space="preserve">no es</w:t>
+      </w:r>
+      <w:r>
+        <w:t xml:space="preserve"> </w:t>
+      </w:r>
+      <w:r>
+        <w:rPr>
+          <w:rStyle w:val="VerbatimChar"/>
+        </w:rPr>
+        <w:t xml:space="preserve">public</w:t>
+      </w:r>
+      <w:r>
+        <w:t xml:space="preserve"> </w:t>
+      </w:r>
+      <w:r>
+        <w:t xml:space="preserve">y sus campos son</w:t>
+      </w:r>
+      <w:r>
+        <w:t xml:space="preserve"> </w:t>
+      </w:r>
+      <w:r>
+        <w:rPr>
+          <w:rStyle w:val="VerbatimChar"/>
+        </w:rPr>
+        <w:t xml:space="preserve">final</w:t>
+      </w:r>
+      <w:r>
+        <w:t xml:space="preserve">. Un reporte nunca queda a medio armar: existe cuando está</w:t>
+      </w:r>
+      <w:r>
+        <w:t xml:space="preserve"> </w:t>
+      </w:r>
+      <w:r>
+        <w:t xml:space="preserve">completo y después no cambia.</w:t>
+      </w:r>
+    </w:p>
+    <w:p>
+      <w:pPr>
+        <w:pStyle w:val="Compact"/>
+        <w:numPr>
+          <w:ilvl w:val="0"/>
+          <w:numId w:val="1002"/>
+        </w:numPr>
+      </w:pPr>
+      <w:r>
+        <w:rPr>
+          <w:b/>
+          <w:bCs/>
+        </w:rPr>
+        <w:t xml:space="preserve">Cada método del builder devuelve</w:t>
+      </w:r>
+      <w:r>
+        <w:rPr>
+          <w:b/>
+          <w:bCs/>
+        </w:rPr>
+        <w:t xml:space="preserve"> </w:t>
+      </w:r>
+      <w:r>
+        <w:rPr>
+          <w:rStyle w:val="VerbatimChar"/>
+          <w:b/>
+          <w:bCs/>
+        </w:rPr>
+        <w:t xml:space="preserve">this</w:t>
+      </w:r>
+      <w:r>
+        <w:rPr>
+          <w:b/>
+          <w:bCs/>
+        </w:rPr>
+        <w:t xml:space="preserve">.</w:t>
+      </w:r>
+      <w:r>
+        <w:t xml:space="preserve"> </w:t>
+      </w:r>
+      <w:r>
+        <w:t xml:space="preserve">Así el cliente encadena solo las partes que quiere,</w:t>
+      </w:r>
+      <w:r>
+        <w:t xml:space="preserve"> </w:t>
+      </w:r>
+      <w:r>
+        <w:t xml:space="preserve">en el orden que quiera:</w:t>
+      </w:r>
+      <w:r>
+        <w:t xml:space="preserve"> </w:t>
+      </w:r>
+      <w:r>
+        <w:rPr>
+          <w:rStyle w:val="VerbatimChar"/>
+        </w:rPr>
+        <w:t xml:space="preserve">conTitulo(...).conLecturas(...).construir()</w:t>
+      </w:r>
+      <w:r>
+        <w:t xml:space="preserve">. Lo que no se pide, no</w:t>
+      </w:r>
+      <w:r>
+        <w:t xml:space="preserve"> </w:t>
+      </w:r>
+      <w:r>
+        <w:t xml:space="preserve">aparece.</w:t>
+      </w:r>
+    </w:p>
+    <w:p>
+      <w:pPr>
+        <w:pStyle w:val="Compact"/>
+        <w:numPr>
+          <w:ilvl w:val="0"/>
+          <w:numId w:val="1002"/>
+        </w:numPr>
+      </w:pPr>
+      <w:r>
+        <w:rPr>
+          <w:rStyle w:val="VerbatimChar"/>
+          <w:b/>
+          <w:bCs/>
+        </w:rPr>
+        <w:t xml:space="preserve">construir()</w:t>
+      </w:r>
+      <w:r>
+        <w:rPr>
+          <w:b/>
+          <w:bCs/>
+        </w:rPr>
+        <w:t xml:space="preserve"> </w:t>
+      </w:r>
+      <w:r>
+        <w:rPr>
+          <w:b/>
+          <w:bCs/>
+        </w:rPr>
+        <w:t xml:space="preserve">valida y reinicia.</w:t>
+      </w:r>
+      <w:r>
+        <w:t xml:space="preserve"> </w:t>
+      </w:r>
+      <w:r>
+        <w:t xml:space="preserve">Exige el título (lo único obligatorio) y, tras entregar el</w:t>
+      </w:r>
+      <w:r>
+        <w:t xml:space="preserve"> </w:t>
+      </w:r>
+      <w:r>
+        <w:t xml:space="preserve">producto, deja el builder limpio. Un mismo builder arma varios reportes sin que uno herede las</w:t>
+      </w:r>
+      <w:r>
+        <w:t xml:space="preserve"> </w:t>
+      </w:r>
+      <w:r>
+        <w:t xml:space="preserve">partes del anterior.</w:t>
+      </w:r>
+    </w:p>
+    <w:p>
+      <w:pPr>
+        <w:pStyle w:val="FirstParagraph"/>
+      </w:pPr>
+      <w:r>
+        <w:t xml:space="preserve">El</w:t>
+      </w:r>
+      <w:r>
+        <w:t xml:space="preserve"> </w:t>
+      </w:r>
+      <w:r>
+        <w:rPr>
+          <w:rStyle w:val="VerbatimChar"/>
+        </w:rPr>
+        <w:t xml:space="preserve">DirectorReportes</w:t>
+      </w:r>
+      <w:r>
+        <w:t xml:space="preserve"> </w:t>
+      </w:r>
+      <w:r>
+        <w:t xml:space="preserve">conecta esta semana con las dos anteriores: toma el nombre de la finca de</w:t>
+      </w:r>
+      <w:r>
+        <w:t xml:space="preserve"> </w:t>
+      </w:r>
+      <w:r>
+        <w:rPr>
+          <w:rStyle w:val="VerbatimChar"/>
+        </w:rPr>
+        <w:t xml:space="preserve">ConfiguracionSistema</w:t>
+      </w:r>
+      <w:r>
+        <w:t xml:space="preserve"> </w:t>
+      </w:r>
+      <w:r>
+        <w:t xml:space="preserve">y el responsable de</w:t>
+      </w:r>
+      <w:r>
+        <w:t xml:space="preserve"> </w:t>
+      </w:r>
+      <w:r>
+        <w:rPr>
+          <w:rStyle w:val="VerbatimChar"/>
+        </w:rPr>
+        <w:t xml:space="preserve">SesionUsuario</w:t>
+      </w:r>
+      <w:r>
+        <w:t xml:space="preserve"> </w:t>
+      </w:r>
+      <w:r>
+        <w:t xml:space="preserve">(Semana 3), recibe las lecturas que</w:t>
+      </w:r>
+      <w:r>
+        <w:t xml:space="preserve"> </w:t>
+      </w:r>
+      <w:r>
+        <w:t xml:space="preserve">producen las fábricas de sensores (Semana 4) y deriva las alertas comparándolas con los umbrales</w:t>
+      </w:r>
+      <w:r>
+        <w:t xml:space="preserve"> </w:t>
+      </w:r>
+      <w:r>
+        <w:t xml:space="preserve">globales. El director solo habla con la interfaz</w:t>
+      </w:r>
+      <w:r>
+        <w:t xml:space="preserve"> </w:t>
+      </w:r>
+      <w:r>
+        <w:rPr>
+          <w:rStyle w:val="VerbatimChar"/>
+        </w:rPr>
+        <w:t xml:space="preserve">ReporteBuilder</w:t>
+      </w:r>
+      <w:r>
+        <w:t xml:space="preserve">: si mañana existiera un</w:t>
+      </w:r>
+      <w:r>
+        <w:t xml:space="preserve"> </w:t>
+      </w:r>
+      <w:r>
+        <w:rPr>
+          <w:rStyle w:val="VerbatimChar"/>
+        </w:rPr>
+        <w:t xml:space="preserve">ReporteArchivoBuilder</w:t>
+      </w:r>
+      <w:r>
+        <w:t xml:space="preserve"> </w:t>
+      </w:r>
+      <w:r>
+        <w:t xml:space="preserve">que escriba el reporte a un</w:t>
+      </w:r>
+      <w:r>
+        <w:t xml:space="preserve"> </w:t>
+      </w:r>
+      <w:r>
+        <w:rPr>
+          <w:rStyle w:val="VerbatimChar"/>
+        </w:rPr>
+        <w:t xml:space="preserve">.txt</w:t>
+      </w:r>
+      <w:r>
+        <w:t xml:space="preserve">, las recetas no cambiarían.</w:t>
+      </w:r>
+    </w:p>
+    <w:p>
+      <w:r>
+        <w:pict>
+          <v:rect style="width:0;height:1.5pt" o:hralign="center" o:hrstd="t" o:hr="t"/>
+        </w:pict>
+      </w:r>
+    </w:p>
+    <w:p>
+      <w:pPr>
+        <w:pStyle w:val="Heading2"/>
+      </w:pPr>
+      <w:r>
+        <w:t xml:space="preserve">Evidencias</w:t>
+      </w:r>
+    </w:p>
+    <w:p>
+      <w:pPr>
+        <w:pStyle w:val="FirstParagraph"/>
+      </w:pPr>
+      <w:r>
+        <w:t xml:space="preserve">Estas son las pruebas que ejecutamos sobre el prototipo para comprobar que el patrón Builder</w:t>
+      </w:r>
+      <w:r>
+        <w:t xml:space="preserve"> </w:t>
+      </w:r>
+      <w:r>
+        <w:t xml:space="preserve">funciona como esperábamos en el módulo de reportes. Las tres primeras capturas corresponden al</w:t>
+      </w:r>
+      <w:r>
+        <w:t xml:space="preserve"> </w:t>
+      </w:r>
+      <w:r>
+        <w:t xml:space="preserve">código y las tres últimas a las ejecuciones. La numeración continúa la de las semanas anteriores.</w:t>
+      </w:r>
+    </w:p>
+    <w:p>
+      <w:pPr>
+        <w:pStyle w:val="BodyText"/>
+      </w:pPr>
+      <w:r>
+        <w:t xml:space="preserve">Todo se ejecutó en VS Code sobre Java 17, con el botón</w:t>
+      </w:r>
+      <w:r>
+        <w:t xml:space="preserve"> </w:t>
+      </w:r>
+      <w:r>
+        <w:rPr>
+          <w:i/>
+          <w:iCs/>
+        </w:rPr>
+        <w:t xml:space="preserve">Run</w:t>
+      </w:r>
+      <w:r>
+        <w:t xml:space="preserve"> </w:t>
+      </w:r>
+      <w:r>
+        <w:t xml:space="preserve">de la extensión de Java.</w:t>
+      </w:r>
+    </w:p>
+    <w:tbl>
+      <w:tblPr>
+        <w:tblStyle w:val="Table"/>
+        <w:tblW w:type="pct" w:w="5000"/>
+        <w:tblLayout w:type="fixed"/>
+        <w:tblLook w:firstRow="1" w:lastRow="0" w:firstColumn="0" w:lastColumn="0" w:noHBand="0" w:noVBand="0" w:val="0020"/>
+      </w:tblPr>
+      <w:tblGrid>
+        <w:gridCol w:w="3960"/>
+        <w:gridCol w:w="3960"/>
+      </w:tblGrid>
+      <w:tr>
+        <w:trPr>
+          <w:tblHeader w:val="on"/>
+        </w:trPr>
+        <w:tc>
+          <w:tcPr/>
+          <w:p>
+            <w:pPr>
+              <w:pStyle w:val="Compact"/>
+            </w:pPr>
+            <w:r>
+              <w:t xml:space="preserve">Captura</w:t>
+            </w:r>
+          </w:p>
+        </w:tc>
+        <w:tc>
+          <w:tcPr/>
+          <w:p>
+            <w:pPr>
+              <w:pStyle w:val="Compact"/>
+            </w:pPr>
+            <w:r>
+              <w:t xml:space="preserve">Qué muestra</w:t>
+            </w:r>
+          </w:p>
+        </w:tc>
+      </w:tr>
+      <w:tr>
+        <w:tc>
+          <w:tcPr/>
+          <w:p>
+            <w:pPr>
+              <w:pStyle w:val="Compact"/>
+            </w:pPr>
+            <w:r>
+              <w:t xml:space="preserve">13</w:t>
+            </w:r>
+          </w:p>
+        </w:tc>
+        <w:tc>
+          <w:tcPr/>
+          <w:p>
+            <w:pPr>
+              <w:pStyle w:val="Compact"/>
+            </w:pPr>
+            <w:r>
+              <w:t xml:space="preserve">La interfaz</w:t>
+            </w:r>
+            <w:r>
+              <w:t xml:space="preserve"> </w:t>
+            </w:r>
+            <w:r>
+              <w:rPr>
+                <w:rStyle w:val="VerbatimChar"/>
+              </w:rPr>
+              <w:t xml:space="preserve">ReporteBuilder</w:t>
+            </w:r>
+            <w:r>
+              <w:t xml:space="preserve"> </w:t>
+            </w:r>
+            <w:r>
+              <w:t xml:space="preserve">con los pasos de construcción</w:t>
+            </w:r>
+          </w:p>
+        </w:tc>
+      </w:tr>
+      <w:tr>
+        <w:tc>
+          <w:tcPr/>
+          <w:p>
+            <w:pPr>
+              <w:pStyle w:val="Compact"/>
+            </w:pPr>
+            <w:r>
+              <w:t xml:space="preserve">14</w:t>
+            </w:r>
+          </w:p>
+        </w:tc>
+        <w:tc>
+          <w:tcPr/>
+          <w:p>
+            <w:pPr>
+              <w:pStyle w:val="Compact"/>
+            </w:pPr>
+            <w:r>
+              <w:rPr>
+                <w:rStyle w:val="VerbatimChar"/>
+              </w:rPr>
+              <w:t xml:space="preserve">construir()</w:t>
+            </w:r>
+            <w:r>
+              <w:t xml:space="preserve"> </w:t>
+            </w:r>
+            <w:r>
+              <w:t xml:space="preserve">en el builder concreto: validación, creación y reinicio</w:t>
+            </w:r>
+          </w:p>
+        </w:tc>
+      </w:tr>
+      <w:tr>
+        <w:tc>
+          <w:tcPr/>
+          <w:p>
+            <w:pPr>
+              <w:pStyle w:val="Compact"/>
+            </w:pPr>
+            <w:r>
+              <w:t xml:space="preserve">15</w:t>
+            </w:r>
+          </w:p>
+        </w:tc>
+        <w:tc>
+          <w:tcPr/>
+          <w:p>
+            <w:pPr>
+              <w:pStyle w:val="Compact"/>
+            </w:pPr>
+            <w:r>
+              <w:t xml:space="preserve">Las dos recetas del</w:t>
+            </w:r>
+            <w:r>
+              <w:t xml:space="preserve"> </w:t>
+            </w:r>
+            <w:r>
+              <w:rPr>
+                <w:rStyle w:val="VerbatimChar"/>
+              </w:rPr>
+              <w:t xml:space="preserve">DirectorReportes</w:t>
+            </w:r>
+          </w:p>
+        </w:tc>
+      </w:tr>
+      <w:tr>
+        <w:tc>
+          <w:tcPr/>
+          <w:p>
+            <w:pPr>
+              <w:pStyle w:val="Compact"/>
+            </w:pPr>
+            <w:r>
+              <w:t xml:space="preserve">16</w:t>
+            </w:r>
+          </w:p>
+        </w:tc>
+        <w:tc>
+          <w:tcPr/>
+          <w:p>
+            <w:pPr>
+              <w:pStyle w:val="Compact"/>
+            </w:pPr>
+            <w:r>
+              <w:t xml:space="preserve">Pruebas 1 y 2: reporte mínimo y reporte armado paso a paso</w:t>
+            </w:r>
+          </w:p>
+        </w:tc>
+      </w:tr>
+      <w:tr>
+        <w:tc>
+          <w:tcPr/>
+          <w:p>
+            <w:pPr>
+              <w:pStyle w:val="Compact"/>
+            </w:pPr>
+            <w:r>
+              <w:t xml:space="preserve">17</w:t>
+            </w:r>
+          </w:p>
+        </w:tc>
+        <w:tc>
+          <w:tcPr/>
+          <w:p>
+            <w:pPr>
+              <w:pStyle w:val="Compact"/>
+            </w:pPr>
+            <w:r>
+              <w:t xml:space="preserve">Prueba 3: reporte de turno y reporte gerencial desde el director</w:t>
+            </w:r>
+          </w:p>
+        </w:tc>
+      </w:tr>
+      <w:tr>
+        <w:tc>
+          <w:tcPr/>
+          <w:p>
+            <w:pPr>
+              <w:pStyle w:val="Compact"/>
+            </w:pPr>
+            <w:r>
+              <w:t xml:space="preserve">18</w:t>
+            </w:r>
+          </w:p>
+        </w:tc>
+        <w:tc>
+          <w:tcPr/>
+          <w:p>
+            <w:pPr>
+              <w:pStyle w:val="Compact"/>
+            </w:pPr>
+            <w:r>
+              <w:t xml:space="preserve">Pruebas 4 a 6: alertas por configuración, reutilización y validación</w:t>
+            </w:r>
+          </w:p>
+        </w:tc>
+      </w:tr>
+    </w:tbl>
+    <w:p>
+      <w:r>
+        <w:pict>
+          <v:rect style="width:0;height:1.5pt" o:hralign="center" o:hrstd="t" o:hr="t"/>
+        </w:pict>
+      </w:r>
+    </w:p>
+    <w:p>
+      <w:pPr>
+        <w:pStyle w:val="Heading3"/>
+      </w:pPr>
+      <w:r>
+        <w:t xml:space="preserve">Captura 13 — La interfaz</w:t>
+      </w:r>
+      <w:r>
+        <w:t xml:space="preserve"> </w:t>
+      </w:r>
+      <w:r>
+        <w:rPr>
+          <w:rStyle w:val="VerbatimChar"/>
+        </w:rPr>
+        <w:t xml:space="preserve">ReporteBuilder</w:t>
+      </w:r>
+    </w:p>
+    <w:p>
+      <w:pPr>
+        <w:pStyle w:val="CaptionedFigure"/>
+      </w:pPr>
+      <w:r>
+        <w:drawing>
+          <wp:inline>
+            <wp:extent cx="5334000" cy="1658790"/>
+            <wp:effectExtent b="0" l="0" r="0" t="0"/>
+            <wp:docPr descr="Captura 13" title="" id="46" name="Picture"/>
+            <a:graphic>
+              <a:graphicData uri="http://schemas.openxmlformats.org/drawingml/2006/picture">
+                <pic:pic>
+                  <pic:nvPicPr>
+                    <pic:cNvPr descr="semana-5-builder/evidencias/captura_13.png" id="47" name="Picture"/>
+                    <pic:cNvPicPr>
+                      <a:picLocks noChangeArrowheads="1" noChangeAspect="1"/>
+                    </pic:cNvPicPr>
+                  </pic:nvPicPr>
+                  <pic:blipFill>
+                    <a:blip r:embed="rId45"/>
+                    <a:stretch>
+                      <a:fillRect/>
+                    </a:stretch>
+                  </pic:blipFill>
+                  <pic:spPr bwMode="auto">
+                    <a:xfrm>
+                      <a:off x="0" y="0"/>
+                      <a:ext cx="5334000" cy="1658790"/>
+                    </a:xfrm>
+                    <a:prstGeom prst="rect">
+                      <a:avLst/>
+                    </a:prstGeom>
+                    <a:noFill/>
+                    <a:ln w="9525">
+                      <a:noFill/>
+                      <a:headEnd/>
+                      <a:tailEnd/>
+                    </a:ln>
+                  </pic:spPr>
+                </pic:pic>
+              </a:graphicData>
+            </a:graphic>
+          </wp:inline>
+        </w:drawing>
+      </w:r>
+    </w:p>
+    <w:p>
+      <w:pPr>
+        <w:pStyle w:val="ImageCaption"/>
+      </w:pPr>
+      <w:r>
+        <w:t xml:space="preserve">Captura 13</w:t>
+      </w:r>
+    </w:p>
+    <w:p>
+      <w:pPr>
+        <w:pStyle w:val="BodyText"/>
+      </w:pPr>
+      <w:r>
+        <w:rPr>
+          <w:b/>
+          <w:bCs/>
+        </w:rPr>
+        <w:t xml:space="preserve">Archivo:</w:t>
+      </w:r>
+      <w:r>
+        <w:t xml:space="preserve"> </w:t>
+      </w:r>
+      <w:r>
+        <w:rPr>
+          <w:rStyle w:val="VerbatimChar"/>
+        </w:rPr>
+        <w:t xml:space="preserve">src/ReporteBuilder.java</w:t>
+      </w:r>
+      <w:r>
+        <w:t xml:space="preserve"> </w:t>
+      </w:r>
+      <w:r>
+        <w:t xml:space="preserve">·</w:t>
+      </w:r>
+      <w:r>
+        <w:t xml:space="preserve"> </w:t>
+      </w:r>
+      <w:r>
+        <w:rPr>
+          <w:b/>
+          <w:bCs/>
+        </w:rPr>
+        <w:t xml:space="preserve">Líneas:</w:t>
+      </w:r>
+      <w:r>
+        <w:t xml:space="preserve"> </w:t>
+      </w:r>
+      <w:r>
+        <w:t xml:space="preserve">15 a 26</w:t>
+      </w:r>
+    </w:p>
+    <w:p>
+      <w:pPr>
+        <w:pStyle w:val="BodyText"/>
+      </w:pPr>
+      <w:r>
+        <w:t xml:space="preserve">Un método por sección del reporte y</w:t>
+      </w:r>
+      <w:r>
+        <w:t xml:space="preserve"> </w:t>
+      </w:r>
+      <w:r>
+        <w:rPr>
+          <w:rStyle w:val="VerbatimChar"/>
+        </w:rPr>
+        <w:t xml:space="preserve">construir()</w:t>
+      </w:r>
+      <w:r>
+        <w:t xml:space="preserve"> </w:t>
+      </w:r>
+      <w:r>
+        <w:t xml:space="preserve">al final. Todos devuelven</w:t>
+      </w:r>
+      <w:r>
+        <w:t xml:space="preserve"> </w:t>
+      </w:r>
+      <w:r>
+        <w:rPr>
+          <w:rStyle w:val="VerbatimChar"/>
+        </w:rPr>
+        <w:t xml:space="preserve">ReporteBuilder</w:t>
+      </w:r>
+      <w:r>
+        <w:t xml:space="preserve">, que</w:t>
+      </w:r>
+      <w:r>
+        <w:t xml:space="preserve"> </w:t>
+      </w:r>
+      <w:r>
+        <w:t xml:space="preserve">es lo que permite encadenar las llamadas. Que sea una interfaz —y no directamente la clase</w:t>
+      </w:r>
+      <w:r>
+        <w:t xml:space="preserve"> </w:t>
+      </w:r>
+      <w:r>
+        <w:t xml:space="preserve">concreta— es lo que deja al director y al cliente independientes de cómo se representa el reporte.</w:t>
+      </w:r>
+    </w:p>
+    <w:p>
+      <w:pPr>
+        <w:pStyle w:val="Heading3"/>
+      </w:pPr>
+      <w:r>
+        <w:t xml:space="preserve">Captura 14 —</w:t>
+      </w:r>
+      <w:r>
+        <w:t xml:space="preserve"> </w:t>
+      </w:r>
+      <w:r>
+        <w:rPr>
+          <w:rStyle w:val="VerbatimChar"/>
+        </w:rPr>
+        <w:t xml:space="preserve">construir()</w:t>
+      </w:r>
+      <w:r>
+        <w:t xml:space="preserve"> </w:t>
+      </w:r>
+      <w:r>
+        <w:t xml:space="preserve">en el builder concreto</w:t>
+      </w:r>
+    </w:p>
+    <w:p>
+      <w:pPr>
+        <w:pStyle w:val="CaptionedFigure"/>
+      </w:pPr>
+      <w:r>
+        <w:drawing>
+          <wp:inline>
+            <wp:extent cx="5334000" cy="2183847"/>
+            <wp:effectExtent b="0" l="0" r="0" t="0"/>
+            <wp:docPr descr="Captura 14" title="" id="49" name="Picture"/>
+            <a:graphic>
+              <a:graphicData uri="http://schemas.openxmlformats.org/drawingml/2006/picture">
+                <pic:pic>
+                  <pic:nvPicPr>
+                    <pic:cNvPr descr="semana-5-builder/evidencias/captura_14.png" id="50" name="Picture"/>
+                    <pic:cNvPicPr>
+                      <a:picLocks noChangeArrowheads="1" noChangeAspect="1"/>
+                    </pic:cNvPicPr>
+                  </pic:nvPicPr>
+                  <pic:blipFill>
+                    <a:blip r:embed="rId48"/>
+                    <a:stretch>
+                      <a:fillRect/>
+                    </a:stretch>
+                  </pic:blipFill>
+                  <pic:spPr bwMode="auto">
+                    <a:xfrm>
+                      <a:off x="0" y="0"/>
+                      <a:ext cx="5334000" cy="2183847"/>
+                    </a:xfrm>
+                    <a:prstGeom prst="rect">
+                      <a:avLst/>
+                    </a:prstGeom>
+                    <a:noFill/>
+                    <a:ln w="9525">
+                      <a:noFill/>
+                      <a:headEnd/>
+                      <a:tailEnd/>
+                    </a:ln>
+                  </pic:spPr>
+                </pic:pic>
+              </a:graphicData>
+            </a:graphic>
+          </wp:inline>
+        </w:drawing>
+      </w:r>
+    </w:p>
+    <w:p>
+      <w:pPr>
+        <w:pStyle w:val="ImageCaption"/>
+      </w:pPr>
+      <w:r>
+        <w:t xml:space="preserve">Captura 14</w:t>
+      </w:r>
+    </w:p>
+    <w:p>
+      <w:pPr>
+        <w:pStyle w:val="BodyText"/>
+      </w:pPr>
+      <w:r>
+        <w:rPr>
+          <w:b/>
+          <w:bCs/>
+        </w:rPr>
+        <w:t xml:space="preserve">Archivo:</w:t>
+      </w:r>
+      <w:r>
+        <w:t xml:space="preserve"> </w:t>
+      </w:r>
+      <w:r>
+        <w:rPr>
+          <w:rStyle w:val="VerbatimChar"/>
+        </w:rPr>
+        <w:t xml:space="preserve">src/ReporteConsolaBuilder.java</w:t>
+      </w:r>
+      <w:r>
+        <w:t xml:space="preserve"> </w:t>
+      </w:r>
+      <w:r>
+        <w:t xml:space="preserve">·</w:t>
+      </w:r>
+      <w:r>
+        <w:t xml:space="preserve"> </w:t>
+      </w:r>
+      <w:r>
+        <w:rPr>
+          <w:b/>
+          <w:bCs/>
+        </w:rPr>
+        <w:t xml:space="preserve">Líneas:</w:t>
+      </w:r>
+      <w:r>
+        <w:t xml:space="preserve"> </w:t>
+      </w:r>
+      <w:r>
+        <w:t xml:space="preserve">59 a 77</w:t>
+      </w:r>
+    </w:p>
+    <w:p>
+      <w:pPr>
+        <w:pStyle w:val="BodyText"/>
+      </w:pPr>
+      <w:r>
+        <w:t xml:space="preserve">Tres cosas ocurren aquí: se valida que haya título (línea 61), se crea el producto de una sola vez</w:t>
+      </w:r>
+      <w:r>
+        <w:t xml:space="preserve"> </w:t>
+      </w:r>
+      <w:r>
+        <w:t xml:space="preserve">con todas sus partes (línea 64) y se llama a</w:t>
+      </w:r>
+      <w:r>
+        <w:t xml:space="preserve"> </w:t>
+      </w:r>
+      <w:r>
+        <w:rPr>
+          <w:rStyle w:val="VerbatimChar"/>
+        </w:rPr>
+        <w:t xml:space="preserve">reiniciar()</w:t>
+      </w:r>
+      <w:r>
+        <w:t xml:space="preserve"> </w:t>
+      </w:r>
+      <w:r>
+        <w:t xml:space="preserve">(línea 66) para que el builder quede</w:t>
+      </w:r>
+      <w:r>
+        <w:t xml:space="preserve"> </w:t>
+      </w:r>
+      <w:r>
+        <w:t xml:space="preserve">listo para el siguiente reporte. Es la única línea del proyecto que hace</w:t>
+      </w:r>
+      <w:r>
+        <w:t xml:space="preserve"> </w:t>
+      </w:r>
+      <w:r>
+        <w:rPr>
+          <w:rStyle w:val="VerbatimChar"/>
+        </w:rPr>
+        <w:t xml:space="preserve">new ReporteFinca(...)</w:t>
+      </w:r>
+      <w:r>
+        <w:t xml:space="preserve">.</w:t>
+      </w:r>
+    </w:p>
+    <w:p>
+      <w:pPr>
+        <w:pStyle w:val="Heading3"/>
+      </w:pPr>
+      <w:r>
+        <w:t xml:space="preserve">Captura 15 — Las recetas del director</w:t>
+      </w:r>
+    </w:p>
+    <w:p>
+      <w:pPr>
+        <w:pStyle w:val="CaptionedFigure"/>
+      </w:pPr>
+      <w:r>
+        <w:drawing>
+          <wp:inline>
+            <wp:extent cx="5334000" cy="3138094"/>
+            <wp:effectExtent b="0" l="0" r="0" t="0"/>
+            <wp:docPr descr="Captura 15" title="" id="52" name="Picture"/>
+            <a:graphic>
+              <a:graphicData uri="http://schemas.openxmlformats.org/drawingml/2006/picture">
+                <pic:pic>
+                  <pic:nvPicPr>
+                    <pic:cNvPr descr="semana-5-builder/evidencias/captura_15.png" id="53" name="Picture"/>
+                    <pic:cNvPicPr>
+                      <a:picLocks noChangeArrowheads="1" noChangeAspect="1"/>
+                    </pic:cNvPicPr>
+                  </pic:nvPicPr>
+                  <pic:blipFill>
+                    <a:blip r:embed="rId51"/>
+                    <a:stretch>
+                      <a:fillRect/>
+                    </a:stretch>
+                  </pic:blipFill>
+                  <pic:spPr bwMode="auto">
+                    <a:xfrm>
+                      <a:off x="0" y="0"/>
+                      <a:ext cx="5334000" cy="3138094"/>
+                    </a:xfrm>
+                    <a:prstGeom prst="rect">
+                      <a:avLst/>
+                    </a:prstGeom>
+                    <a:noFill/>
+                    <a:ln w="9525">
+                      <a:noFill/>
+                      <a:headEnd/>
+                      <a:tailEnd/>
+                    </a:ln>
+                  </pic:spPr>
+                </pic:pic>
+              </a:graphicData>
+            </a:graphic>
+          </wp:inline>
+        </w:drawing>
+      </w:r>
+    </w:p>
+    <w:p>
+      <w:pPr>
+        <w:pStyle w:val="ImageCaption"/>
+      </w:pPr>
+      <w:r>
+        <w:t xml:space="preserve">Captura 15</w:t>
+      </w:r>
+    </w:p>
+    <w:p>
+      <w:pPr>
+        <w:pStyle w:val="BodyText"/>
+      </w:pPr>
+      <w:r>
+        <w:rPr>
+          <w:b/>
+          <w:bCs/>
+        </w:rPr>
+        <w:t xml:space="preserve">Archivo:</w:t>
+      </w:r>
+      <w:r>
+        <w:t xml:space="preserve"> </w:t>
+      </w:r>
+      <w:r>
+        <w:rPr>
+          <w:rStyle w:val="VerbatimChar"/>
+        </w:rPr>
+        <w:t xml:space="preserve">src/DirectorReportes.java</w:t>
+      </w:r>
+      <w:r>
+        <w:t xml:space="preserve"> </w:t>
+      </w:r>
+      <w:r>
+        <w:t xml:space="preserve">·</w:t>
+      </w:r>
+      <w:r>
+        <w:t xml:space="preserve"> </w:t>
+      </w:r>
+      <w:r>
+        <w:rPr>
+          <w:b/>
+          <w:bCs/>
+        </w:rPr>
+        <w:t xml:space="preserve">Líneas:</w:t>
+      </w:r>
+      <w:r>
+        <w:t xml:space="preserve"> </w:t>
+      </w:r>
+      <w:r>
+        <w:t xml:space="preserve">24 a 44</w:t>
+      </w:r>
+    </w:p>
+    <w:p>
+      <w:pPr>
+        <w:pStyle w:val="BodyText"/>
+      </w:pPr>
+      <w:r>
+        <w:rPr>
+          <w:rStyle w:val="VerbatimChar"/>
+        </w:rPr>
+        <w:t xml:space="preserve">reporteOperario()</w:t>
+      </w:r>
+      <w:r>
+        <w:t xml:space="preserve"> </w:t>
+      </w:r>
+      <w:r>
+        <w:t xml:space="preserve">pide tres partes;</w:t>
+      </w:r>
+      <w:r>
+        <w:t xml:space="preserve"> </w:t>
+      </w:r>
+      <w:r>
+        <w:rPr>
+          <w:rStyle w:val="VerbatimChar"/>
+        </w:rPr>
+        <w:t xml:space="preserve">reporteGerencial()</w:t>
+      </w:r>
+      <w:r>
+        <w:t xml:space="preserve"> </w:t>
+      </w:r>
+      <w:r>
+        <w:t xml:space="preserve">pide las seis. El director no sabe cómo</w:t>
+      </w:r>
+      <w:r>
+        <w:t xml:space="preserve"> </w:t>
+      </w:r>
+      <w:r>
+        <w:t xml:space="preserve">se arma ninguna: solo dice cuáles y en qué orden. Se ve también la integración con las semanas</w:t>
+      </w:r>
+      <w:r>
+        <w:t xml:space="preserve"> </w:t>
+      </w:r>
+      <w:r>
+        <w:t xml:space="preserve">anteriores:</w:t>
+      </w:r>
+      <w:r>
+        <w:t xml:space="preserve"> </w:t>
+      </w:r>
+      <w:r>
+        <w:rPr>
+          <w:rStyle w:val="VerbatimChar"/>
+        </w:rPr>
+        <w:t xml:space="preserve">ConfiguracionSistema.getInstancia()</w:t>
+      </w:r>
+      <w:r>
+        <w:t xml:space="preserve"> </w:t>
+      </w:r>
+      <w:r>
+        <w:t xml:space="preserve">y</w:t>
+      </w:r>
+      <w:r>
+        <w:t xml:space="preserve"> </w:t>
+      </w:r>
+      <w:r>
+        <w:rPr>
+          <w:rStyle w:val="VerbatimChar"/>
+        </w:rPr>
+        <w:t xml:space="preserve">SesionUsuario.getInstancia()</w:t>
+      </w:r>
+      <w:r>
+        <w:t xml:space="preserve"> </w:t>
+      </w:r>
+      <w:r>
+        <w:t xml:space="preserve">aportan el</w:t>
+      </w:r>
+      <w:r>
+        <w:t xml:space="preserve"> </w:t>
+      </w:r>
+      <w:r>
+        <w:t xml:space="preserve">encabezado.</w:t>
+      </w:r>
+    </w:p>
+    <w:p>
+      <w:pPr>
+        <w:pStyle w:val="Heading3"/>
+      </w:pPr>
+      <w:r>
+        <w:t xml:space="preserve">Captura 16 — Pruebas 1 y 2</w:t>
+      </w:r>
+    </w:p>
+    <w:p>
+      <w:pPr>
+        <w:pStyle w:val="CaptionedFigure"/>
+      </w:pPr>
+      <w:r>
+        <w:drawing>
+          <wp:inline>
+            <wp:extent cx="5334000" cy="4130842"/>
+            <wp:effectExtent b="0" l="0" r="0" t="0"/>
+            <wp:docPr descr="Captura 16" title="" id="55" name="Picture"/>
+            <a:graphic>
+              <a:graphicData uri="http://schemas.openxmlformats.org/drawingml/2006/picture">
+                <pic:pic>
+                  <pic:nvPicPr>
+                    <pic:cNvPr descr="semana-5-builder/evidencias/captura_16.png" id="56" name="Picture"/>
+                    <pic:cNvPicPr>
+                      <a:picLocks noChangeArrowheads="1" noChangeAspect="1"/>
+                    </pic:cNvPicPr>
+                  </pic:nvPicPr>
+                  <pic:blipFill>
+                    <a:blip r:embed="rId54"/>
+                    <a:stretch>
+                      <a:fillRect/>
+                    </a:stretch>
+                  </pic:blipFill>
+                  <pic:spPr bwMode="auto">
+                    <a:xfrm>
+                      <a:off x="0" y="0"/>
+                      <a:ext cx="5334000" cy="4130842"/>
+                    </a:xfrm>
+                    <a:prstGeom prst="rect">
+                      <a:avLst/>
+                    </a:prstGeom>
+                    <a:noFill/>
+                    <a:ln w="9525">
+                      <a:noFill/>
+                      <a:headEnd/>
+                      <a:tailEnd/>
+                    </a:ln>
+                  </pic:spPr>
+                </pic:pic>
+              </a:graphicData>
+            </a:graphic>
+          </wp:inline>
+        </w:drawing>
+      </w:r>
+    </w:p>
+    <w:p>
+      <w:pPr>
+        <w:pStyle w:val="ImageCaption"/>
+      </w:pPr>
+      <w:r>
+        <w:t xml:space="preserve">Captura 16</w:t>
+      </w:r>
+    </w:p>
+    <w:p>
+      <w:pPr>
+        <w:pStyle w:val="BodyText"/>
+      </w:pPr>
+      <w:r>
+        <w:rPr>
+          <w:b/>
+          <w:bCs/>
+        </w:rPr>
+        <w:t xml:space="preserve">Terminal:</w:t>
+      </w:r>
+      <w:r>
+        <w:t xml:space="preserve"> </w:t>
+      </w:r>
+      <w:r>
+        <w:t xml:space="preserve">salida de</w:t>
+      </w:r>
+      <w:r>
+        <w:t xml:space="preserve"> </w:t>
+      </w:r>
+      <w:r>
+        <w:rPr>
+          <w:rStyle w:val="VerbatimChar"/>
+        </w:rPr>
+        <w:t xml:space="preserve">java MainDemoBuilder</w:t>
+      </w:r>
+      <w:r>
+        <w:t xml:space="preserve">, pruebas 1 y 2.</w:t>
+      </w:r>
+    </w:p>
+    <w:p>
+      <w:pPr>
+        <w:pStyle w:val="BodyText"/>
+      </w:pPr>
+      <w:r>
+        <w:t xml:space="preserve">La prueba 1 construye un reporte con solo el título: una sección. La prueba 2 lo arma el cliente</w:t>
+      </w:r>
+      <w:r>
+        <w:t xml:space="preserve"> </w:t>
+      </w:r>
+      <w:r>
+        <w:t xml:space="preserve">a mano, eligiendo encabezado, una lectura y resumen: cuatro secciones. Ninguna de las dos pasó</w:t>
+      </w:r>
+      <w:r>
+        <w:t xml:space="preserve"> </w:t>
+      </w:r>
+      <w:r>
+        <w:rPr>
+          <w:rStyle w:val="VerbatimChar"/>
+        </w:rPr>
+        <w:t xml:space="preserve">null</w:t>
+      </w:r>
+      <w:r>
+        <w:t xml:space="preserve"> </w:t>
+      </w:r>
+      <w:r>
+        <w:t xml:space="preserve">ni listas vacías; simplemente no llamó a los métodos de las partes que no quería.</w:t>
+      </w:r>
+    </w:p>
+    <w:p>
+      <w:pPr>
+        <w:pStyle w:val="Heading3"/>
+      </w:pPr>
+      <w:r>
+        <w:t xml:space="preserve">Captura 17 — Prueba 3</w:t>
+      </w:r>
+    </w:p>
+    <w:p>
+      <w:pPr>
+        <w:pStyle w:val="CaptionedFigure"/>
+      </w:pPr>
+      <w:r>
+        <w:drawing>
+          <wp:inline>
+            <wp:extent cx="5334000" cy="6407371"/>
+            <wp:effectExtent b="0" l="0" r="0" t="0"/>
+            <wp:docPr descr="Captura 17" title="" id="58" name="Picture"/>
+            <a:graphic>
+              <a:graphicData uri="http://schemas.openxmlformats.org/drawingml/2006/picture">
+                <pic:pic>
+                  <pic:nvPicPr>
+                    <pic:cNvPr descr="semana-5-builder/evidencias/captura_17.png" id="59" name="Picture"/>
+                    <pic:cNvPicPr>
+                      <a:picLocks noChangeArrowheads="1" noChangeAspect="1"/>
+                    </pic:cNvPicPr>
+                  </pic:nvPicPr>
+                  <pic:blipFill>
+                    <a:blip r:embed="rId57"/>
+                    <a:stretch>
+                      <a:fillRect/>
+                    </a:stretch>
+                  </pic:blipFill>
+                  <pic:spPr bwMode="auto">
+                    <a:xfrm>
+                      <a:off x="0" y="0"/>
+                      <a:ext cx="5334000" cy="6407371"/>
+                    </a:xfrm>
+                    <a:prstGeom prst="rect">
+                      <a:avLst/>
+                    </a:prstGeom>
+                    <a:noFill/>
+                    <a:ln w="9525">
+                      <a:noFill/>
+                      <a:headEnd/>
+                      <a:tailEnd/>
+                    </a:ln>
+                  </pic:spPr>
+                </pic:pic>
+              </a:graphicData>
+            </a:graphic>
+          </wp:inline>
+        </w:drawing>
+      </w:r>
+    </w:p>
+    <w:p>
+      <w:pPr>
+        <w:pStyle w:val="ImageCaption"/>
+      </w:pPr>
+      <w:r>
+        <w:t xml:space="preserve">Captura 17</w:t>
+      </w:r>
+    </w:p>
+    <w:p>
+      <w:pPr>
+        <w:pStyle w:val="BodyText"/>
+      </w:pPr>
+      <w:r>
+        <w:rPr>
+          <w:b/>
+          <w:bCs/>
+        </w:rPr>
+        <w:t xml:space="preserve">Terminal:</w:t>
+      </w:r>
+      <w:r>
+        <w:t xml:space="preserve"> </w:t>
+      </w:r>
+      <w:r>
+        <w:t xml:space="preserve">salida de</w:t>
+      </w:r>
+      <w:r>
+        <w:t xml:space="preserve"> </w:t>
+      </w:r>
+      <w:r>
+        <w:rPr>
+          <w:rStyle w:val="VerbatimChar"/>
+        </w:rPr>
+        <w:t xml:space="preserve">java MainDemoBuilder</w:t>
+      </w:r>
+      <w:r>
+        <w:t xml:space="preserve">, prueba 3.</w:t>
+      </w:r>
+    </w:p>
+    <w:p>
+      <w:pPr>
+        <w:pStyle w:val="BodyText"/>
+      </w:pPr>
+      <w:r>
+        <w:t xml:space="preserve">El mismo builder produce dos reportes distintos según la receta del director: el de turno con tres</w:t>
+      </w:r>
+      <w:r>
+        <w:t xml:space="preserve"> </w:t>
+      </w:r>
+      <w:r>
+        <w:t xml:space="preserve">secciones y el gerencial con seis, incluyendo el encabezado con</w:t>
+      </w:r>
+      <w:r>
+        <w:t xml:space="preserve"> </w:t>
+      </w:r>
+      <w:r>
+        <w:rPr>
+          <w:rStyle w:val="VerbatimChar"/>
+        </w:rPr>
+        <w:t xml:space="preserve">Finca La Esperanza</w:t>
+      </w:r>
+      <w:r>
+        <w:t xml:space="preserve"> </w:t>
+      </w:r>
+      <w:r>
+        <w:t xml:space="preserve">y el usuario</w:t>
+      </w:r>
+      <w:r>
+        <w:t xml:space="preserve"> </w:t>
+      </w:r>
+      <w:r>
+        <w:rPr>
+          <w:rStyle w:val="VerbatimChar"/>
+        </w:rPr>
+        <w:t xml:space="preserve">admin</w:t>
+      </w:r>
+      <w:r>
+        <w:t xml:space="preserve"> </w:t>
+      </w:r>
+      <w:r>
+        <w:t xml:space="preserve">de la sesión activa.</w:t>
+      </w:r>
+    </w:p>
+    <w:p>
+      <w:pPr>
+        <w:pStyle w:val="Heading3"/>
+      </w:pPr>
+      <w:r>
+        <w:t xml:space="preserve">Captura 18 — Pruebas 4 a 6</w:t>
+      </w:r>
+    </w:p>
+    <w:p>
+      <w:pPr>
+        <w:pStyle w:val="CaptionedFigure"/>
+      </w:pPr>
+      <w:r>
+        <w:drawing>
+          <wp:inline>
+            <wp:extent cx="5334000" cy="3303245"/>
+            <wp:effectExtent b="0" l="0" r="0" t="0"/>
+            <wp:docPr descr="Captura 18" title="" id="61" name="Picture"/>
+            <a:graphic>
+              <a:graphicData uri="http://schemas.openxmlformats.org/drawingml/2006/picture">
+                <pic:pic>
+                  <pic:nvPicPr>
+                    <pic:cNvPr descr="semana-5-builder/evidencias/captura_18.png" id="62" name="Picture"/>
+                    <pic:cNvPicPr>
+                      <a:picLocks noChangeArrowheads="1" noChangeAspect="1"/>
+                    </pic:cNvPicPr>
+                  </pic:nvPicPr>
+                  <pic:blipFill>
+                    <a:blip r:embed="rId60"/>
+                    <a:stretch>
+                      <a:fillRect/>
+                    </a:stretch>
+                  </pic:blipFill>
+                  <pic:spPr bwMode="auto">
+                    <a:xfrm>
+                      <a:off x="0" y="0"/>
+                      <a:ext cx="5334000" cy="3303245"/>
+                    </a:xfrm>
+                    <a:prstGeom prst="rect">
+                      <a:avLst/>
+                    </a:prstGeom>
+                    <a:noFill/>
+                    <a:ln w="9525">
+                      <a:noFill/>
+                      <a:headEnd/>
+                      <a:tailEnd/>
+                    </a:ln>
+                  </pic:spPr>
+                </pic:pic>
+              </a:graphicData>
+            </a:graphic>
+          </wp:inline>
+        </w:drawing>
+      </w:r>
+    </w:p>
+    <w:p>
+      <w:pPr>
+        <w:pStyle w:val="ImageCaption"/>
+      </w:pPr>
+      <w:r>
+        <w:t xml:space="preserve">Captura 18</w:t>
+      </w:r>
+    </w:p>
+    <w:p>
+      <w:pPr>
+        <w:pStyle w:val="BodyText"/>
+      </w:pPr>
+      <w:r>
+        <w:rPr>
+          <w:b/>
+          <w:bCs/>
+        </w:rPr>
+        <w:t xml:space="preserve">Terminal:</w:t>
+      </w:r>
+      <w:r>
+        <w:t xml:space="preserve"> </w:t>
+      </w:r>
+      <w:r>
+        <w:t xml:space="preserve">salida de</w:t>
+      </w:r>
+      <w:r>
+        <w:t xml:space="preserve"> </w:t>
+      </w:r>
+      <w:r>
+        <w:rPr>
+          <w:rStyle w:val="VerbatimChar"/>
+        </w:rPr>
+        <w:t xml:space="preserve">java MainDemoBuilder</w:t>
+      </w:r>
+      <w:r>
+        <w:t xml:space="preserve">, pruebas 4 a 6.</w:t>
+      </w:r>
+    </w:p>
+    <w:p>
+      <w:pPr>
+        <w:pStyle w:val="BodyText"/>
+      </w:pPr>
+      <w:r>
+        <w:t xml:space="preserve">En la prueba 4 se sube el umbral de humedad a 95 % en la configuración global y el siguiente</w:t>
+      </w:r>
+      <w:r>
+        <w:t xml:space="preserve"> </w:t>
+      </w:r>
+      <w:r>
+        <w:t xml:space="preserve">reporte de turno incluye la alerta de humedad baja: las alertas no están quemadas en el reporte,</w:t>
+      </w:r>
+      <w:r>
+        <w:t xml:space="preserve"> </w:t>
+      </w:r>
+      <w:r>
+        <w:t xml:space="preserve">se derivan de la Semana 3. En la prueba 5, el reporte B tiene una sección y cero ítems de</w:t>
+      </w:r>
+      <w:r>
+        <w:t xml:space="preserve"> </w:t>
+      </w:r>
+      <w:r>
+        <w:t xml:space="preserve">inventario aunque el A, construido justo antes con el mismo builder, tenía inventario. En la</w:t>
+      </w:r>
+      <w:r>
+        <w:t xml:space="preserve"> </w:t>
+      </w:r>
+      <w:r>
+        <w:t xml:space="preserve">prueba 6, intentar construir sin título lanza</w:t>
+      </w:r>
+      <w:r>
+        <w:t xml:space="preserve"> </w:t>
+      </w:r>
+      <w:r>
+        <w:rPr>
+          <w:rStyle w:val="VerbatimChar"/>
+        </w:rPr>
+        <w:t xml:space="preserve">IllegalStateException</w:t>
+      </w:r>
+      <w:r>
+        <w:t xml:space="preserve">.</w:t>
+      </w:r>
+    </w:p>
+    <w:p>
+      <w:r>
+        <w:pict>
+          <v:rect style="width:0;height:1.5pt" o:hralign="center" o:hrstd="t" o:hr="t"/>
+        </w:pict>
+      </w:r>
+    </w:p>
+    <w:p>
+      <w:pPr>
+        <w:pStyle w:val="Heading2"/>
+      </w:pPr>
+      <w:r>
+        <w:t xml:space="preserve">Resultados</w:t>
+      </w:r>
+    </w:p>
+    <w:tbl>
+      <w:tblPr>
+        <w:tblStyle w:val="Table"/>
+        <w:tblW w:type="pct" w:w="5000"/>
+        <w:tblLayout w:type="fixed"/>
+        <w:tblLook w:firstRow="1" w:lastRow="0" w:firstColumn="0" w:lastColumn="0" w:noHBand="0" w:noVBand="0" w:val="0020"/>
+      </w:tblPr>
+      <w:tblGrid>
+        <w:gridCol w:w="1320"/>
+        <w:gridCol w:w="1320"/>
+        <w:gridCol w:w="1320"/>
+        <w:gridCol w:w="1320"/>
+        <w:gridCol w:w="1320"/>
+        <w:gridCol w:w="1320"/>
+      </w:tblGrid>
+      <w:tr>
+        <w:trPr>
+          <w:tblHeader w:val="on"/>
+        </w:trPr>
+        <w:tc>
+          <w:tcPr/>
+          <w:p>
+            <w:pPr>
+              <w:pStyle w:val="Compact"/>
+            </w:pPr>
+            <w:r>
+              <w:t xml:space="preserve">#</w:t>
+            </w:r>
+          </w:p>
+        </w:tc>
+        <w:tc>
+          <w:tcPr/>
+          <w:p>
+            <w:pPr>
+              <w:pStyle w:val="Compact"/>
+            </w:pPr>
+            <w:r>
+              <w:t xml:space="preserve">Prueba</w:t>
+            </w:r>
+          </w:p>
+        </w:tc>
+        <w:tc>
+          <w:tcPr/>
+          <w:p>
+            <w:pPr>
+              <w:pStyle w:val="Compact"/>
+            </w:pPr>
+            <w:r>
+              <w:t xml:space="preserve">Resultado esperado</w:t>
+            </w:r>
+          </w:p>
+        </w:tc>
+        <w:tc>
+          <w:tcPr/>
+          <w:p>
+            <w:pPr>
+              <w:pStyle w:val="Compact"/>
+            </w:pPr>
+            <w:r>
+              <w:t xml:space="preserve">Resultado obtenido</w:t>
+            </w:r>
+          </w:p>
+        </w:tc>
+        <w:tc>
+          <w:tcPr/>
+          <w:p>
+            <w:pPr>
+              <w:pStyle w:val="Compact"/>
+            </w:pPr>
+            <w:r>
+              <w:t xml:space="preserve">Estado</w:t>
+            </w:r>
+          </w:p>
+        </w:tc>
+        <w:tc>
+          <w:tcPr/>
+          <w:p>
+            <w:pPr>
+              <w:pStyle w:val="Compact"/>
+            </w:pPr>
+            <w:r>
+              <w:t xml:space="preserve">Captura</w:t>
+            </w:r>
+          </w:p>
+        </w:tc>
+      </w:tr>
+      <w:tr>
+        <w:tc>
+          <w:tcPr/>
+          <w:p>
+            <w:pPr>
+              <w:pStyle w:val="Compact"/>
+            </w:pPr>
+            <w:r>
+              <w:t xml:space="preserve">1</w:t>
+            </w:r>
+          </w:p>
+        </w:tc>
+        <w:tc>
+          <w:tcPr/>
+          <w:p>
+            <w:pPr>
+              <w:pStyle w:val="Compact"/>
+            </w:pPr>
+            <w:r>
+              <w:t xml:space="preserve">Reporte mínimo</w:t>
+            </w:r>
+          </w:p>
+        </w:tc>
+        <w:tc>
+          <w:tcPr/>
+          <w:p>
+            <w:pPr>
+              <w:pStyle w:val="Compact"/>
+            </w:pPr>
+            <w:r>
+              <w:t xml:space="preserve">Solo título,</w:t>
+            </w:r>
+            <w:r>
+              <w:t xml:space="preserve"> </w:t>
+            </w:r>
+            <w:r>
+              <w:rPr>
+                <w:rStyle w:val="VerbatimChar"/>
+              </w:rPr>
+              <w:t xml:space="preserve">Secciones incluidas: 1</w:t>
+            </w:r>
+          </w:p>
+        </w:tc>
+        <w:tc>
+          <w:tcPr/>
+          <w:p>
+            <w:pPr>
+              <w:pStyle w:val="Compact"/>
+            </w:pPr>
+            <w:r>
+              <w:rPr>
+                <w:rStyle w:val="VerbatimChar"/>
+              </w:rPr>
+              <w:t xml:space="preserve">REPORTE VACIO</w:t>
+            </w:r>
+            <w:r>
+              <w:t xml:space="preserve">, 1 sección</w:t>
+            </w:r>
+          </w:p>
+        </w:tc>
+        <w:tc>
+          <w:tcPr/>
+          <w:p>
+            <w:pPr>
+              <w:pStyle w:val="Compact"/>
+            </w:pPr>
+            <w:r>
+              <w:t xml:space="preserve">✅ OK</w:t>
+            </w:r>
+          </w:p>
+        </w:tc>
+        <w:tc>
+          <w:tcPr/>
+          <w:p>
+            <w:pPr>
+              <w:pStyle w:val="Compact"/>
+            </w:pPr>
+            <w:r>
+              <w:t xml:space="preserve">16</w:t>
+            </w:r>
+          </w:p>
+        </w:tc>
+      </w:tr>
+      <w:tr>
+        <w:tc>
+          <w:tcPr/>
+          <w:p>
+            <w:pPr>
+              <w:pStyle w:val="Compact"/>
+            </w:pPr>
+            <w:r>
+              <w:t xml:space="preserve">2</w:t>
+            </w:r>
+          </w:p>
+        </w:tc>
+        <w:tc>
+          <w:tcPr/>
+          <w:p>
+            <w:pPr>
+              <w:pStyle w:val="Compact"/>
+            </w:pPr>
+            <w:r>
+              <w:t xml:space="preserve">Construcción paso a paso</w:t>
+            </w:r>
+          </w:p>
+        </w:tc>
+        <w:tc>
+          <w:tcPr/>
+          <w:p>
+            <w:pPr>
+              <w:pStyle w:val="Compact"/>
+            </w:pPr>
+            <w:r>
+              <w:t xml:space="preserve">Encabezado, 1 lectura y resumen: 4 secciones</w:t>
+            </w:r>
+          </w:p>
+        </w:tc>
+        <w:tc>
+          <w:tcPr/>
+          <w:p>
+            <w:pPr>
+              <w:pStyle w:val="Compact"/>
+            </w:pPr>
+            <w:r>
+              <w:rPr>
+                <w:rStyle w:val="VerbatimChar"/>
+              </w:rPr>
+              <w:t xml:space="preserve">Secciones incluidas: 4</w:t>
+            </w:r>
+            <w:r>
+              <w:t xml:space="preserve">, lectura</w:t>
+            </w:r>
+            <w:r>
+              <w:t xml:space="preserve"> </w:t>
+            </w:r>
+            <w:r>
+              <w:rPr>
+                <w:rStyle w:val="VerbatimChar"/>
+              </w:rPr>
+              <w:t xml:space="preserve">HUMEDAD [S-01] 48.1 %</w:t>
+            </w:r>
+            <w:r>
+              <w:t xml:space="preserve">, sin alertas ni inventario</w:t>
+            </w:r>
+          </w:p>
+        </w:tc>
+        <w:tc>
+          <w:tcPr/>
+          <w:p>
+            <w:pPr>
+              <w:pStyle w:val="Compact"/>
+            </w:pPr>
+            <w:r>
+              <w:t xml:space="preserve">✅ OK</w:t>
+            </w:r>
+          </w:p>
+        </w:tc>
+        <w:tc>
+          <w:tcPr/>
+          <w:p>
+            <w:pPr>
+              <w:pStyle w:val="Compact"/>
+            </w:pPr>
+            <w:r>
+              <w:t xml:space="preserve">16</w:t>
+            </w:r>
+          </w:p>
+        </w:tc>
+      </w:tr>
+      <w:tr>
+        <w:tc>
+          <w:tcPr/>
+          <w:p>
+            <w:pPr>
+              <w:pStyle w:val="Compact"/>
+            </w:pPr>
+            <w:r>
+              <w:t xml:space="preserve">3</w:t>
+            </w:r>
+          </w:p>
+        </w:tc>
+        <w:tc>
+          <w:tcPr/>
+          <w:p>
+            <w:pPr>
+              <w:pStyle w:val="Compact"/>
+            </w:pPr>
+            <w:r>
+              <w:t xml:space="preserve">Recetas del director</w:t>
+            </w:r>
+          </w:p>
+        </w:tc>
+        <w:tc>
+          <w:tcPr/>
+          <w:p>
+            <w:pPr>
+              <w:pStyle w:val="Compact"/>
+            </w:pPr>
+            <w:r>
+              <w:t xml:space="preserve">Turno con 3 secciones; gerencial con 6</w:t>
+            </w:r>
+          </w:p>
+        </w:tc>
+        <w:tc>
+          <w:tcPr/>
+          <w:p>
+            <w:pPr>
+              <w:pStyle w:val="Compact"/>
+            </w:pPr>
+            <w:r>
+              <w:rPr>
+                <w:rStyle w:val="VerbatimChar"/>
+              </w:rPr>
+              <w:t xml:space="preserve">REPORTE DE TURNO</w:t>
+            </w:r>
+            <w:r>
+              <w:t xml:space="preserve"> </w:t>
+            </w:r>
+            <w:r>
+              <w:t xml:space="preserve">3 ·</w:t>
+            </w:r>
+            <w:r>
+              <w:t xml:space="preserve"> </w:t>
+            </w:r>
+            <w:r>
+              <w:rPr>
+                <w:rStyle w:val="VerbatimChar"/>
+              </w:rPr>
+              <w:t xml:space="preserve">REPORTE GERENCIAL</w:t>
+            </w:r>
+            <w:r>
+              <w:t xml:space="preserve"> </w:t>
+            </w:r>
+            <w:r>
+              <w:t xml:space="preserve">6, responsable</w:t>
+            </w:r>
+            <w:r>
+              <w:t xml:space="preserve"> </w:t>
+            </w:r>
+            <w:r>
+              <w:rPr>
+                <w:rStyle w:val="VerbatimChar"/>
+              </w:rPr>
+              <w:t xml:space="preserve">admin</w:t>
+            </w:r>
+            <w:r>
+              <w:t xml:space="preserve">, alerta</w:t>
+            </w:r>
+            <w:r>
+              <w:t xml:space="preserve"> </w:t>
+            </w:r>
+            <w:r>
+              <w:rPr>
+                <w:rStyle w:val="VerbatimChar"/>
+              </w:rPr>
+              <w:t xml:space="preserve">pH fuera de rango en S-03: 8.0</w:t>
+            </w:r>
+          </w:p>
+        </w:tc>
+        <w:tc>
+          <w:tcPr/>
+          <w:p>
+            <w:pPr>
+              <w:pStyle w:val="Compact"/>
+            </w:pPr>
+            <w:r>
+              <w:t xml:space="preserve">✅ OK</w:t>
+            </w:r>
+          </w:p>
+        </w:tc>
+        <w:tc>
+          <w:tcPr/>
+          <w:p>
+            <w:pPr>
+              <w:pStyle w:val="Compact"/>
+            </w:pPr>
+            <w:r>
+              <w:t xml:space="preserve">17</w:t>
+            </w:r>
+          </w:p>
+        </w:tc>
+      </w:tr>
+      <w:tr>
+        <w:tc>
+          <w:tcPr/>
+          <w:p>
+            <w:pPr>
+              <w:pStyle w:val="Compact"/>
+            </w:pPr>
+            <w:r>
+              <w:t xml:space="preserve">4</w:t>
+            </w:r>
+          </w:p>
+        </w:tc>
+        <w:tc>
+          <w:tcPr/>
+          <w:p>
+            <w:pPr>
+              <w:pStyle w:val="Compact"/>
+            </w:pPr>
+            <w:r>
+              <w:t xml:space="preserve">Alertas desde la configuración</w:t>
+            </w:r>
+          </w:p>
+        </w:tc>
+        <w:tc>
+          <w:tcPr/>
+          <w:p>
+            <w:pPr>
+              <w:pStyle w:val="Compact"/>
+            </w:pPr>
+            <w:r>
+              <w:t xml:space="preserve">Al subir el umbral a 95 % aparece alerta de humedad</w:t>
+            </w:r>
+          </w:p>
+        </w:tc>
+        <w:tc>
+          <w:tcPr/>
+          <w:p>
+            <w:pPr>
+              <w:pStyle w:val="Compact"/>
+            </w:pPr>
+            <w:r>
+              <w:rPr>
+                <w:rStyle w:val="VerbatimChar"/>
+              </w:rPr>
+              <w:t xml:space="preserve">Humedad baja en S-01: 48.1 % (umbral 95.0 %)</w:t>
+            </w:r>
+            <w:r>
+              <w:t xml:space="preserve">,</w:t>
+            </w:r>
+            <w:r>
+              <w:t xml:space="preserve"> </w:t>
+            </w:r>
+            <w:r>
+              <w:rPr>
+                <w:rStyle w:val="VerbatimChar"/>
+              </w:rPr>
+              <w:t xml:space="preserve">Alertas generadas: 2</w:t>
+            </w:r>
+          </w:p>
+        </w:tc>
+        <w:tc>
+          <w:tcPr/>
+          <w:p>
+            <w:pPr>
+              <w:pStyle w:val="Compact"/>
+            </w:pPr>
+            <w:r>
+              <w:t xml:space="preserve">✅ OK</w:t>
+            </w:r>
+          </w:p>
+        </w:tc>
+        <w:tc>
+          <w:tcPr/>
+          <w:p>
+            <w:pPr>
+              <w:pStyle w:val="Compact"/>
+            </w:pPr>
+            <w:r>
+              <w:t xml:space="preserve">18</w:t>
+            </w:r>
+          </w:p>
+        </w:tc>
+      </w:tr>
+      <w:tr>
+        <w:tc>
+          <w:tcPr/>
+          <w:p>
+            <w:pPr>
+              <w:pStyle w:val="Compact"/>
+            </w:pPr>
+            <w:r>
+              <w:t xml:space="preserve">5</w:t>
+            </w:r>
+          </w:p>
+        </w:tc>
+        <w:tc>
+          <w:tcPr/>
+          <w:p>
+            <w:pPr>
+              <w:pStyle w:val="Compact"/>
+            </w:pPr>
+            <w:r>
+              <w:t xml:space="preserve">Builder reutilizable</w:t>
+            </w:r>
+          </w:p>
+        </w:tc>
+        <w:tc>
+          <w:tcPr/>
+          <w:p>
+            <w:pPr>
+              <w:pStyle w:val="Compact"/>
+            </w:pPr>
+            <w:r>
+              <w:t xml:space="preserve">El reporte B no hereda partes del A</w:t>
+            </w:r>
+          </w:p>
+        </w:tc>
+        <w:tc>
+          <w:tcPr/>
+          <w:p>
+            <w:pPr>
+              <w:pStyle w:val="Compact"/>
+            </w:pPr>
+            <w:r>
+              <w:rPr>
+                <w:rStyle w:val="VerbatimChar"/>
+              </w:rPr>
+              <w:t xml:space="preserve">A -&gt; 2 secciones, 3 items</w:t>
+            </w:r>
+            <w:r>
+              <w:t xml:space="preserve"> </w:t>
+            </w:r>
+            <w:r>
+              <w:t xml:space="preserve">·</w:t>
+            </w:r>
+            <w:r>
+              <w:t xml:space="preserve"> </w:t>
+            </w:r>
+            <w:r>
+              <w:rPr>
+                <w:rStyle w:val="VerbatimChar"/>
+              </w:rPr>
+              <w:t xml:space="preserve">B -&gt; 1 sección, 0 items</w:t>
+            </w:r>
+          </w:p>
+        </w:tc>
+        <w:tc>
+          <w:tcPr/>
+          <w:p>
+            <w:pPr>
+              <w:pStyle w:val="Compact"/>
+            </w:pPr>
+            <w:r>
+              <w:t xml:space="preserve">✅ OK</w:t>
+            </w:r>
+          </w:p>
+        </w:tc>
+        <w:tc>
+          <w:tcPr/>
+          <w:p>
+            <w:pPr>
+              <w:pStyle w:val="Compact"/>
+            </w:pPr>
+            <w:r>
+              <w:t xml:space="preserve">18</w:t>
+            </w:r>
+          </w:p>
+        </w:tc>
+      </w:tr>
+      <w:tr>
+        <w:tc>
+          <w:tcPr/>
+          <w:p>
+            <w:pPr>
+              <w:pStyle w:val="Compact"/>
+            </w:pPr>
+            <w:r>
+              <w:t xml:space="preserve">6</w:t>
+            </w:r>
+          </w:p>
+        </w:tc>
+        <w:tc>
+          <w:tcPr/>
+          <w:p>
+            <w:pPr>
+              <w:pStyle w:val="Compact"/>
+            </w:pPr>
+            <w:r>
+              <w:t xml:space="preserve">Validación</w:t>
+            </w:r>
+          </w:p>
+        </w:tc>
+        <w:tc>
+          <w:tcPr/>
+          <w:p>
+            <w:pPr>
+              <w:pStyle w:val="Compact"/>
+            </w:pPr>
+            <w:r>
+              <w:rPr>
+                <w:rStyle w:val="VerbatimChar"/>
+              </w:rPr>
+              <w:t xml:space="preserve">IllegalStateException</w:t>
+            </w:r>
+            <w:r>
+              <w:t xml:space="preserve"> </w:t>
+            </w:r>
+            <w:r>
+              <w:t xml:space="preserve">sin título</w:t>
+            </w:r>
+          </w:p>
+        </w:tc>
+        <w:tc>
+          <w:tcPr/>
+          <w:p>
+            <w:pPr>
+              <w:pStyle w:val="Compact"/>
+            </w:pPr>
+            <w:r>
+              <w:rPr>
+                <w:rStyle w:val="VerbatimChar"/>
+              </w:rPr>
+              <w:t xml:space="preserve">Un reporte necesita titulo antes de construirse</w:t>
+            </w:r>
+          </w:p>
+        </w:tc>
+        <w:tc>
+          <w:tcPr/>
+          <w:p>
+            <w:pPr>
+              <w:pStyle w:val="Compact"/>
+            </w:pPr>
+            <w:r>
+              <w:t xml:space="preserve">✅ OK</w:t>
+            </w:r>
+          </w:p>
+        </w:tc>
+        <w:tc>
+          <w:tcPr/>
+          <w:p>
+            <w:pPr>
+              <w:pStyle w:val="Compact"/>
+            </w:pPr>
+            <w:r>
+              <w:t xml:space="preserve">18</w:t>
+            </w:r>
+          </w:p>
+        </w:tc>
+      </w:tr>
+    </w:tbl>
     <w:sectPr>
       <w:footnotePr>
         <w:numRestart w:val="eachSect"/>
@@ -8151,6 +11080,109 @@
       <w:pPr>
         <w:ind w:left="6480" w:hanging="360"/>
       </w:pPr>
+    </w:lvl>
+  </w:abstractNum>
+  <w:abstractNum w:abstractNumId="991">
+    <w:nsid w:val="0000A991"/>
+    <w:multiLevelType w:val="multilevel"/>
+    <w:lvl w:ilvl="0">
+      <w:numFmt w:val="bullet"/>
+      <w:lvlText w:val=""/>
+      <w:lvlJc w:val="left"/>
+      <w:pPr>
+        <w:ind w:left="720" w:hanging="360"/>
+      </w:pPr>
+      <w:rPr>
+        <w:rFonts w:ascii="Symbol" w:hAnsi="Symbol" w:cs="Symbol" w:hint="default"/>
+      </w:rPr>
+    </w:lvl>
+    <w:lvl w:ilvl="1">
+      <w:numFmt w:val="bullet"/>
+      <w:lvlText w:val="o"/>
+      <w:lvlJc w:val="left"/>
+      <w:pPr>
+        <w:ind w:left="1440" w:hanging="360"/>
+      </w:pPr>
+      <w:rPr>
+        <w:rFonts w:ascii="Courier New" w:hAnsi="Courier New" w:cs="Courier New" w:hint="default"/>
+      </w:rPr>
+    </w:lvl>
+    <w:lvl w:ilvl="2">
+      <w:numFmt w:val="bullet"/>
+      <w:lvlText w:val=""/>
+      <w:lvlJc w:val="left"/>
+      <w:pPr>
+        <w:ind w:left="2160" w:hanging="360"/>
+      </w:pPr>
+      <w:rPr>
+        <w:rFonts w:ascii="Wingdings" w:hAnsi="Wingdings" w:cs="Wingdings" w:hint="default"/>
+      </w:rPr>
+    </w:lvl>
+    <w:lvl w:ilvl="3">
+      <w:numFmt w:val="bullet"/>
+      <w:lvlText w:val=""/>
+      <w:lvlJc w:val="left"/>
+      <w:pPr>
+        <w:ind w:left="2880" w:hanging="360"/>
+      </w:pPr>
+      <w:rPr>
+        <w:rFonts w:ascii="Symbol" w:hAnsi="Symbol" w:cs="Symbol" w:hint="default"/>
+      </w:rPr>
+    </w:lvl>
+    <w:lvl w:ilvl="4">
+      <w:numFmt w:val="bullet"/>
+      <w:lvlText w:val="o"/>
+      <w:lvlJc w:val="left"/>
+      <w:pPr>
+        <w:ind w:left="3600" w:hanging="360"/>
+      </w:pPr>
+      <w:rPr>
+        <w:rFonts w:ascii="Courier New" w:hAnsi="Courier New" w:cs="Courier New" w:hint="default"/>
+      </w:rPr>
+    </w:lvl>
+    <w:lvl w:ilvl="5">
+      <w:numFmt w:val="bullet"/>
+      <w:lvlText w:val=""/>
+      <w:lvlJc w:val="left"/>
+      <w:pPr>
+        <w:ind w:left="4320" w:hanging="360"/>
+      </w:pPr>
+      <w:rPr>
+        <w:rFonts w:ascii="Wingdings" w:hAnsi="Wingdings" w:cs="Wingdings" w:hint="default"/>
+      </w:rPr>
+    </w:lvl>
+    <w:lvl w:ilvl="6">
+      <w:numFmt w:val="bullet"/>
+      <w:lvlText w:val=""/>
+      <w:lvlJc w:val="left"/>
+      <w:pPr>
+        <w:ind w:left="5040" w:hanging="360"/>
+      </w:pPr>
+      <w:rPr>
+        <w:rFonts w:ascii="Symbol" w:hAnsi="Symbol" w:cs="Symbol" w:hint="default"/>
+      </w:rPr>
+    </w:lvl>
+    <w:lvl w:ilvl="7">
+      <w:numFmt w:val="bullet"/>
+      <w:lvlText w:val="o"/>
+      <w:lvlJc w:val="left"/>
+      <w:pPr>
+        <w:ind w:left="5760" w:hanging="360"/>
+      </w:pPr>
+      <w:rPr>
+        <w:rFonts w:ascii="Courier New" w:hAnsi="Courier New" w:cs="Courier New" w:hint="default"/>
+      </w:rPr>
+    </w:lvl>
+    <w:lvl w:ilvl="8">
+      <w:numFmt w:val="bullet"/>
+      <w:lvlText w:val=""/>
+      <w:lvlJc w:val="left"/>
+      <w:pPr>
+        <w:ind w:left="6480" w:hanging="360"/>
+      </w:pPr>
+      <w:rPr>
+        <w:rFonts w:ascii="Wingdings" w:hAnsi="Wingdings" w:cs="Wingdings" w:hint="default"/>
+      </w:rPr>
     </w:lvl>
   </w:abstractNum>
   <w:num w:numId="1000">
@@ -8185,6 +11217,9 @@
     <w:lvlOverride w:ilvl="8">
       <w:startOverride w:val="1"/>
     </w:lvlOverride>
+  </w:num>
+  <w:num w:numId="1002">
+    <w:abstractNumId w:val="991"/>
   </w:num>
 </w:numbering>
 </file>

</xml_diff>

<commit_message>
Semana 6: Abstract Factory y Prototype en módulos de equipamiento y lote
- Abstract Factory: FabricaEquipamiento con FabricaInvernadero y
  FabricaCampoAbierto; productos Sensor y ActuadorRiego; cliente
  EstacionMonitoreo.
- Prototype: Lote.clone() con copia profunda de UmbralesLote y de la
  lista de sensores; registro CatalogoLotes.
- MainDemoAbstractFactoryPrototype con 7 pruebas y capturas 19 a 24.
- Hoja de ruta ampliada a 14 patrones; Word regenerado con la Semana 6.
</commit_message>
<xml_diff>
--- a/Patrones-de-Software-E195.docx
+++ b/Patrones-de-Software-E195.docx
@@ -10882,6 +10882,4105 @@
             </w:pPr>
             <w:r>
               <w:t xml:space="preserve">18</w:t>
+            </w:r>
+          </w:p>
+        </w:tc>
+      </w:tr>
+    </w:tbl>
+    <w:p>
+      <w:pPr>
+        <w:pStyle w:val="Heading1"/>
+      </w:pPr>
+      <w:r>
+        <w:t xml:space="preserve">Semana 6 — Patrones Abstract Factory y Prototype</w:t>
+      </w:r>
+    </w:p>
+    <w:p>
+      <w:pPr>
+        <w:pStyle w:val="FirstParagraph"/>
+      </w:pPr>
+      <w:r>
+        <w:t xml:space="preserve">Aplicación de dos patrones creacionales en el prototipo</w:t>
+      </w:r>
+      <w:r>
+        <w:t xml:space="preserve"> </w:t>
+      </w:r>
+      <w:r>
+        <w:rPr>
+          <w:b/>
+          <w:bCs/>
+        </w:rPr>
+        <w:t xml:space="preserve">AgroPrecisión</w:t>
+      </w:r>
+      <w:r>
+        <w:t xml:space="preserve">.</w:t>
+      </w:r>
+      <w:r>
+        <w:t xml:space="preserve"> </w:t>
+      </w:r>
+      <w:r>
+        <w:rPr>
+          <w:b/>
+          <w:bCs/>
+        </w:rPr>
+        <w:t xml:space="preserve">Abstract Factory</w:t>
+      </w:r>
+      <w:r>
+        <w:t xml:space="preserve"> </w:t>
+      </w:r>
+      <w:r>
+        <w:t xml:space="preserve">produce familias completas de equipamiento coherentes con la zona de cultivo —invernadero o campo</w:t>
+      </w:r>
+      <w:r>
+        <w:t xml:space="preserve"> </w:t>
+      </w:r>
+      <w:r>
+        <w:t xml:space="preserve">abierto—;</w:t>
+      </w:r>
+      <w:r>
+        <w:t xml:space="preserve"> </w:t>
+      </w:r>
+      <w:r>
+        <w:rPr>
+          <w:b/>
+          <w:bCs/>
+        </w:rPr>
+        <w:t xml:space="preserve">Prototype</w:t>
+      </w:r>
+      <w:r>
+        <w:t xml:space="preserve"> </w:t>
+      </w:r>
+      <w:r>
+        <w:t xml:space="preserve">permite registrar un lote ya equipado como plantilla y crear los demás</w:t>
+      </w:r>
+      <w:r>
+        <w:t xml:space="preserve"> </w:t>
+      </w:r>
+      <w:r>
+        <w:t xml:space="preserve">lotes de la finca clonándolo, en vez de armar cada uno desde cero.</w:t>
+      </w:r>
+    </w:p>
+    <w:p>
+      <w:pPr>
+        <w:pStyle w:val="BodyText"/>
+      </w:pPr>
+      <w:r>
+        <w:rPr>
+          <w:b/>
+          <w:bCs/>
+        </w:rPr>
+        <w:t xml:space="preserve">Estudiantes:</w:t>
+      </w:r>
+      <w:r>
+        <w:t xml:space="preserve"> </w:t>
+      </w:r>
+      <w:r>
+        <w:t xml:space="preserve">Jeisson Stewen Berdugo Cely · Darwin Felipe Gil López</w:t>
+      </w:r>
+      <w:r>
+        <w:t xml:space="preserve"> </w:t>
+      </w:r>
+      <w:r>
+        <w:rPr>
+          <w:b/>
+          <w:bCs/>
+        </w:rPr>
+        <w:t xml:space="preserve">Grupo:</w:t>
+      </w:r>
+      <w:r>
+        <w:t xml:space="preserve"> </w:t>
+      </w:r>
+      <w:r>
+        <w:t xml:space="preserve">E-195</w:t>
+      </w:r>
+    </w:p>
+    <w:p>
+      <w:pPr>
+        <w:pStyle w:val="BodyText"/>
+      </w:pPr>
+      <w:r>
+        <w:rPr>
+          <w:b/>
+          <w:bCs/>
+        </w:rPr>
+        <w:t xml:space="preserve">Código Abstract Factory:</w:t>
+      </w:r>
+      <w:r>
+        <w:t xml:space="preserve"> </w:t>
+      </w:r>
+      <w:r>
+        <w:rPr>
+          <w:rStyle w:val="VerbatimChar"/>
+        </w:rPr>
+        <w:t xml:space="preserve">FabricaEquipamiento.java</w:t>
+      </w:r>
+      <w:r>
+        <w:t xml:space="preserve"> </w:t>
+      </w:r>
+      <w:r>
+        <w:t xml:space="preserve">(fábrica abstracta) ·</w:t>
+      </w:r>
+      <w:r>
+        <w:t xml:space="preserve"> </w:t>
+      </w:r>
+      <w:r>
+        <w:rPr>
+          <w:rStyle w:val="VerbatimChar"/>
+        </w:rPr>
+        <w:t xml:space="preserve">FabricaInvernadero.java</w:t>
+      </w:r>
+      <w:r>
+        <w:t xml:space="preserve"> </w:t>
+      </w:r>
+      <w:r>
+        <w:t xml:space="preserve">·</w:t>
+      </w:r>
+      <w:r>
+        <w:t xml:space="preserve"> </w:t>
+      </w:r>
+      <w:r>
+        <w:rPr>
+          <w:rStyle w:val="VerbatimChar"/>
+        </w:rPr>
+        <w:t xml:space="preserve">FabricaCampoAbierto.java</w:t>
+      </w:r>
+      <w:r>
+        <w:t xml:space="preserve"> </w:t>
+      </w:r>
+      <w:r>
+        <w:t xml:space="preserve">(fábricas concretas) ·</w:t>
+      </w:r>
+      <w:r>
+        <w:t xml:space="preserve"> </w:t>
+      </w:r>
+      <w:r>
+        <w:rPr>
+          <w:rStyle w:val="VerbatimChar"/>
+        </w:rPr>
+        <w:t xml:space="preserve">ActuadorRiego.java</w:t>
+      </w:r>
+      <w:r>
+        <w:t xml:space="preserve"> </w:t>
+      </w:r>
+      <w:r>
+        <w:t xml:space="preserve">(producto abstracto) ·</w:t>
+      </w:r>
+      <w:r>
+        <w:t xml:space="preserve"> </w:t>
+      </w:r>
+      <w:r>
+        <w:rPr>
+          <w:rStyle w:val="VerbatimChar"/>
+        </w:rPr>
+        <w:t xml:space="preserve">EstacionMonitoreo.java</w:t>
+      </w:r>
+      <w:r>
+        <w:t xml:space="preserve"> </w:t>
+      </w:r>
+      <w:r>
+        <w:t xml:space="preserve">(cliente)</w:t>
+      </w:r>
+    </w:p>
+    <w:p>
+      <w:pPr>
+        <w:pStyle w:val="BodyText"/>
+      </w:pPr>
+      <w:r>
+        <w:rPr>
+          <w:b/>
+          <w:bCs/>
+        </w:rPr>
+        <w:t xml:space="preserve">Código Prototype:</w:t>
+      </w:r>
+      <w:r>
+        <w:t xml:space="preserve"> </w:t>
+      </w:r>
+      <w:r>
+        <w:rPr>
+          <w:rStyle w:val="VerbatimChar"/>
+        </w:rPr>
+        <w:t xml:space="preserve">Lote.java</w:t>
+      </w:r>
+      <w:r>
+        <w:t xml:space="preserve"> </w:t>
+      </w:r>
+      <w:r>
+        <w:t xml:space="preserve">(prototipo) ·</w:t>
+      </w:r>
+      <w:r>
+        <w:t xml:space="preserve"> </w:t>
+      </w:r>
+      <w:r>
+        <w:rPr>
+          <w:rStyle w:val="VerbatimChar"/>
+        </w:rPr>
+        <w:t xml:space="preserve">UmbralesLote.java</w:t>
+      </w:r>
+      <w:r>
+        <w:t xml:space="preserve"> </w:t>
+      </w:r>
+      <w:r>
+        <w:t xml:space="preserve">(parte mutable) ·</w:t>
+      </w:r>
+      <w:r>
+        <w:t xml:space="preserve"> </w:t>
+      </w:r>
+      <w:r>
+        <w:rPr>
+          <w:rStyle w:val="VerbatimChar"/>
+        </w:rPr>
+        <w:t xml:space="preserve">CatalogoLotes.java</w:t>
+      </w:r>
+      <w:r>
+        <w:t xml:space="preserve"> </w:t>
+      </w:r>
+      <w:r>
+        <w:t xml:space="preserve">(registro de prototipos)</w:t>
+      </w:r>
+    </w:p>
+    <w:p>
+      <w:pPr>
+        <w:pStyle w:val="BodyText"/>
+      </w:pPr>
+      <w:r>
+        <w:rPr>
+          <w:b/>
+          <w:bCs/>
+        </w:rPr>
+        <w:t xml:space="preserve">Demo:</w:t>
+      </w:r>
+      <w:r>
+        <w:t xml:space="preserve"> </w:t>
+      </w:r>
+      <w:r>
+        <w:rPr>
+          <w:rStyle w:val="VerbatimChar"/>
+        </w:rPr>
+        <w:t xml:space="preserve">MainDemoAbstractFactoryPrototype.java</w:t>
+      </w:r>
+    </w:p>
+    <w:p>
+      <w:pPr>
+        <w:pStyle w:val="BodyText"/>
+      </w:pPr>
+      <w:r>
+        <w:rPr>
+          <w:b/>
+          <w:bCs/>
+        </w:rPr>
+        <w:t xml:space="preserve">Para ejecutar:</w:t>
+      </w:r>
+    </w:p>
+    <w:p>
+      <w:pPr>
+        <w:pStyle w:val="SourceCode"/>
+      </w:pPr>
+      <w:r>
+        <w:rPr>
+          <w:rStyle w:val="VerbatimChar"/>
+        </w:rPr>
+        <w:t xml:space="preserve">cd semana-6-abstract-factory-prototype/src &amp;&amp; javac *.java &amp;&amp; java MainDemoAbstractFactoryPrototype</w:t>
+      </w:r>
+    </w:p>
+    <w:p>
+      <w:pPr>
+        <w:pStyle w:val="FirstParagraph"/>
+      </w:pPr>
+      <w:r>
+        <w:t xml:space="preserve">Las clases</w:t>
+      </w:r>
+      <w:r>
+        <w:t xml:space="preserve"> </w:t>
+      </w:r>
+      <w:r>
+        <w:rPr>
+          <w:rStyle w:val="VerbatimChar"/>
+        </w:rPr>
+        <w:t xml:space="preserve">Sensor</w:t>
+      </w:r>
+      <w:r>
+        <w:t xml:space="preserve"> </w:t>
+      </w:r>
+      <w:r>
+        <w:t xml:space="preserve">y</w:t>
+      </w:r>
+      <w:r>
+        <w:t xml:space="preserve"> </w:t>
+      </w:r>
+      <w:r>
+        <w:rPr>
+          <w:rStyle w:val="VerbatimChar"/>
+        </w:rPr>
+        <w:t xml:space="preserve">Lectura</w:t>
+      </w:r>
+      <w:r>
+        <w:t xml:space="preserve"> </w:t>
+      </w:r>
+      <w:r>
+        <w:t xml:space="preserve">están copiadas de la Semana 4 para que esta carpeta compile por sí</w:t>
+      </w:r>
+      <w:r>
+        <w:t xml:space="preserve"> </w:t>
+      </w:r>
+      <w:r>
+        <w:t xml:space="preserve">sola. No se modificó nada de su contenido.</w:t>
+      </w:r>
+    </w:p>
+    <w:p>
+      <w:r>
+        <w:pict>
+          <v:rect style="width:0;height:1.5pt" o:hralign="center" o:hrstd="t" o:hr="t"/>
+        </w:pict>
+      </w:r>
+    </w:p>
+    <w:p>
+      <w:pPr>
+        <w:pStyle w:val="Heading2"/>
+      </w:pPr>
+      <w:r>
+        <w:t xml:space="preserve">Parte 1 — Abstract Factory: equipamiento por zona</w:t>
+      </w:r>
+    </w:p>
+    <w:p>
+      <w:pPr>
+        <w:pStyle w:val="Heading3"/>
+      </w:pPr>
+      <w:r>
+        <w:t xml:space="preserve">El problema</w:t>
+      </w:r>
+    </w:p>
+    <w:p>
+      <w:pPr>
+        <w:pStyle w:val="FirstParagraph"/>
+      </w:pPr>
+      <w:r>
+        <w:t xml:space="preserve">La finca tiene dos tipos de zona. En el</w:t>
+      </w:r>
+      <w:r>
+        <w:t xml:space="preserve"> </w:t>
+      </w:r>
+      <w:r>
+        <w:rPr>
+          <w:b/>
+          <w:bCs/>
+        </w:rPr>
+        <w:t xml:space="preserve">invernadero</w:t>
+      </w:r>
+      <w:r>
+        <w:t xml:space="preserve"> </w:t>
+      </w:r>
+      <w:r>
+        <w:t xml:space="preserve">el ambiente es controlado: la humedad se</w:t>
+      </w:r>
+      <w:r>
+        <w:t xml:space="preserve"> </w:t>
+      </w:r>
+      <w:r>
+        <w:t xml:space="preserve">mueve entre 60 y 85 %, la temperatura entre 18 y 28 °C, y se riega por goteo. En</w:t>
+      </w:r>
+      <w:r>
+        <w:t xml:space="preserve"> </w:t>
+      </w:r>
+      <w:r>
+        <w:rPr>
+          <w:b/>
+          <w:bCs/>
+        </w:rPr>
+        <w:t xml:space="preserve">campo abierto</w:t>
+      </w:r>
+      <w:r>
+        <w:t xml:space="preserve"> </w:t>
+      </w:r>
+      <w:r>
+        <w:t xml:space="preserve">los sensores enfrentan el clima real —10 a 90 %, 5 a 38 °C— y se riega por aspersión.</w:t>
+      </w:r>
+    </w:p>
+    <w:p>
+      <w:pPr>
+        <w:pStyle w:val="BodyText"/>
+      </w:pPr>
+      <w:r>
+        <w:t xml:space="preserve">Cada zona necesita, entonces, un</w:t>
+      </w:r>
+      <w:r>
+        <w:t xml:space="preserve"> </w:t>
+      </w:r>
+      <w:r>
+        <w:rPr>
+          <w:i/>
+          <w:iCs/>
+        </w:rPr>
+        <w:t xml:space="preserve">conjunto</w:t>
+      </w:r>
+      <w:r>
+        <w:t xml:space="preserve"> </w:t>
+      </w:r>
+      <w:r>
+        <w:t xml:space="preserve">de dispositivos que deben ir juntos: sus dos sensores y</w:t>
+      </w:r>
+      <w:r>
+        <w:t xml:space="preserve"> </w:t>
+      </w:r>
+      <w:r>
+        <w:t xml:space="preserve">su actuador. El Factory Method de la Semana 4 resuelve la creación de</w:t>
+      </w:r>
+      <w:r>
+        <w:t xml:space="preserve"> </w:t>
+      </w:r>
+      <w:r>
+        <w:rPr>
+          <w:i/>
+          <w:iCs/>
+        </w:rPr>
+        <w:t xml:space="preserve">un</w:t>
+      </w:r>
+      <w:r>
+        <w:t xml:space="preserve"> </w:t>
+      </w:r>
+      <w:r>
+        <w:t xml:space="preserve">producto, pero no evita</w:t>
+      </w:r>
+      <w:r>
+        <w:t xml:space="preserve"> </w:t>
+      </w:r>
+      <w:r>
+        <w:t xml:space="preserve">la combinación incoherente: nada impide instalar un sensor de invernadero junto a un aspersor de</w:t>
+      </w:r>
+      <w:r>
+        <w:t xml:space="preserve"> </w:t>
+      </w:r>
+      <w:r>
+        <w:t xml:space="preserve">campo. Y si la selección se hiciera con</w:t>
+      </w:r>
+      <w:r>
+        <w:t xml:space="preserve"> </w:t>
+      </w:r>
+      <w:r>
+        <w:rPr>
+          <w:rStyle w:val="VerbatimChar"/>
+        </w:rPr>
+        <w:t xml:space="preserve">if (zona.equals("invernadero"))</w:t>
+      </w:r>
+      <w:r>
+        <w:t xml:space="preserve"> </w:t>
+      </w:r>
+      <w:r>
+        <w:t xml:space="preserve">en cada punto donde se</w:t>
+      </w:r>
+      <w:r>
+        <w:t xml:space="preserve"> </w:t>
+      </w:r>
+      <w:r>
+        <w:t xml:space="preserve">crea un dispositivo, el mismo bloque se repetiría tres veces por zona y habría que buscarlos todos</w:t>
+      </w:r>
+      <w:r>
+        <w:t xml:space="preserve"> </w:t>
+      </w:r>
+      <w:r>
+        <w:t xml:space="preserve">cuando aparezca la tercera zona (por ejemplo, un cultivo hidropónico).</w:t>
+      </w:r>
+    </w:p>
+    <w:p>
+      <w:pPr>
+        <w:pStyle w:val="Heading3"/>
+      </w:pPr>
+      <w:r>
+        <w:t xml:space="preserve">Qué es el Abstract Factory</w:t>
+      </w:r>
+    </w:p>
+    <w:p>
+      <w:pPr>
+        <w:pStyle w:val="FirstParagraph"/>
+      </w:pPr>
+      <w:r>
+        <w:t xml:space="preserve">Es un patrón creacional. Su intención, según el GoF, es proporcionar una interfaz para crear</w:t>
+      </w:r>
+      <w:r>
+        <w:t xml:space="preserve"> </w:t>
+      </w:r>
+      <w:r>
+        <w:t xml:space="preserve">familias de objetos relacionados o dependientes sin especificar sus clases concretas. Tiene cuatro</w:t>
+      </w:r>
+      <w:r>
+        <w:t xml:space="preserve"> </w:t>
+      </w:r>
+      <w:r>
+        <w:t xml:space="preserve">roles: la</w:t>
+      </w:r>
+      <w:r>
+        <w:t xml:space="preserve"> </w:t>
+      </w:r>
+      <w:r>
+        <w:rPr>
+          <w:b/>
+          <w:bCs/>
+        </w:rPr>
+        <w:t xml:space="preserve">fábrica abstracta</w:t>
+      </w:r>
+      <w:r>
+        <w:t xml:space="preserve">, que declara un método de creación por cada producto de la familia;</w:t>
+      </w:r>
+      <w:r>
+        <w:t xml:space="preserve"> </w:t>
+      </w:r>
+      <w:r>
+        <w:t xml:space="preserve">las</w:t>
+      </w:r>
+      <w:r>
+        <w:t xml:space="preserve"> </w:t>
+      </w:r>
+      <w:r>
+        <w:rPr>
+          <w:b/>
+          <w:bCs/>
+        </w:rPr>
+        <w:t xml:space="preserve">fábricas concretas</w:t>
+      </w:r>
+      <w:r>
+        <w:t xml:space="preserve">, una por familia; los</w:t>
+      </w:r>
+      <w:r>
+        <w:t xml:space="preserve"> </w:t>
+      </w:r>
+      <w:r>
+        <w:rPr>
+          <w:b/>
+          <w:bCs/>
+        </w:rPr>
+        <w:t xml:space="preserve">productos abstractos</w:t>
+      </w:r>
+      <w:r>
+        <w:t xml:space="preserve"> </w:t>
+      </w:r>
+      <w:r>
+        <w:t xml:space="preserve">y los</w:t>
+      </w:r>
+      <w:r>
+        <w:t xml:space="preserve"> </w:t>
+      </w:r>
+      <w:r>
+        <w:rPr>
+          <w:b/>
+          <w:bCs/>
+        </w:rPr>
+        <w:t xml:space="preserve">productos</w:t>
+      </w:r>
+      <w:r>
+        <w:rPr>
+          <w:b/>
+          <w:bCs/>
+        </w:rPr>
+        <w:t xml:space="preserve"> </w:t>
+      </w:r>
+      <w:r>
+        <w:rPr>
+          <w:b/>
+          <w:bCs/>
+        </w:rPr>
+        <w:t xml:space="preserve">concretos</w:t>
+      </w:r>
+      <w:r>
+        <w:t xml:space="preserve">; y el</w:t>
+      </w:r>
+      <w:r>
+        <w:t xml:space="preserve"> </w:t>
+      </w:r>
+      <w:r>
+        <w:rPr>
+          <w:b/>
+          <w:bCs/>
+        </w:rPr>
+        <w:t xml:space="preserve">cliente</w:t>
+      </w:r>
+      <w:r>
+        <w:t xml:space="preserve">, que solo usa las interfaces.</w:t>
+      </w:r>
+    </w:p>
+    <w:p>
+      <w:pPr>
+        <w:pStyle w:val="BodyText"/>
+      </w:pPr>
+      <w:r>
+        <w:t xml:space="preserve">La diferencia con el Factory Method es de alcance: el Factory Method es</w:t>
+      </w:r>
+      <w:r>
+        <w:t xml:space="preserve"> </w:t>
+      </w:r>
+      <w:r>
+        <w:rPr>
+          <w:i/>
+          <w:iCs/>
+        </w:rPr>
+        <w:t xml:space="preserve">un método</w:t>
+      </w:r>
+      <w:r>
+        <w:t xml:space="preserve"> </w:t>
+      </w:r>
+      <w:r>
+        <w:t xml:space="preserve">que crea</w:t>
+      </w:r>
+      <w:r>
+        <w:t xml:space="preserve"> </w:t>
+      </w:r>
+      <w:r>
+        <w:rPr>
+          <w:i/>
+          <w:iCs/>
+        </w:rPr>
+        <w:t xml:space="preserve">un</w:t>
+      </w:r>
+      <w:r>
+        <w:t xml:space="preserve"> </w:t>
+      </w:r>
+      <w:r>
+        <w:t xml:space="preserve">producto; el Abstract Factory es</w:t>
+      </w:r>
+      <w:r>
+        <w:t xml:space="preserve"> </w:t>
+      </w:r>
+      <w:r>
+        <w:rPr>
+          <w:i/>
+          <w:iCs/>
+        </w:rPr>
+        <w:t xml:space="preserve">un objeto</w:t>
+      </w:r>
+      <w:r>
+        <w:t xml:space="preserve"> </w:t>
+      </w:r>
+      <w:r>
+        <w:t xml:space="preserve">que crea</w:t>
+      </w:r>
+      <w:r>
+        <w:t xml:space="preserve"> </w:t>
+      </w:r>
+      <w:r>
+        <w:rPr>
+          <w:i/>
+          <w:iCs/>
+        </w:rPr>
+        <w:t xml:space="preserve">una familia completa</w:t>
+      </w:r>
+      <w:r>
+        <w:t xml:space="preserve">. De hecho, cada</w:t>
+      </w:r>
+      <w:r>
+        <w:t xml:space="preserve"> </w:t>
+      </w:r>
+      <w:r>
+        <w:t xml:space="preserve">método de la fábrica concreta es, internamente, un factory method.</w:t>
+      </w:r>
+    </w:p>
+    <w:p>
+      <w:pPr>
+        <w:pStyle w:val="Heading3"/>
+      </w:pPr>
+      <w:r>
+        <w:t xml:space="preserve">Cómo lo aplicamos</w:t>
+      </w:r>
+    </w:p>
+    <w:tbl>
+      <w:tblPr>
+        <w:tblStyle w:val="Table"/>
+        <w:tblW w:type="pct" w:w="5000"/>
+        <w:tblLayout w:type="fixed"/>
+        <w:tblLook w:firstRow="1" w:lastRow="0" w:firstColumn="0" w:lastColumn="0" w:noHBand="0" w:noVBand="0" w:val="0020"/>
+      </w:tblPr>
+      <w:tblGrid>
+        <w:gridCol w:w="3960"/>
+        <w:gridCol w:w="3960"/>
+      </w:tblGrid>
+      <w:tr>
+        <w:trPr>
+          <w:tblHeader w:val="on"/>
+        </w:trPr>
+        <w:tc>
+          <w:tcPr/>
+          <w:p>
+            <w:pPr>
+              <w:pStyle w:val="Compact"/>
+            </w:pPr>
+            <w:r>
+              <w:t xml:space="preserve">Rol en el patrón</w:t>
+            </w:r>
+          </w:p>
+        </w:tc>
+        <w:tc>
+          <w:tcPr/>
+          <w:p>
+            <w:pPr>
+              <w:pStyle w:val="Compact"/>
+            </w:pPr>
+            <w:r>
+              <w:t xml:space="preserve">Clases</w:t>
+            </w:r>
+          </w:p>
+        </w:tc>
+      </w:tr>
+      <w:tr>
+        <w:tc>
+          <w:tcPr/>
+          <w:p>
+            <w:pPr>
+              <w:pStyle w:val="Compact"/>
+            </w:pPr>
+            <w:r>
+              <w:t xml:space="preserve">Fábrica abstracta</w:t>
+            </w:r>
+          </w:p>
+        </w:tc>
+        <w:tc>
+          <w:tcPr/>
+          <w:p>
+            <w:pPr>
+              <w:pStyle w:val="Compact"/>
+            </w:pPr>
+            <w:r>
+              <w:rPr>
+                <w:rStyle w:val="VerbatimChar"/>
+              </w:rPr>
+              <w:t xml:space="preserve">FabricaEquipamiento.java</w:t>
+            </w:r>
+            <w:r>
+              <w:t xml:space="preserve"> </w:t>
+            </w:r>
+            <w:r>
+              <w:t xml:space="preserve">—</w:t>
+            </w:r>
+            <w:r>
+              <w:t xml:space="preserve"> </w:t>
+            </w:r>
+            <w:r>
+              <w:rPr>
+                <w:rStyle w:val="VerbatimChar"/>
+              </w:rPr>
+              <w:t xml:space="preserve">crearSensorHumedad()</w:t>
+            </w:r>
+            <w:r>
+              <w:t xml:space="preserve">,</w:t>
+            </w:r>
+            <w:r>
+              <w:t xml:space="preserve"> </w:t>
+            </w:r>
+            <w:r>
+              <w:rPr>
+                <w:rStyle w:val="VerbatimChar"/>
+              </w:rPr>
+              <w:t xml:space="preserve">crearSensorTemperatura()</w:t>
+            </w:r>
+            <w:r>
+              <w:t xml:space="preserve">,</w:t>
+            </w:r>
+            <w:r>
+              <w:t xml:space="preserve"> </w:t>
+            </w:r>
+            <w:r>
+              <w:rPr>
+                <w:rStyle w:val="VerbatimChar"/>
+              </w:rPr>
+              <w:t xml:space="preserve">crearActuadorRiego()</w:t>
+            </w:r>
+          </w:p>
+        </w:tc>
+      </w:tr>
+      <w:tr>
+        <w:tc>
+          <w:tcPr/>
+          <w:p>
+            <w:pPr>
+              <w:pStyle w:val="Compact"/>
+            </w:pPr>
+            <w:r>
+              <w:t xml:space="preserve">Fábricas concretas</w:t>
+            </w:r>
+          </w:p>
+        </w:tc>
+        <w:tc>
+          <w:tcPr/>
+          <w:p>
+            <w:pPr>
+              <w:pStyle w:val="Compact"/>
+            </w:pPr>
+            <w:r>
+              <w:rPr>
+                <w:rStyle w:val="VerbatimChar"/>
+              </w:rPr>
+              <w:t xml:space="preserve">FabricaInvernadero.java</w:t>
+            </w:r>
+            <w:r>
+              <w:t xml:space="preserve"> </w:t>
+            </w:r>
+            <w:r>
+              <w:t xml:space="preserve">·</w:t>
+            </w:r>
+            <w:r>
+              <w:t xml:space="preserve"> </w:t>
+            </w:r>
+            <w:r>
+              <w:rPr>
+                <w:rStyle w:val="VerbatimChar"/>
+              </w:rPr>
+              <w:t xml:space="preserve">FabricaCampoAbierto.java</w:t>
+            </w:r>
+          </w:p>
+        </w:tc>
+      </w:tr>
+      <w:tr>
+        <w:tc>
+          <w:tcPr/>
+          <w:p>
+            <w:pPr>
+              <w:pStyle w:val="Compact"/>
+            </w:pPr>
+            <w:r>
+              <w:t xml:space="preserve">Productos abstractos</w:t>
+            </w:r>
+          </w:p>
+        </w:tc>
+        <w:tc>
+          <w:tcPr/>
+          <w:p>
+            <w:pPr>
+              <w:pStyle w:val="Compact"/>
+            </w:pPr>
+            <w:r>
+              <w:rPr>
+                <w:rStyle w:val="VerbatimChar"/>
+              </w:rPr>
+              <w:t xml:space="preserve">Sensor</w:t>
+            </w:r>
+            <w:r>
+              <w:t xml:space="preserve"> </w:t>
+            </w:r>
+            <w:r>
+              <w:t xml:space="preserve">(de la Semana 4) ·</w:t>
+            </w:r>
+            <w:r>
+              <w:t xml:space="preserve"> </w:t>
+            </w:r>
+            <w:r>
+              <w:rPr>
+                <w:rStyle w:val="VerbatimChar"/>
+              </w:rPr>
+              <w:t xml:space="preserve">ActuadorRiego.java</w:t>
+            </w:r>
+          </w:p>
+        </w:tc>
+      </w:tr>
+      <w:tr>
+        <w:tc>
+          <w:tcPr/>
+          <w:p>
+            <w:pPr>
+              <w:pStyle w:val="Compact"/>
+            </w:pPr>
+            <w:r>
+              <w:t xml:space="preserve">Productos concretos, familia invernadero</w:t>
+            </w:r>
+          </w:p>
+        </w:tc>
+        <w:tc>
+          <w:tcPr/>
+          <w:p>
+            <w:pPr>
+              <w:pStyle w:val="Compact"/>
+            </w:pPr>
+            <w:r>
+              <w:rPr>
+                <w:rStyle w:val="VerbatimChar"/>
+              </w:rPr>
+              <w:t xml:space="preserve">SensorHumedadInvernadero.java</w:t>
+            </w:r>
+            <w:r>
+              <w:t xml:space="preserve"> </w:t>
+            </w:r>
+            <w:r>
+              <w:t xml:space="preserve">·</w:t>
+            </w:r>
+            <w:r>
+              <w:t xml:space="preserve"> </w:t>
+            </w:r>
+            <w:r>
+              <w:rPr>
+                <w:rStyle w:val="VerbatimChar"/>
+              </w:rPr>
+              <w:t xml:space="preserve">SensorTemperaturaInvernadero.java</w:t>
+            </w:r>
+            <w:r>
+              <w:t xml:space="preserve"> </w:t>
+            </w:r>
+            <w:r>
+              <w:t xml:space="preserve">·</w:t>
+            </w:r>
+            <w:r>
+              <w:t xml:space="preserve"> </w:t>
+            </w:r>
+            <w:r>
+              <w:rPr>
+                <w:rStyle w:val="VerbatimChar"/>
+              </w:rPr>
+              <w:t xml:space="preserve">RiegoGoteo.java</w:t>
+            </w:r>
+          </w:p>
+        </w:tc>
+      </w:tr>
+      <w:tr>
+        <w:tc>
+          <w:tcPr/>
+          <w:p>
+            <w:pPr>
+              <w:pStyle w:val="Compact"/>
+            </w:pPr>
+            <w:r>
+              <w:t xml:space="preserve">Productos concretos, familia campo abierto</w:t>
+            </w:r>
+          </w:p>
+        </w:tc>
+        <w:tc>
+          <w:tcPr/>
+          <w:p>
+            <w:pPr>
+              <w:pStyle w:val="Compact"/>
+            </w:pPr>
+            <w:r>
+              <w:rPr>
+                <w:rStyle w:val="VerbatimChar"/>
+              </w:rPr>
+              <w:t xml:space="preserve">SensorHumedadCampo.java</w:t>
+            </w:r>
+            <w:r>
+              <w:t xml:space="preserve"> </w:t>
+            </w:r>
+            <w:r>
+              <w:t xml:space="preserve">·</w:t>
+            </w:r>
+            <w:r>
+              <w:t xml:space="preserve"> </w:t>
+            </w:r>
+            <w:r>
+              <w:rPr>
+                <w:rStyle w:val="VerbatimChar"/>
+              </w:rPr>
+              <w:t xml:space="preserve">SensorTemperaturaCampo.java</w:t>
+            </w:r>
+            <w:r>
+              <w:t xml:space="preserve"> </w:t>
+            </w:r>
+            <w:r>
+              <w:t xml:space="preserve">·</w:t>
+            </w:r>
+            <w:r>
+              <w:t xml:space="preserve"> </w:t>
+            </w:r>
+            <w:r>
+              <w:rPr>
+                <w:rStyle w:val="VerbatimChar"/>
+              </w:rPr>
+              <w:t xml:space="preserve">RiegoAspersor.java</w:t>
+            </w:r>
+          </w:p>
+        </w:tc>
+      </w:tr>
+      <w:tr>
+        <w:tc>
+          <w:tcPr/>
+          <w:p>
+            <w:pPr>
+              <w:pStyle w:val="Compact"/>
+            </w:pPr>
+            <w:r>
+              <w:t xml:space="preserve">Cliente</w:t>
+            </w:r>
+          </w:p>
+        </w:tc>
+        <w:tc>
+          <w:tcPr/>
+          <w:p>
+            <w:pPr>
+              <w:pStyle w:val="Compact"/>
+            </w:pPr>
+            <w:r>
+              <w:rPr>
+                <w:rStyle w:val="VerbatimChar"/>
+              </w:rPr>
+              <w:t xml:space="preserve">EstacionMonitoreo.java</w:t>
+            </w:r>
+            <w:r>
+              <w:t xml:space="preserve"> </w:t>
+            </w:r>
+            <w:r>
+              <w:t xml:space="preserve">— recibe una fábrica y arma la estación</w:t>
+            </w:r>
+          </w:p>
+        </w:tc>
+      </w:tr>
+    </w:tbl>
+    <w:p>
+      <w:pPr>
+        <w:pStyle w:val="BodyText"/>
+      </w:pPr>
+      <w:r>
+        <w:t xml:space="preserve">Lo que garantiza la coherencia es el tipo:</w:t>
+      </w:r>
+      <w:r>
+        <w:t xml:space="preserve"> </w:t>
+      </w:r>
+      <w:r>
+        <w:rPr>
+          <w:rStyle w:val="VerbatimChar"/>
+        </w:rPr>
+        <w:t xml:space="preserve">EstacionMonitoreo</w:t>
+      </w:r>
+      <w:r>
+        <w:t xml:space="preserve"> </w:t>
+      </w:r>
+      <w:r>
+        <w:t xml:space="preserve">recibe</w:t>
+      </w:r>
+      <w:r>
+        <w:t xml:space="preserve"> </w:t>
+      </w:r>
+      <w:r>
+        <w:rPr>
+          <w:i/>
+          <w:iCs/>
+        </w:rPr>
+        <w:t xml:space="preserve">una</w:t>
+      </w:r>
+      <w:r>
+        <w:t xml:space="preserve"> </w:t>
+      </w:r>
+      <w:r>
+        <w:rPr>
+          <w:rStyle w:val="VerbatimChar"/>
+        </w:rPr>
+        <w:t xml:space="preserve">FabricaEquipamiento</w:t>
+      </w:r>
+      <w:r>
+        <w:t xml:space="preserve"> </w:t>
+      </w:r>
+      <w:r>
+        <w:t xml:space="preserve">y le pide todas las piezas a ella. Como</w:t>
+      </w:r>
+      <w:r>
+        <w:t xml:space="preserve"> </w:t>
+      </w:r>
+      <w:r>
+        <w:rPr>
+          <w:rStyle w:val="VerbatimChar"/>
+        </w:rPr>
+        <w:t xml:space="preserve">FabricaInvernadero</w:t>
+      </w:r>
+      <w:r>
+        <w:t xml:space="preserve"> </w:t>
+      </w:r>
+      <w:r>
+        <w:t xml:space="preserve">solo sabe fabricar productos de</w:t>
+      </w:r>
+      <w:r>
+        <w:t xml:space="preserve"> </w:t>
+      </w:r>
+      <w:r>
+        <w:t xml:space="preserve">invernadero, la mezcla es imposible por construcción. El cliente no contiene ningún</w:t>
+      </w:r>
+      <w:r>
+        <w:t xml:space="preserve"> </w:t>
+      </w:r>
+      <w:r>
+        <w:rPr>
+          <w:rStyle w:val="VerbatimChar"/>
+        </w:rPr>
+        <w:t xml:space="preserve">new</w:t>
+      </w:r>
+      <w:r>
+        <w:t xml:space="preserve"> </w:t>
+      </w:r>
+      <w:r>
+        <w:t xml:space="preserve">de clase</w:t>
+      </w:r>
+      <w:r>
+        <w:t xml:space="preserve"> </w:t>
+      </w:r>
+      <w:r>
+        <w:t xml:space="preserve">concreta ni ningún</w:t>
+      </w:r>
+      <w:r>
+        <w:t xml:space="preserve"> </w:t>
+      </w:r>
+      <w:r>
+        <w:rPr>
+          <w:rStyle w:val="VerbatimChar"/>
+        </w:rPr>
+        <w:t xml:space="preserve">if</w:t>
+      </w:r>
+      <w:r>
+        <w:t xml:space="preserve"> </w:t>
+      </w:r>
+      <w:r>
+        <w:t xml:space="preserve">por zona; cambiar de invernadero a campo abierto es cambiar el objeto</w:t>
+      </w:r>
+      <w:r>
+        <w:t xml:space="preserve"> </w:t>
+      </w:r>
+      <w:r>
+        <w:t xml:space="preserve">fábrica que se le pasa.</w:t>
+      </w:r>
+    </w:p>
+    <w:p>
+      <w:pPr>
+        <w:pStyle w:val="BodyText"/>
+      </w:pPr>
+      <w:r>
+        <w:rPr>
+          <w:rStyle w:val="VerbatimChar"/>
+        </w:rPr>
+        <w:t xml:space="preserve">ActuadorRiego</w:t>
+      </w:r>
+      <w:r>
+        <w:t xml:space="preserve"> </w:t>
+      </w:r>
+      <w:r>
+        <w:t xml:space="preserve">es el</w:t>
+      </w:r>
+      <w:r>
+        <w:t xml:space="preserve"> </w:t>
+      </w:r>
+      <w:r>
+        <w:rPr>
+          <w:i/>
+          <w:iCs/>
+        </w:rPr>
+        <w:t xml:space="preserve">dispositivo</w:t>
+      </w:r>
+      <w:r>
+        <w:t xml:space="preserve"> </w:t>
+      </w:r>
+      <w:r>
+        <w:t xml:space="preserve">que aplica el agua. La</w:t>
+      </w:r>
+      <w:r>
+        <w:t xml:space="preserve"> </w:t>
+      </w:r>
+      <w:r>
+        <w:rPr>
+          <w:i/>
+          <w:iCs/>
+        </w:rPr>
+        <w:t xml:space="preserve">decisión</w:t>
+      </w:r>
+      <w:r>
+        <w:t xml:space="preserve"> </w:t>
+      </w:r>
+      <w:r>
+        <w:t xml:space="preserve">de cuándo regar no está aquí:</w:t>
+      </w:r>
+      <w:r>
+        <w:t xml:space="preserve"> </w:t>
+      </w:r>
+      <w:r>
+        <w:t xml:space="preserve">esa lógica pertenece al módulo de riego y será el tema del patrón Strategy.</w:t>
+      </w:r>
+    </w:p>
+    <w:p>
+      <w:r>
+        <w:pict>
+          <v:rect style="width:0;height:1.5pt" o:hralign="center" o:hrstd="t" o:hr="t"/>
+        </w:pict>
+      </w:r>
+    </w:p>
+    <w:p>
+      <w:pPr>
+        <w:pStyle w:val="Heading2"/>
+      </w:pPr>
+      <w:r>
+        <w:t xml:space="preserve">Parte 2 — Prototype: plantillas de lote</w:t>
+      </w:r>
+    </w:p>
+    <w:p>
+      <w:pPr>
+        <w:pStyle w:val="Heading3"/>
+      </w:pPr>
+      <w:r>
+        <w:t xml:space="preserve">El problema</w:t>
+      </w:r>
+    </w:p>
+    <w:p>
+      <w:pPr>
+        <w:pStyle w:val="FirstParagraph"/>
+      </w:pPr>
+      <w:r>
+        <w:t xml:space="preserve">Una finca cafetera tiene decenas de lotes casi idénticos: mismo cultivo, mismos umbrales, mismo</w:t>
+      </w:r>
+      <w:r>
+        <w:t xml:space="preserve"> </w:t>
+      </w:r>
+      <w:r>
+        <w:t xml:space="preserve">equipamiento; solo cambian el nombre y el área. Armar cada lote desde cero significa repetir cada</w:t>
+      </w:r>
+      <w:r>
+        <w:t xml:space="preserve"> </w:t>
+      </w:r>
+      <w:r>
+        <w:t xml:space="preserve">vez la misma secuencia: crear los umbrales, elegir la fábrica, equipar. Si un día cambia la</w:t>
+      </w:r>
+      <w:r>
+        <w:t xml:space="preserve"> </w:t>
+      </w:r>
+      <w:r>
+        <w:t xml:space="preserve">plantilla —otro umbral de humedad, un sensor más—, hay que buscar todos los sitios donde se armó un</w:t>
+      </w:r>
+      <w:r>
+        <w:t xml:space="preserve"> </w:t>
+      </w:r>
+      <w:r>
+        <w:t xml:space="preserve">lote.</w:t>
+      </w:r>
+    </w:p>
+    <w:p>
+      <w:pPr>
+        <w:pStyle w:val="BodyText"/>
+      </w:pPr>
+      <w:r>
+        <w:t xml:space="preserve">Además,</w:t>
+      </w:r>
+      <w:r>
+        <w:t xml:space="preserve"> </w:t>
+      </w:r>
+      <w:r>
+        <w:rPr>
+          <w:rStyle w:val="VerbatimChar"/>
+        </w:rPr>
+        <w:t xml:space="preserve">Lote</w:t>
+      </w:r>
+      <w:r>
+        <w:t xml:space="preserve"> </w:t>
+      </w:r>
+      <w:r>
+        <w:t xml:space="preserve">contiene objetos anidados mutables. Copiarlo</w:t>
+      </w:r>
+      <w:r>
+        <w:t xml:space="preserve"> </w:t>
+      </w:r>
+      <w:r>
+        <w:t xml:space="preserve">“a mano”</w:t>
+      </w:r>
+      <w:r>
+        <w:t xml:space="preserve"> </w:t>
+      </w:r>
+      <w:r>
+        <w:t xml:space="preserve">con</w:t>
+      </w:r>
+      <w:r>
+        <w:t xml:space="preserve"> </w:t>
+      </w:r>
+      <w:r>
+        <w:rPr>
+          <w:rStyle w:val="VerbatimChar"/>
+        </w:rPr>
+        <w:t xml:space="preserve">new Lote(...)</w:t>
+      </w:r>
+      <w:r>
+        <w:t xml:space="preserve"> </w:t>
+      </w:r>
+      <w:r>
+        <w:t xml:space="preserve">pasando</w:t>
+      </w:r>
+      <w:r>
+        <w:t xml:space="preserve"> </w:t>
+      </w:r>
+      <w:r>
+        <w:t xml:space="preserve">los mismos umbrales produce dos lotes que</w:t>
+      </w:r>
+      <w:r>
+        <w:t xml:space="preserve"> </w:t>
+      </w:r>
+      <w:r>
+        <w:rPr>
+          <w:b/>
+          <w:bCs/>
+        </w:rPr>
+        <w:t xml:space="preserve">comparten</w:t>
+      </w:r>
+      <w:r>
+        <w:t xml:space="preserve"> </w:t>
+      </w:r>
+      <w:r>
+        <w:t xml:space="preserve">el objeto de umbrales: cambiar el de uno</w:t>
+      </w:r>
+      <w:r>
+        <w:t xml:space="preserve"> </w:t>
+      </w:r>
+      <w:r>
+        <w:t xml:space="preserve">cambia el del otro. Es un error silencioso que solo aparece en producción.</w:t>
+      </w:r>
+    </w:p>
+    <w:p>
+      <w:pPr>
+        <w:pStyle w:val="Heading3"/>
+      </w:pPr>
+      <w:r>
+        <w:t xml:space="preserve">Qué es el Prototype</w:t>
+      </w:r>
+    </w:p>
+    <w:p>
+      <w:pPr>
+        <w:pStyle w:val="FirstParagraph"/>
+      </w:pPr>
+      <w:r>
+        <w:t xml:space="preserve">Es un patrón creacional. Su intención, según el GoF, es especificar los tipos de objetos a crear</w:t>
+      </w:r>
+      <w:r>
+        <w:t xml:space="preserve"> </w:t>
+      </w:r>
+      <w:r>
+        <w:t xml:space="preserve">usando una instancia prototípica, y crear nuevos objetos copiando ese prototipo. Sus roles son el</w:t>
+      </w:r>
+      <w:r>
+        <w:t xml:space="preserve"> </w:t>
+      </w:r>
+      <w:r>
+        <w:rPr>
+          <w:b/>
+          <w:bCs/>
+        </w:rPr>
+        <w:t xml:space="preserve">prototipo</w:t>
+      </w:r>
+      <w:r>
+        <w:t xml:space="preserve"> </w:t>
+      </w:r>
+      <w:r>
+        <w:t xml:space="preserve">(declara la operación de clonado), los</w:t>
+      </w:r>
+      <w:r>
+        <w:t xml:space="preserve"> </w:t>
+      </w:r>
+      <w:r>
+        <w:rPr>
+          <w:b/>
+          <w:bCs/>
+        </w:rPr>
+        <w:t xml:space="preserve">prototipos concretos</w:t>
+      </w:r>
+      <w:r>
+        <w:t xml:space="preserve"> </w:t>
+      </w:r>
+      <w:r>
+        <w:t xml:space="preserve">(la implementan) y el</w:t>
+      </w:r>
+      <w:r>
+        <w:t xml:space="preserve"> </w:t>
+      </w:r>
+      <w:r>
+        <w:rPr>
+          <w:b/>
+          <w:bCs/>
+        </w:rPr>
+        <w:t xml:space="preserve">cliente</w:t>
+      </w:r>
+      <w:r>
+        <w:t xml:space="preserve">, que crea objetos pidiéndole al prototipo que se clone. Es habitual acompañarlo de un</w:t>
+      </w:r>
+      <w:r>
+        <w:t xml:space="preserve"> </w:t>
+      </w:r>
+      <w:r>
+        <w:rPr>
+          <w:b/>
+          <w:bCs/>
+        </w:rPr>
+        <w:t xml:space="preserve">registro</w:t>
+      </w:r>
+      <w:r>
+        <w:t xml:space="preserve"> </w:t>
+      </w:r>
+      <w:r>
+        <w:t xml:space="preserve">que guarda las plantillas bajo una clave.</w:t>
+      </w:r>
+    </w:p>
+    <w:p>
+      <w:pPr>
+        <w:pStyle w:val="BodyText"/>
+      </w:pPr>
+      <w:r>
+        <w:t xml:space="preserve">El punto técnico del patrón es la diferencia entre</w:t>
+      </w:r>
+      <w:r>
+        <w:t xml:space="preserve"> </w:t>
+      </w:r>
+      <w:r>
+        <w:rPr>
+          <w:b/>
+          <w:bCs/>
+        </w:rPr>
+        <w:t xml:space="preserve">copia superficial</w:t>
+      </w:r>
+      <w:r>
+        <w:t xml:space="preserve"> </w:t>
+      </w:r>
+      <w:r>
+        <w:t xml:space="preserve">y</w:t>
+      </w:r>
+      <w:r>
+        <w:t xml:space="preserve"> </w:t>
+      </w:r>
+      <w:r>
+        <w:rPr>
+          <w:b/>
+          <w:bCs/>
+        </w:rPr>
+        <w:t xml:space="preserve">copia profunda</w:t>
+      </w:r>
+      <w:r>
+        <w:t xml:space="preserve">. La</w:t>
+      </w:r>
+      <w:r>
+        <w:t xml:space="preserve"> </w:t>
+      </w:r>
+      <w:r>
+        <w:t xml:space="preserve">superficial copia los campos tal cual: los primitivos quedan independientes, pero los objetos</w:t>
+      </w:r>
+      <w:r>
+        <w:t xml:space="preserve"> </w:t>
+      </w:r>
+      <w:r>
+        <w:t xml:space="preserve">anidados quedan compartidos. La profunda duplica también lo anidado que sea mutable.</w:t>
+      </w:r>
+    </w:p>
+    <w:p>
+      <w:pPr>
+        <w:pStyle w:val="Heading3"/>
+      </w:pPr>
+      <w:r>
+        <w:t xml:space="preserve">Cómo lo aplicamos</w:t>
+      </w:r>
+    </w:p>
+    <w:tbl>
+      <w:tblPr>
+        <w:tblStyle w:val="Table"/>
+        <w:tblW w:type="pct" w:w="5000"/>
+        <w:tblLayout w:type="fixed"/>
+        <w:tblLook w:firstRow="1" w:lastRow="0" w:firstColumn="0" w:lastColumn="0" w:noHBand="0" w:noVBand="0" w:val="0020"/>
+      </w:tblPr>
+      <w:tblGrid>
+        <w:gridCol w:w="3960"/>
+        <w:gridCol w:w="3960"/>
+      </w:tblGrid>
+      <w:tr>
+        <w:trPr>
+          <w:tblHeader w:val="on"/>
+        </w:trPr>
+        <w:tc>
+          <w:tcPr/>
+          <w:p>
+            <w:pPr>
+              <w:pStyle w:val="Compact"/>
+            </w:pPr>
+            <w:r>
+              <w:t xml:space="preserve">Rol en el patrón</w:t>
+            </w:r>
+          </w:p>
+        </w:tc>
+        <w:tc>
+          <w:tcPr/>
+          <w:p>
+            <w:pPr>
+              <w:pStyle w:val="Compact"/>
+            </w:pPr>
+            <w:r>
+              <w:t xml:space="preserve">Clases</w:t>
+            </w:r>
+          </w:p>
+        </w:tc>
+      </w:tr>
+      <w:tr>
+        <w:tc>
+          <w:tcPr/>
+          <w:p>
+            <w:pPr>
+              <w:pStyle w:val="Compact"/>
+            </w:pPr>
+            <w:r>
+              <w:t xml:space="preserve">Prototipo</w:t>
+            </w:r>
+          </w:p>
+        </w:tc>
+        <w:tc>
+          <w:tcPr/>
+          <w:p>
+            <w:pPr>
+              <w:pStyle w:val="Compact"/>
+            </w:pPr>
+            <w:r>
+              <w:rPr>
+                <w:rStyle w:val="VerbatimChar"/>
+              </w:rPr>
+              <w:t xml:space="preserve">Lote.java</w:t>
+            </w:r>
+            <w:r>
+              <w:t xml:space="preserve"> </w:t>
+            </w:r>
+            <w:r>
+              <w:t xml:space="preserve">—</w:t>
+            </w:r>
+            <w:r>
+              <w:t xml:space="preserve"> </w:t>
+            </w:r>
+            <w:r>
+              <w:rPr>
+                <w:rStyle w:val="VerbatimChar"/>
+              </w:rPr>
+              <w:t xml:space="preserve">implements Cloneable</w:t>
+            </w:r>
+            <w:r>
+              <w:t xml:space="preserve">, sobreescribe</w:t>
+            </w:r>
+            <w:r>
+              <w:t xml:space="preserve"> </w:t>
+            </w:r>
+            <w:r>
+              <w:rPr>
+                <w:rStyle w:val="VerbatimChar"/>
+              </w:rPr>
+              <w:t xml:space="preserve">clone()</w:t>
+            </w:r>
+          </w:p>
+        </w:tc>
+      </w:tr>
+      <w:tr>
+        <w:tc>
+          <w:tcPr/>
+          <w:p>
+            <w:pPr>
+              <w:pStyle w:val="Compact"/>
+            </w:pPr>
+            <w:r>
+              <w:t xml:space="preserve">Parte mutable anidada</w:t>
+            </w:r>
+          </w:p>
+        </w:tc>
+        <w:tc>
+          <w:tcPr/>
+          <w:p>
+            <w:pPr>
+              <w:pStyle w:val="Compact"/>
+            </w:pPr>
+            <w:r>
+              <w:rPr>
+                <w:rStyle w:val="VerbatimChar"/>
+              </w:rPr>
+              <w:t xml:space="preserve">UmbralesLote.java</w:t>
+            </w:r>
+            <w:r>
+              <w:t xml:space="preserve"> </w:t>
+            </w:r>
+            <w:r>
+              <w:t xml:space="preserve">— con su propio</w:t>
+            </w:r>
+            <w:r>
+              <w:t xml:space="preserve"> </w:t>
+            </w:r>
+            <w:r>
+              <w:rPr>
+                <w:rStyle w:val="VerbatimChar"/>
+              </w:rPr>
+              <w:t xml:space="preserve">copiar()</w:t>
+            </w:r>
+          </w:p>
+        </w:tc>
+      </w:tr>
+      <w:tr>
+        <w:tc>
+          <w:tcPr/>
+          <w:p>
+            <w:pPr>
+              <w:pStyle w:val="Compact"/>
+            </w:pPr>
+            <w:r>
+              <w:t xml:space="preserve">Registro de prototipos</w:t>
+            </w:r>
+          </w:p>
+        </w:tc>
+        <w:tc>
+          <w:tcPr/>
+          <w:p>
+            <w:pPr>
+              <w:pStyle w:val="Compact"/>
+            </w:pPr>
+            <w:r>
+              <w:rPr>
+                <w:rStyle w:val="VerbatimChar"/>
+              </w:rPr>
+              <w:t xml:space="preserve">CatalogoLotes.java</w:t>
+            </w:r>
+            <w:r>
+              <w:t xml:space="preserve"> </w:t>
+            </w:r>
+            <w:r>
+              <w:t xml:space="preserve">—</w:t>
+            </w:r>
+            <w:r>
+              <w:t xml:space="preserve"> </w:t>
+            </w:r>
+            <w:r>
+              <w:rPr>
+                <w:rStyle w:val="VerbatimChar"/>
+              </w:rPr>
+              <w:t xml:space="preserve">registrar()</w:t>
+            </w:r>
+            <w:r>
+              <w:t xml:space="preserve"> </w:t>
+            </w:r>
+            <w:r>
+              <w:t xml:space="preserve">y</w:t>
+            </w:r>
+            <w:r>
+              <w:t xml:space="preserve"> </w:t>
+            </w:r>
+            <w:r>
+              <w:rPr>
+                <w:rStyle w:val="VerbatimChar"/>
+              </w:rPr>
+              <w:t xml:space="preserve">crear()</w:t>
+            </w:r>
+          </w:p>
+        </w:tc>
+      </w:tr>
+      <w:tr>
+        <w:tc>
+          <w:tcPr/>
+          <w:p>
+            <w:pPr>
+              <w:pStyle w:val="Compact"/>
+            </w:pPr>
+            <w:r>
+              <w:t xml:space="preserve">Cliente</w:t>
+            </w:r>
+          </w:p>
+        </w:tc>
+        <w:tc>
+          <w:tcPr/>
+          <w:p>
+            <w:pPr>
+              <w:pStyle w:val="Compact"/>
+            </w:pPr>
+            <w:r>
+              <w:rPr>
+                <w:rStyle w:val="VerbatimChar"/>
+              </w:rPr>
+              <w:t xml:space="preserve">MainDemoAbstractFactoryPrototype.java</w:t>
+            </w:r>
+          </w:p>
+        </w:tc>
+      </w:tr>
+    </w:tbl>
+    <w:p>
+      <w:pPr>
+        <w:pStyle w:val="BodyText"/>
+      </w:pPr>
+      <w:r>
+        <w:rPr>
+          <w:rStyle w:val="VerbatimChar"/>
+        </w:rPr>
+        <w:t xml:space="preserve">Lote.clone()</w:t>
+      </w:r>
+      <w:r>
+        <w:t xml:space="preserve"> </w:t>
+      </w:r>
+      <w:r>
+        <w:t xml:space="preserve">hace tres cosas: llama a</w:t>
+      </w:r>
+      <w:r>
+        <w:t xml:space="preserve"> </w:t>
+      </w:r>
+      <w:r>
+        <w:rPr>
+          <w:rStyle w:val="VerbatimChar"/>
+        </w:rPr>
+        <w:t xml:space="preserve">super.clone()</w:t>
+      </w:r>
+      <w:r>
+        <w:t xml:space="preserve"> </w:t>
+      </w:r>
+      <w:r>
+        <w:t xml:space="preserve">para obtener la copia superficial, copia</w:t>
+      </w:r>
+      <w:r>
+        <w:t xml:space="preserve"> </w:t>
+      </w:r>
+      <w:r>
+        <w:t xml:space="preserve">aparte los umbrales con</w:t>
+      </w:r>
+      <w:r>
+        <w:t xml:space="preserve"> </w:t>
+      </w:r>
+      <w:r>
+        <w:rPr>
+          <w:rStyle w:val="VerbatimChar"/>
+        </w:rPr>
+        <w:t xml:space="preserve">umbrales.copiar()</w:t>
+      </w:r>
+      <w:r>
+        <w:t xml:space="preserve">, y crea una lista nueva de sensores. El criterio es</w:t>
+      </w:r>
+      <w:r>
+        <w:t xml:space="preserve"> </w:t>
+      </w:r>
+      <w:r>
+        <w:t xml:space="preserve">explícito:</w:t>
+      </w:r>
+      <w:r>
+        <w:t xml:space="preserve"> </w:t>
+      </w:r>
+      <w:r>
+        <w:rPr>
+          <w:b/>
+          <w:bCs/>
+        </w:rPr>
+        <w:t xml:space="preserve">se duplica todo lo que tenga estado mutable</w:t>
+      </w:r>
+      <w:r>
+        <w:t xml:space="preserve">.</w:t>
+      </w:r>
+      <w:r>
+        <w:t xml:space="preserve"> </w:t>
+      </w:r>
+      <w:r>
+        <w:rPr>
+          <w:rStyle w:val="VerbatimChar"/>
+        </w:rPr>
+        <w:t xml:space="preserve">Sensor</w:t>
+      </w:r>
+      <w:r>
+        <w:t xml:space="preserve"> </w:t>
+      </w:r>
+      <w:r>
+        <w:t xml:space="preserve">y</w:t>
+      </w:r>
+      <w:r>
+        <w:t xml:space="preserve"> </w:t>
+      </w:r>
+      <w:r>
+        <w:rPr>
+          <w:rStyle w:val="VerbatimChar"/>
+        </w:rPr>
+        <w:t xml:space="preserve">ActuadorRiego</w:t>
+      </w:r>
+      <w:r>
+        <w:t xml:space="preserve"> </w:t>
+      </w:r>
+      <w:r>
+        <w:t xml:space="preserve">no tienen</w:t>
+      </w:r>
+      <w:r>
+        <w:t xml:space="preserve"> </w:t>
+      </w:r>
+      <w:r>
+        <w:t xml:space="preserve">estado que cambie después de creados, así que compartir esas instancias entre lotes es seguro y</w:t>
+      </w:r>
+      <w:r>
+        <w:t xml:space="preserve"> </w:t>
+      </w:r>
+      <w:r>
+        <w:t xml:space="preserve">evita objetos innecesarios.</w:t>
+      </w:r>
+      <w:r>
+        <w:t xml:space="preserve"> </w:t>
+      </w:r>
+      <w:r>
+        <w:rPr>
+          <w:rStyle w:val="VerbatimChar"/>
+        </w:rPr>
+        <w:t xml:space="preserve">clone()</w:t>
+      </w:r>
+      <w:r>
+        <w:t xml:space="preserve"> </w:t>
+      </w:r>
+      <w:r>
+        <w:t xml:space="preserve">devuelve</w:t>
+      </w:r>
+      <w:r>
+        <w:t xml:space="preserve"> </w:t>
+      </w:r>
+      <w:r>
+        <w:rPr>
+          <w:rStyle w:val="VerbatimChar"/>
+        </w:rPr>
+        <w:t xml:space="preserve">Lote</w:t>
+      </w:r>
+      <w:r>
+        <w:t xml:space="preserve"> </w:t>
+      </w:r>
+      <w:r>
+        <w:t xml:space="preserve">y no</w:t>
+      </w:r>
+      <w:r>
+        <w:t xml:space="preserve"> </w:t>
+      </w:r>
+      <w:r>
+        <w:rPr>
+          <w:rStyle w:val="VerbatimChar"/>
+        </w:rPr>
+        <w:t xml:space="preserve">Object</w:t>
+      </w:r>
+      <w:r>
+        <w:t xml:space="preserve"> </w:t>
+      </w:r>
+      <w:r>
+        <w:t xml:space="preserve">(tipo de retorno covariante)</w:t>
+      </w:r>
+      <w:r>
+        <w:t xml:space="preserve"> </w:t>
+      </w:r>
+      <w:r>
+        <w:t xml:space="preserve">para que el cliente no necesite hacer un</w:t>
+      </w:r>
+      <w:r>
+        <w:t xml:space="preserve"> </w:t>
+      </w:r>
+      <w:r>
+        <w:rPr>
+          <w:i/>
+          <w:iCs/>
+        </w:rPr>
+        <w:t xml:space="preserve">cast</w:t>
+      </w:r>
+      <w:r>
+        <w:t xml:space="preserve">.</w:t>
+      </w:r>
+    </w:p>
+    <w:p>
+      <w:pPr>
+        <w:pStyle w:val="BodyText"/>
+      </w:pPr>
+      <w:r>
+        <w:rPr>
+          <w:rStyle w:val="VerbatimChar"/>
+        </w:rPr>
+        <w:t xml:space="preserve">CatalogoLotes</w:t>
+      </w:r>
+      <w:r>
+        <w:t xml:space="preserve"> </w:t>
+      </w:r>
+      <w:r>
+        <w:t xml:space="preserve">guarda las plantillas en un</w:t>
+      </w:r>
+      <w:r>
+        <w:t xml:space="preserve"> </w:t>
+      </w:r>
+      <w:r>
+        <w:rPr>
+          <w:rStyle w:val="VerbatimChar"/>
+        </w:rPr>
+        <w:t xml:space="preserve">Map</w:t>
+      </w:r>
+      <w:r>
+        <w:t xml:space="preserve"> </w:t>
+      </w:r>
+      <w:r>
+        <w:t xml:space="preserve">y las entrega siempre clonadas con</w:t>
+      </w:r>
+      <w:r>
+        <w:t xml:space="preserve"> </w:t>
+      </w:r>
+      <w:r>
+        <w:rPr>
+          <w:rStyle w:val="VerbatimChar"/>
+        </w:rPr>
+        <w:t xml:space="preserve">crear(clave, nombre, area)</w:t>
+      </w:r>
+      <w:r>
+        <w:t xml:space="preserve">. El cliente nunca toca la plantilla original.</w:t>
+      </w:r>
+    </w:p>
+    <w:p>
+      <w:pPr>
+        <w:pStyle w:val="BodyText"/>
+      </w:pPr>
+      <w:r>
+        <w:t xml:space="preserve">Las dos partes de la semana se encuentran en</w:t>
+      </w:r>
+      <w:r>
+        <w:t xml:space="preserve"> </w:t>
+      </w:r>
+      <w:r>
+        <w:rPr>
+          <w:rStyle w:val="VerbatimChar"/>
+        </w:rPr>
+        <w:t xml:space="preserve">Lote.equipar(FabricaEquipamiento)</w:t>
+      </w:r>
+      <w:r>
+        <w:t xml:space="preserve">: la plantilla se</w:t>
+      </w:r>
+      <w:r>
+        <w:t xml:space="preserve"> </w:t>
+      </w:r>
+      <w:r>
+        <w:t xml:space="preserve">equipa</w:t>
+      </w:r>
+      <w:r>
+        <w:t xml:space="preserve"> </w:t>
+      </w:r>
+      <w:r>
+        <w:rPr>
+          <w:b/>
+          <w:bCs/>
+        </w:rPr>
+        <w:t xml:space="preserve">una sola vez</w:t>
+      </w:r>
+      <w:r>
+        <w:t xml:space="preserve"> </w:t>
+      </w:r>
+      <w:r>
+        <w:t xml:space="preserve">con la fábrica de su zona, y cada clon hereda el equipamiento completo.</w:t>
+      </w:r>
+    </w:p>
+    <w:p>
+      <w:r>
+        <w:pict>
+          <v:rect style="width:0;height:1.5pt" o:hralign="center" o:hrstd="t" o:hr="t"/>
+        </w:pict>
+      </w:r>
+    </w:p>
+    <w:p>
+      <w:pPr>
+        <w:pStyle w:val="Heading2"/>
+      </w:pPr>
+      <w:r>
+        <w:t xml:space="preserve">Evidencias</w:t>
+      </w:r>
+    </w:p>
+    <w:p>
+      <w:pPr>
+        <w:pStyle w:val="FirstParagraph"/>
+      </w:pPr>
+      <w:r>
+        <w:t xml:space="preserve">Estas son las pruebas que ejecutamos sobre el prototipo para comprobar que los dos patrones</w:t>
+      </w:r>
+      <w:r>
+        <w:t xml:space="preserve"> </w:t>
+      </w:r>
+      <w:r>
+        <w:t xml:space="preserve">funcionan como esperábamos. Las tres primeras capturas corresponden al código y las tres últimas a</w:t>
+      </w:r>
+      <w:r>
+        <w:t xml:space="preserve"> </w:t>
+      </w:r>
+      <w:r>
+        <w:t xml:space="preserve">las ejecuciones. La numeración continúa la de las semanas anteriores.</w:t>
+      </w:r>
+    </w:p>
+    <w:p>
+      <w:pPr>
+        <w:pStyle w:val="BodyText"/>
+      </w:pPr>
+      <w:r>
+        <w:t xml:space="preserve">Todo se ejecutó en VS Code sobre Java 17, con el botón</w:t>
+      </w:r>
+      <w:r>
+        <w:t xml:space="preserve"> </w:t>
+      </w:r>
+      <w:r>
+        <w:rPr>
+          <w:i/>
+          <w:iCs/>
+        </w:rPr>
+        <w:t xml:space="preserve">Run</w:t>
+      </w:r>
+      <w:r>
+        <w:t xml:space="preserve"> </w:t>
+      </w:r>
+      <w:r>
+        <w:t xml:space="preserve">de la extensión de Java.</w:t>
+      </w:r>
+    </w:p>
+    <w:tbl>
+      <w:tblPr>
+        <w:tblStyle w:val="Table"/>
+        <w:tblW w:type="pct" w:w="5000"/>
+        <w:tblLayout w:type="fixed"/>
+        <w:tblLook w:firstRow="1" w:lastRow="0" w:firstColumn="0" w:lastColumn="0" w:noHBand="0" w:noVBand="0" w:val="0020"/>
+      </w:tblPr>
+      <w:tblGrid>
+        <w:gridCol w:w="3960"/>
+        <w:gridCol w:w="3960"/>
+      </w:tblGrid>
+      <w:tr>
+        <w:trPr>
+          <w:tblHeader w:val="on"/>
+        </w:trPr>
+        <w:tc>
+          <w:tcPr/>
+          <w:p>
+            <w:pPr>
+              <w:pStyle w:val="Compact"/>
+            </w:pPr>
+            <w:r>
+              <w:t xml:space="preserve">Captura</w:t>
+            </w:r>
+          </w:p>
+        </w:tc>
+        <w:tc>
+          <w:tcPr/>
+          <w:p>
+            <w:pPr>
+              <w:pStyle w:val="Compact"/>
+            </w:pPr>
+            <w:r>
+              <w:t xml:space="preserve">Qué muestra</w:t>
+            </w:r>
+          </w:p>
+        </w:tc>
+      </w:tr>
+      <w:tr>
+        <w:tc>
+          <w:tcPr/>
+          <w:p>
+            <w:pPr>
+              <w:pStyle w:val="Compact"/>
+            </w:pPr>
+            <w:r>
+              <w:t xml:space="preserve">19</w:t>
+            </w:r>
+          </w:p>
+        </w:tc>
+        <w:tc>
+          <w:tcPr/>
+          <w:p>
+            <w:pPr>
+              <w:pStyle w:val="Compact"/>
+            </w:pPr>
+            <w:r>
+              <w:t xml:space="preserve">La fábrica abstracta</w:t>
+            </w:r>
+            <w:r>
+              <w:t xml:space="preserve"> </w:t>
+            </w:r>
+            <w:r>
+              <w:rPr>
+                <w:rStyle w:val="VerbatimChar"/>
+              </w:rPr>
+              <w:t xml:space="preserve">FabricaEquipamiento</w:t>
+            </w:r>
+          </w:p>
+        </w:tc>
+      </w:tr>
+      <w:tr>
+        <w:tc>
+          <w:tcPr/>
+          <w:p>
+            <w:pPr>
+              <w:pStyle w:val="Compact"/>
+            </w:pPr>
+            <w:r>
+              <w:t xml:space="preserve">20</w:t>
+            </w:r>
+          </w:p>
+        </w:tc>
+        <w:tc>
+          <w:tcPr/>
+          <w:p>
+            <w:pPr>
+              <w:pStyle w:val="Compact"/>
+            </w:pPr>
+            <w:r>
+              <w:t xml:space="preserve">El cliente</w:t>
+            </w:r>
+            <w:r>
+              <w:t xml:space="preserve"> </w:t>
+            </w:r>
+            <w:r>
+              <w:rPr>
+                <w:rStyle w:val="VerbatimChar"/>
+              </w:rPr>
+              <w:t xml:space="preserve">EstacionMonitoreo</w:t>
+            </w:r>
+            <w:r>
+              <w:t xml:space="preserve"> </w:t>
+            </w:r>
+            <w:r>
+              <w:t xml:space="preserve">armando la estación sin clases concretas</w:t>
+            </w:r>
+          </w:p>
+        </w:tc>
+      </w:tr>
+      <w:tr>
+        <w:tc>
+          <w:tcPr/>
+          <w:p>
+            <w:pPr>
+              <w:pStyle w:val="Compact"/>
+            </w:pPr>
+            <w:r>
+              <w:t xml:space="preserve">21</w:t>
+            </w:r>
+          </w:p>
+        </w:tc>
+        <w:tc>
+          <w:tcPr/>
+          <w:p>
+            <w:pPr>
+              <w:pStyle w:val="Compact"/>
+            </w:pPr>
+            <w:r>
+              <w:rPr>
+                <w:rStyle w:val="VerbatimChar"/>
+              </w:rPr>
+              <w:t xml:space="preserve">Lote.clone()</w:t>
+            </w:r>
+            <w:r>
+              <w:t xml:space="preserve"> </w:t>
+            </w:r>
+            <w:r>
+              <w:t xml:space="preserve">con la copia profunda</w:t>
+            </w:r>
+          </w:p>
+        </w:tc>
+      </w:tr>
+      <w:tr>
+        <w:tc>
+          <w:tcPr/>
+          <w:p>
+            <w:pPr>
+              <w:pStyle w:val="Compact"/>
+            </w:pPr>
+            <w:r>
+              <w:t xml:space="preserve">22</w:t>
+            </w:r>
+          </w:p>
+        </w:tc>
+        <w:tc>
+          <w:tcPr/>
+          <w:p>
+            <w:pPr>
+              <w:pStyle w:val="Compact"/>
+            </w:pPr>
+            <w:r>
+              <w:t xml:space="preserve">Pruebas 1 a 3: las dos familias y el cliente que no cambia</w:t>
+            </w:r>
+          </w:p>
+        </w:tc>
+      </w:tr>
+      <w:tr>
+        <w:tc>
+          <w:tcPr/>
+          <w:p>
+            <w:pPr>
+              <w:pStyle w:val="Compact"/>
+            </w:pPr>
+            <w:r>
+              <w:t xml:space="preserve">23</w:t>
+            </w:r>
+          </w:p>
+        </w:tc>
+        <w:tc>
+          <w:tcPr/>
+          <w:p>
+            <w:pPr>
+              <w:pStyle w:val="Compact"/>
+            </w:pPr>
+            <w:r>
+              <w:t xml:space="preserve">Pruebas 4 y 5: clones desde la plantilla y copia profunda</w:t>
+            </w:r>
+          </w:p>
+        </w:tc>
+      </w:tr>
+      <w:tr>
+        <w:tc>
+          <w:tcPr/>
+          <w:p>
+            <w:pPr>
+              <w:pStyle w:val="Compact"/>
+            </w:pPr>
+            <w:r>
+              <w:t xml:space="preserve">24</w:t>
+            </w:r>
+          </w:p>
+        </w:tc>
+        <w:tc>
+          <w:tcPr/>
+          <w:p>
+            <w:pPr>
+              <w:pStyle w:val="Compact"/>
+            </w:pPr>
+            <w:r>
+              <w:t xml:space="preserve">Pruebas 6 y 7: cada clon opera con lo suyo; plantilla inexistente</w:t>
+            </w:r>
+          </w:p>
+        </w:tc>
+      </w:tr>
+    </w:tbl>
+    <w:p>
+      <w:r>
+        <w:pict>
+          <v:rect style="width:0;height:1.5pt" o:hralign="center" o:hrstd="t" o:hr="t"/>
+        </w:pict>
+      </w:r>
+    </w:p>
+    <w:p>
+      <w:pPr>
+        <w:pStyle w:val="Heading3"/>
+      </w:pPr>
+      <w:r>
+        <w:t xml:space="preserve">Captura 19 — La fábrica abstracta</w:t>
+      </w:r>
+    </w:p>
+    <w:p>
+      <w:pPr>
+        <w:pStyle w:val="CaptionedFigure"/>
+      </w:pPr>
+      <w:r>
+        <w:drawing>
+          <wp:inline>
+            <wp:extent cx="5334000" cy="2043606"/>
+            <wp:effectExtent b="0" l="0" r="0" t="0"/>
+            <wp:docPr descr="Captura 19" title="" id="64" name="Picture"/>
+            <a:graphic>
+              <a:graphicData uri="http://schemas.openxmlformats.org/drawingml/2006/picture">
+                <pic:pic>
+                  <pic:nvPicPr>
+                    <pic:cNvPr descr="semana-6-abstract-factory-prototype/evidencias/captura_19.png" id="65" name="Picture"/>
+                    <pic:cNvPicPr>
+                      <a:picLocks noChangeArrowheads="1" noChangeAspect="1"/>
+                    </pic:cNvPicPr>
+                  </pic:nvPicPr>
+                  <pic:blipFill>
+                    <a:blip r:embed="rId63"/>
+                    <a:stretch>
+                      <a:fillRect/>
+                    </a:stretch>
+                  </pic:blipFill>
+                  <pic:spPr bwMode="auto">
+                    <a:xfrm>
+                      <a:off x="0" y="0"/>
+                      <a:ext cx="5334000" cy="2043606"/>
+                    </a:xfrm>
+                    <a:prstGeom prst="rect">
+                      <a:avLst/>
+                    </a:prstGeom>
+                    <a:noFill/>
+                    <a:ln w="9525">
+                      <a:noFill/>
+                      <a:headEnd/>
+                      <a:tailEnd/>
+                    </a:ln>
+                  </pic:spPr>
+                </pic:pic>
+              </a:graphicData>
+            </a:graphic>
+          </wp:inline>
+        </w:drawing>
+      </w:r>
+    </w:p>
+    <w:p>
+      <w:pPr>
+        <w:pStyle w:val="ImageCaption"/>
+      </w:pPr>
+      <w:r>
+        <w:t xml:space="preserve">Captura 19</w:t>
+      </w:r>
+    </w:p>
+    <w:p>
+      <w:pPr>
+        <w:pStyle w:val="BodyText"/>
+      </w:pPr>
+      <w:r>
+        <w:rPr>
+          <w:b/>
+          <w:bCs/>
+        </w:rPr>
+        <w:t xml:space="preserve">Archivo:</w:t>
+      </w:r>
+      <w:r>
+        <w:t xml:space="preserve"> </w:t>
+      </w:r>
+      <w:r>
+        <w:rPr>
+          <w:rStyle w:val="VerbatimChar"/>
+        </w:rPr>
+        <w:t xml:space="preserve">src/FabricaEquipamiento.java</w:t>
+      </w:r>
+      <w:r>
+        <w:t xml:space="preserve"> </w:t>
+      </w:r>
+      <w:r>
+        <w:t xml:space="preserve">·</w:t>
+      </w:r>
+      <w:r>
+        <w:t xml:space="preserve"> </w:t>
+      </w:r>
+      <w:r>
+        <w:rPr>
+          <w:b/>
+          <w:bCs/>
+        </w:rPr>
+        <w:t xml:space="preserve">Líneas:</w:t>
+      </w:r>
+      <w:r>
+        <w:t xml:space="preserve"> </w:t>
+      </w:r>
+      <w:r>
+        <w:t xml:space="preserve">13 a 23</w:t>
+      </w:r>
+    </w:p>
+    <w:p>
+      <w:pPr>
+        <w:pStyle w:val="BodyText"/>
+      </w:pPr>
+      <w:r>
+        <w:t xml:space="preserve">Un método de creación por cada producto de la familia. Devuelven las interfaces</w:t>
+      </w:r>
+      <w:r>
+        <w:t xml:space="preserve"> </w:t>
+      </w:r>
+      <w:r>
+        <w:rPr>
+          <w:rStyle w:val="VerbatimChar"/>
+        </w:rPr>
+        <w:t xml:space="preserve">Sensor</w:t>
+      </w:r>
+      <w:r>
+        <w:t xml:space="preserve"> </w:t>
+      </w:r>
+      <w:r>
+        <w:t xml:space="preserve">y</w:t>
+      </w:r>
+      <w:r>
+        <w:t xml:space="preserve"> </w:t>
+      </w:r>
+      <w:r>
+        <w:rPr>
+          <w:rStyle w:val="VerbatimChar"/>
+        </w:rPr>
+        <w:t xml:space="preserve">ActuadorRiego</w:t>
+      </w:r>
+      <w:r>
+        <w:t xml:space="preserve">, nunca una clase concreta. Cada fábrica concreta implementa los tres devolviendo</w:t>
+      </w:r>
+      <w:r>
+        <w:t xml:space="preserve"> </w:t>
+      </w:r>
+      <w:r>
+        <w:t xml:space="preserve">productos de su propia familia.</w:t>
+      </w:r>
+    </w:p>
+    <w:p>
+      <w:pPr>
+        <w:pStyle w:val="Heading3"/>
+      </w:pPr>
+      <w:r>
+        <w:t xml:space="preserve">Captura 20 — El cliente</w:t>
+      </w:r>
+    </w:p>
+    <w:p>
+      <w:pPr>
+        <w:pStyle w:val="CaptionedFigure"/>
+      </w:pPr>
+      <w:r>
+        <w:drawing>
+          <wp:inline>
+            <wp:extent cx="5334000" cy="1149703"/>
+            <wp:effectExtent b="0" l="0" r="0" t="0"/>
+            <wp:docPr descr="Captura 20" title="" id="67" name="Picture"/>
+            <a:graphic>
+              <a:graphicData uri="http://schemas.openxmlformats.org/drawingml/2006/picture">
+                <pic:pic>
+                  <pic:nvPicPr>
+                    <pic:cNvPr descr="semana-6-abstract-factory-prototype/evidencias/captura_20.png" id="68" name="Picture"/>
+                    <pic:cNvPicPr>
+                      <a:picLocks noChangeArrowheads="1" noChangeAspect="1"/>
+                    </pic:cNvPicPr>
+                  </pic:nvPicPr>
+                  <pic:blipFill>
+                    <a:blip r:embed="rId66"/>
+                    <a:stretch>
+                      <a:fillRect/>
+                    </a:stretch>
+                  </pic:blipFill>
+                  <pic:spPr bwMode="auto">
+                    <a:xfrm>
+                      <a:off x="0" y="0"/>
+                      <a:ext cx="5334000" cy="1149703"/>
+                    </a:xfrm>
+                    <a:prstGeom prst="rect">
+                      <a:avLst/>
+                    </a:prstGeom>
+                    <a:noFill/>
+                    <a:ln w="9525">
+                      <a:noFill/>
+                      <a:headEnd/>
+                      <a:tailEnd/>
+                    </a:ln>
+                  </pic:spPr>
+                </pic:pic>
+              </a:graphicData>
+            </a:graphic>
+          </wp:inline>
+        </w:drawing>
+      </w:r>
+    </w:p>
+    <w:p>
+      <w:pPr>
+        <w:pStyle w:val="ImageCaption"/>
+      </w:pPr>
+      <w:r>
+        <w:t xml:space="preserve">Captura 20</w:t>
+      </w:r>
+    </w:p>
+    <w:p>
+      <w:pPr>
+        <w:pStyle w:val="BodyText"/>
+      </w:pPr>
+      <w:r>
+        <w:rPr>
+          <w:b/>
+          <w:bCs/>
+        </w:rPr>
+        <w:t xml:space="preserve">Archivo:</w:t>
+      </w:r>
+      <w:r>
+        <w:t xml:space="preserve"> </w:t>
+      </w:r>
+      <w:r>
+        <w:rPr>
+          <w:rStyle w:val="VerbatimChar"/>
+        </w:rPr>
+        <w:t xml:space="preserve">src/EstacionMonitoreo.java</w:t>
+      </w:r>
+      <w:r>
+        <w:t xml:space="preserve"> </w:t>
+      </w:r>
+      <w:r>
+        <w:t xml:space="preserve">·</w:t>
+      </w:r>
+      <w:r>
+        <w:t xml:space="preserve"> </w:t>
+      </w:r>
+      <w:r>
+        <w:rPr>
+          <w:b/>
+          <w:bCs/>
+        </w:rPr>
+        <w:t xml:space="preserve">Líneas:</w:t>
+      </w:r>
+      <w:r>
+        <w:t xml:space="preserve"> </w:t>
+      </w:r>
+      <w:r>
+        <w:t xml:space="preserve">19 a 26</w:t>
+      </w:r>
+    </w:p>
+    <w:p>
+      <w:pPr>
+        <w:pStyle w:val="BodyText"/>
+      </w:pPr>
+      <w:r>
+        <w:t xml:space="preserve">El constructor pide cada pieza a la fábrica recibida. No hay</w:t>
+      </w:r>
+      <w:r>
+        <w:t xml:space="preserve"> </w:t>
+      </w:r>
+      <w:r>
+        <w:rPr>
+          <w:rStyle w:val="VerbatimChar"/>
+        </w:rPr>
+        <w:t xml:space="preserve">new SensorHumedadInvernadero()</w:t>
+      </w:r>
+      <w:r>
+        <w:t xml:space="preserve"> </w:t>
+      </w:r>
+      <w:r>
+        <w:t xml:space="preserve">ni</w:t>
+      </w:r>
+      <w:r>
+        <w:t xml:space="preserve"> </w:t>
+      </w:r>
+      <w:r>
+        <w:rPr>
+          <w:rStyle w:val="VerbatimChar"/>
+        </w:rPr>
+        <w:t xml:space="preserve">if (zona...)</w:t>
+      </w:r>
+      <w:r>
+        <w:t xml:space="preserve">: la estación no sabe de qué familia son sus dispositivos, solo que son coherentes</w:t>
+      </w:r>
+      <w:r>
+        <w:t xml:space="preserve"> </w:t>
+      </w:r>
+      <w:r>
+        <w:t xml:space="preserve">entre sí porque todos salieron de la misma fábrica.</w:t>
+      </w:r>
+    </w:p>
+    <w:p>
+      <w:pPr>
+        <w:pStyle w:val="Heading3"/>
+      </w:pPr>
+      <w:r>
+        <w:t xml:space="preserve">Captura 21 —</w:t>
+      </w:r>
+      <w:r>
+        <w:t xml:space="preserve"> </w:t>
+      </w:r>
+      <w:r>
+        <w:rPr>
+          <w:rStyle w:val="VerbatimChar"/>
+        </w:rPr>
+        <w:t xml:space="preserve">clone()</w:t>
+      </w:r>
+      <w:r>
+        <w:t xml:space="preserve"> </w:t>
+      </w:r>
+      <w:r>
+        <w:t xml:space="preserve">con copia profunda</w:t>
+      </w:r>
+    </w:p>
+    <w:p>
+      <w:pPr>
+        <w:pStyle w:val="CaptionedFigure"/>
+      </w:pPr>
+      <w:r>
+        <w:drawing>
+          <wp:inline>
+            <wp:extent cx="5334000" cy="2347951"/>
+            <wp:effectExtent b="0" l="0" r="0" t="0"/>
+            <wp:docPr descr="Captura 21" title="" id="70" name="Picture"/>
+            <a:graphic>
+              <a:graphicData uri="http://schemas.openxmlformats.org/drawingml/2006/picture">
+                <pic:pic>
+                  <pic:nvPicPr>
+                    <pic:cNvPr descr="semana-6-abstract-factory-prototype/evidencias/captura_21.png" id="71" name="Picture"/>
+                    <pic:cNvPicPr>
+                      <a:picLocks noChangeArrowheads="1" noChangeAspect="1"/>
+                    </pic:cNvPicPr>
+                  </pic:nvPicPr>
+                  <pic:blipFill>
+                    <a:blip r:embed="rId69"/>
+                    <a:stretch>
+                      <a:fillRect/>
+                    </a:stretch>
+                  </pic:blipFill>
+                  <pic:spPr bwMode="auto">
+                    <a:xfrm>
+                      <a:off x="0" y="0"/>
+                      <a:ext cx="5334000" cy="2347951"/>
+                    </a:xfrm>
+                    <a:prstGeom prst="rect">
+                      <a:avLst/>
+                    </a:prstGeom>
+                    <a:noFill/>
+                    <a:ln w="9525">
+                      <a:noFill/>
+                      <a:headEnd/>
+                      <a:tailEnd/>
+                    </a:ln>
+                  </pic:spPr>
+                </pic:pic>
+              </a:graphicData>
+            </a:graphic>
+          </wp:inline>
+        </w:drawing>
+      </w:r>
+    </w:p>
+    <w:p>
+      <w:pPr>
+        <w:pStyle w:val="ImageCaption"/>
+      </w:pPr>
+      <w:r>
+        <w:t xml:space="preserve">Captura 21</w:t>
+      </w:r>
+    </w:p>
+    <w:p>
+      <w:pPr>
+        <w:pStyle w:val="BodyText"/>
+      </w:pPr>
+      <w:r>
+        <w:rPr>
+          <w:b/>
+          <w:bCs/>
+        </w:rPr>
+        <w:t xml:space="preserve">Archivo:</w:t>
+      </w:r>
+      <w:r>
+        <w:t xml:space="preserve"> </w:t>
+      </w:r>
+      <w:r>
+        <w:rPr>
+          <w:rStyle w:val="VerbatimChar"/>
+        </w:rPr>
+        <w:t xml:space="preserve">src/Lote.java</w:t>
+      </w:r>
+      <w:r>
+        <w:t xml:space="preserve"> </w:t>
+      </w:r>
+      <w:r>
+        <w:t xml:space="preserve">·</w:t>
+      </w:r>
+      <w:r>
+        <w:t xml:space="preserve"> </w:t>
+      </w:r>
+      <w:r>
+        <w:rPr>
+          <w:b/>
+          <w:bCs/>
+        </w:rPr>
+        <w:t xml:space="preserve">Líneas:</w:t>
+      </w:r>
+      <w:r>
+        <w:t xml:space="preserve"> </w:t>
+      </w:r>
+      <w:r>
+        <w:t xml:space="preserve">43 a 62</w:t>
+      </w:r>
+    </w:p>
+    <w:p>
+      <w:pPr>
+        <w:pStyle w:val="BodyText"/>
+      </w:pPr>
+      <w:r>
+        <w:t xml:space="preserve">Línea 54:</w:t>
+      </w:r>
+      <w:r>
+        <w:t xml:space="preserve"> </w:t>
+      </w:r>
+      <w:r>
+        <w:rPr>
+          <w:rStyle w:val="VerbatimChar"/>
+        </w:rPr>
+        <w:t xml:space="preserve">super.clone()</w:t>
+      </w:r>
+      <w:r>
+        <w:t xml:space="preserve"> </w:t>
+      </w:r>
+      <w:r>
+        <w:t xml:space="preserve">hace la copia superficial. Líneas 55 y 56: los umbrales y la lista de</w:t>
+      </w:r>
+      <w:r>
+        <w:t xml:space="preserve"> </w:t>
+      </w:r>
+      <w:r>
+        <w:t xml:space="preserve">sensores se copian aparte, porque son las partes mutables. El comentario del método documenta el</w:t>
+      </w:r>
+      <w:r>
+        <w:t xml:space="preserve"> </w:t>
+      </w:r>
+      <w:r>
+        <w:t xml:space="preserve">criterio: lo que tiene estado mutable se duplica, lo que no lo tiene se comparte.</w:t>
+      </w:r>
+    </w:p>
+    <w:p>
+      <w:pPr>
+        <w:pStyle w:val="Heading3"/>
+      </w:pPr>
+      <w:r>
+        <w:t xml:space="preserve">Captura 22 — Pruebas 1 a 3</w:t>
+      </w:r>
+    </w:p>
+    <w:p>
+      <w:pPr>
+        <w:pStyle w:val="CaptionedFigure"/>
+      </w:pPr>
+      <w:r>
+        <w:drawing>
+          <wp:inline>
+            <wp:extent cx="5334000" cy="2919432"/>
+            <wp:effectExtent b="0" l="0" r="0" t="0"/>
+            <wp:docPr descr="Captura 22" title="" id="73" name="Picture"/>
+            <a:graphic>
+              <a:graphicData uri="http://schemas.openxmlformats.org/drawingml/2006/picture">
+                <pic:pic>
+                  <pic:nvPicPr>
+                    <pic:cNvPr descr="semana-6-abstract-factory-prototype/evidencias/captura_22.png" id="74" name="Picture"/>
+                    <pic:cNvPicPr>
+                      <a:picLocks noChangeArrowheads="1" noChangeAspect="1"/>
+                    </pic:cNvPicPr>
+                  </pic:nvPicPr>
+                  <pic:blipFill>
+                    <a:blip r:embed="rId72"/>
+                    <a:stretch>
+                      <a:fillRect/>
+                    </a:stretch>
+                  </pic:blipFill>
+                  <pic:spPr bwMode="auto">
+                    <a:xfrm>
+                      <a:off x="0" y="0"/>
+                      <a:ext cx="5334000" cy="2919432"/>
+                    </a:xfrm>
+                    <a:prstGeom prst="rect">
+                      <a:avLst/>
+                    </a:prstGeom>
+                    <a:noFill/>
+                    <a:ln w="9525">
+                      <a:noFill/>
+                      <a:headEnd/>
+                      <a:tailEnd/>
+                    </a:ln>
+                  </pic:spPr>
+                </pic:pic>
+              </a:graphicData>
+            </a:graphic>
+          </wp:inline>
+        </w:drawing>
+      </w:r>
+    </w:p>
+    <w:p>
+      <w:pPr>
+        <w:pStyle w:val="ImageCaption"/>
+      </w:pPr>
+      <w:r>
+        <w:t xml:space="preserve">Captura 22</w:t>
+      </w:r>
+    </w:p>
+    <w:p>
+      <w:pPr>
+        <w:pStyle w:val="BodyText"/>
+      </w:pPr>
+      <w:r>
+        <w:rPr>
+          <w:b/>
+          <w:bCs/>
+        </w:rPr>
+        <w:t xml:space="preserve">Terminal:</w:t>
+      </w:r>
+      <w:r>
+        <w:t xml:space="preserve"> </w:t>
+      </w:r>
+      <w:r>
+        <w:t xml:space="preserve">salida de</w:t>
+      </w:r>
+      <w:r>
+        <w:t xml:space="preserve"> </w:t>
+      </w:r>
+      <w:r>
+        <w:rPr>
+          <w:rStyle w:val="VerbatimChar"/>
+        </w:rPr>
+        <w:t xml:space="preserve">java MainDemoAbstractFactoryPrototype</w:t>
+      </w:r>
+      <w:r>
+        <w:t xml:space="preserve">, pruebas 1 a 3.</w:t>
+      </w:r>
+    </w:p>
+    <w:p>
+      <w:pPr>
+        <w:pStyle w:val="BodyText"/>
+      </w:pPr>
+      <w:r>
+        <w:t xml:space="preserve">Las lecturas de invernadero caen en los rangos estrechos y el actuador es</w:t>
+      </w:r>
+      <w:r>
+        <w:t xml:space="preserve"> </w:t>
+      </w:r>
+      <w:r>
+        <w:rPr>
+          <w:rStyle w:val="VerbatimChar"/>
+        </w:rPr>
+        <w:t xml:space="preserve">GOTEO</w:t>
+      </w:r>
+      <w:r>
+        <w:t xml:space="preserve">; las de campo</w:t>
+      </w:r>
+      <w:r>
+        <w:t xml:space="preserve"> </w:t>
+      </w:r>
+      <w:r>
+        <w:t xml:space="preserve">abierto en los rangos amplios y el actuador es</w:t>
+      </w:r>
+      <w:r>
+        <w:t xml:space="preserve"> </w:t>
+      </w:r>
+      <w:r>
+        <w:rPr>
+          <w:rStyle w:val="VerbatimChar"/>
+        </w:rPr>
+        <w:t xml:space="preserve">ASPERSOR</w:t>
+      </w:r>
+      <w:r>
+        <w:t xml:space="preserve">. En la prueba 3 el mismo método</w:t>
+      </w:r>
+      <w:r>
+        <w:t xml:space="preserve"> </w:t>
+      </w:r>
+      <w:r>
+        <w:rPr>
+          <w:rStyle w:val="VerbatimChar"/>
+        </w:rPr>
+        <w:t xml:space="preserve">instalarYRegar()</w:t>
+      </w:r>
+      <w:r>
+        <w:t xml:space="preserve"> </w:t>
+      </w:r>
+      <w:r>
+        <w:t xml:space="preserve">recibe las dos fábricas: 5 minutos de goteo aplican 10 L; de aspersión, 75 L.</w:t>
+      </w:r>
+    </w:p>
+    <w:p>
+      <w:pPr>
+        <w:pStyle w:val="Heading3"/>
+      </w:pPr>
+      <w:r>
+        <w:t xml:space="preserve">Captura 23 — Pruebas 4 y 5</w:t>
+      </w:r>
+    </w:p>
+    <w:p>
+      <w:pPr>
+        <w:pStyle w:val="CaptionedFigure"/>
+      </w:pPr>
+      <w:r>
+        <w:drawing>
+          <wp:inline>
+            <wp:extent cx="5334000" cy="1207202"/>
+            <wp:effectExtent b="0" l="0" r="0" t="0"/>
+            <wp:docPr descr="Captura 23" title="" id="76" name="Picture"/>
+            <a:graphic>
+              <a:graphicData uri="http://schemas.openxmlformats.org/drawingml/2006/picture">
+                <pic:pic>
+                  <pic:nvPicPr>
+                    <pic:cNvPr descr="semana-6-abstract-factory-prototype/evidencias/captura_23.png" id="77" name="Picture"/>
+                    <pic:cNvPicPr>
+                      <a:picLocks noChangeArrowheads="1" noChangeAspect="1"/>
+                    </pic:cNvPicPr>
+                  </pic:nvPicPr>
+                  <pic:blipFill>
+                    <a:blip r:embed="rId75"/>
+                    <a:stretch>
+                      <a:fillRect/>
+                    </a:stretch>
+                  </pic:blipFill>
+                  <pic:spPr bwMode="auto">
+                    <a:xfrm>
+                      <a:off x="0" y="0"/>
+                      <a:ext cx="5334000" cy="1207202"/>
+                    </a:xfrm>
+                    <a:prstGeom prst="rect">
+                      <a:avLst/>
+                    </a:prstGeom>
+                    <a:noFill/>
+                    <a:ln w="9525">
+                      <a:noFill/>
+                      <a:headEnd/>
+                      <a:tailEnd/>
+                    </a:ln>
+                  </pic:spPr>
+                </pic:pic>
+              </a:graphicData>
+            </a:graphic>
+          </wp:inline>
+        </w:drawing>
+      </w:r>
+    </w:p>
+    <w:p>
+      <w:pPr>
+        <w:pStyle w:val="ImageCaption"/>
+      </w:pPr>
+      <w:r>
+        <w:t xml:space="preserve">Captura 23</w:t>
+      </w:r>
+    </w:p>
+    <w:p>
+      <w:pPr>
+        <w:pStyle w:val="BodyText"/>
+      </w:pPr>
+      <w:r>
+        <w:rPr>
+          <w:b/>
+          <w:bCs/>
+        </w:rPr>
+        <w:t xml:space="preserve">Terminal:</w:t>
+      </w:r>
+      <w:r>
+        <w:t xml:space="preserve"> </w:t>
+      </w:r>
+      <w:r>
+        <w:t xml:space="preserve">salida de</w:t>
+      </w:r>
+      <w:r>
+        <w:t xml:space="preserve"> </w:t>
+      </w:r>
+      <w:r>
+        <w:rPr>
+          <w:rStyle w:val="VerbatimChar"/>
+        </w:rPr>
+        <w:t xml:space="preserve">java MainDemoAbstractFactoryPrototype</w:t>
+      </w:r>
+      <w:r>
+        <w:t xml:space="preserve">, pruebas 4 y 5.</w:t>
+      </w:r>
+    </w:p>
+    <w:p>
+      <w:pPr>
+        <w:pStyle w:val="BodyText"/>
+      </w:pPr>
+      <w:r>
+        <w:t xml:space="preserve">Tres lotes salen de dos plantillas con</w:t>
+      </w:r>
+      <w:r>
+        <w:t xml:space="preserve"> </w:t>
+      </w:r>
+      <w:r>
+        <w:rPr>
+          <w:rStyle w:val="VerbatimChar"/>
+        </w:rPr>
+        <w:t xml:space="preserve">catalogo.crear()</w:t>
+      </w:r>
+      <w:r>
+        <w:t xml:space="preserve">, cada uno con su nombre y área.</w:t>
+      </w:r>
+      <w:r>
+        <w:t xml:space="preserve"> </w:t>
+      </w:r>
+      <w:r>
+        <w:rPr>
+          <w:rStyle w:val="VerbatimChar"/>
+        </w:rPr>
+        <w:t xml:space="preserve">cafe1 == cafe2</w:t>
+      </w:r>
+      <w:r>
+        <w:t xml:space="preserve"> </w:t>
+      </w:r>
+      <w:r>
+        <w:t xml:space="preserve">da</w:t>
+      </w:r>
+      <w:r>
+        <w:t xml:space="preserve"> </w:t>
+      </w:r>
+      <w:r>
+        <w:rPr>
+          <w:rStyle w:val="VerbatimChar"/>
+        </w:rPr>
+        <w:t xml:space="preserve">false</w:t>
+      </w:r>
+      <w:r>
+        <w:t xml:space="preserve">. En la prueba 5 se cambia el umbral del clon a 55 % y se le agrega un</w:t>
+      </w:r>
+      <w:r>
+        <w:t xml:space="preserve"> </w:t>
+      </w:r>
+      <w:r>
+        <w:t xml:space="preserve">sensor: la plantilla conserva 70 % y 2 sensores.</w:t>
+      </w:r>
+      <w:r>
+        <w:t xml:space="preserve"> </w:t>
+      </w:r>
+      <w:r>
+        <w:rPr>
+          <w:rStyle w:val="VerbatimChar"/>
+        </w:rPr>
+        <w:t xml:space="preserve">Umbrales compartidos? false</w:t>
+      </w:r>
+      <w:r>
+        <w:t xml:space="preserve"> </w:t>
+      </w:r>
+      <w:r>
+        <w:t xml:space="preserve">y</w:t>
+      </w:r>
+      <w:r>
+        <w:t xml:space="preserve"> </w:t>
+      </w:r>
+      <w:r>
+        <w:rPr>
+          <w:rStyle w:val="VerbatimChar"/>
+        </w:rPr>
+        <w:t xml:space="preserve">Lista de sensores compartida? false</w:t>
+      </w:r>
+      <w:r>
+        <w:t xml:space="preserve"> </w:t>
+      </w:r>
+      <w:r>
+        <w:t xml:space="preserve">confirman la copia profunda.</w:t>
+      </w:r>
+    </w:p>
+    <w:p>
+      <w:pPr>
+        <w:pStyle w:val="Heading3"/>
+      </w:pPr>
+      <w:r>
+        <w:t xml:space="preserve">Captura 24 — Pruebas 6 y 7</w:t>
+      </w:r>
+    </w:p>
+    <w:p>
+      <w:pPr>
+        <w:pStyle w:val="CaptionedFigure"/>
+      </w:pPr>
+      <w:r>
+        <w:drawing>
+          <wp:inline>
+            <wp:extent cx="5334000" cy="1908245"/>
+            <wp:effectExtent b="0" l="0" r="0" t="0"/>
+            <wp:docPr descr="Captura 24" title="" id="79" name="Picture"/>
+            <a:graphic>
+              <a:graphicData uri="http://schemas.openxmlformats.org/drawingml/2006/picture">
+                <pic:pic>
+                  <pic:nvPicPr>
+                    <pic:cNvPr descr="semana-6-abstract-factory-prototype/evidencias/captura_24.png" id="80" name="Picture"/>
+                    <pic:cNvPicPr>
+                      <a:picLocks noChangeArrowheads="1" noChangeAspect="1"/>
+                    </pic:cNvPicPr>
+                  </pic:nvPicPr>
+                  <pic:blipFill>
+                    <a:blip r:embed="rId78"/>
+                    <a:stretch>
+                      <a:fillRect/>
+                    </a:stretch>
+                  </pic:blipFill>
+                  <pic:spPr bwMode="auto">
+                    <a:xfrm>
+                      <a:off x="0" y="0"/>
+                      <a:ext cx="5334000" cy="1908245"/>
+                    </a:xfrm>
+                    <a:prstGeom prst="rect">
+                      <a:avLst/>
+                    </a:prstGeom>
+                    <a:noFill/>
+                    <a:ln w="9525">
+                      <a:noFill/>
+                      <a:headEnd/>
+                      <a:tailEnd/>
+                    </a:ln>
+                  </pic:spPr>
+                </pic:pic>
+              </a:graphicData>
+            </a:graphic>
+          </wp:inline>
+        </w:drawing>
+      </w:r>
+    </w:p>
+    <w:p>
+      <w:pPr>
+        <w:pStyle w:val="ImageCaption"/>
+      </w:pPr>
+      <w:r>
+        <w:t xml:space="preserve">Captura 24</w:t>
+      </w:r>
+    </w:p>
+    <w:p>
+      <w:pPr>
+        <w:pStyle w:val="BodyText"/>
+      </w:pPr>
+      <w:r>
+        <w:rPr>
+          <w:b/>
+          <w:bCs/>
+        </w:rPr>
+        <w:t xml:space="preserve">Terminal:</w:t>
+      </w:r>
+      <w:r>
+        <w:t xml:space="preserve"> </w:t>
+      </w:r>
+      <w:r>
+        <w:t xml:space="preserve">salida de</w:t>
+      </w:r>
+      <w:r>
+        <w:t xml:space="preserve"> </w:t>
+      </w:r>
+      <w:r>
+        <w:rPr>
+          <w:rStyle w:val="VerbatimChar"/>
+        </w:rPr>
+        <w:t xml:space="preserve">java MainDemoAbstractFactoryPrototype</w:t>
+      </w:r>
+      <w:r>
+        <w:t xml:space="preserve">, pruebas 6 y 7.</w:t>
+      </w:r>
+    </w:p>
+    <w:p>
+      <w:pPr>
+        <w:pStyle w:val="BodyText"/>
+      </w:pPr>
+      <w:r>
+        <w:t xml:space="preserve">Cada clon monitorea con sus propios umbrales y su propio actuador. El lote de café lee 63.6 %, por</w:t>
+      </w:r>
+      <w:r>
+        <w:t xml:space="preserve"> </w:t>
+      </w:r>
+      <w:r>
+        <w:t xml:space="preserve">debajo de su umbral de 70 %, y riega por goteo; además su temperatura de 26.7 °C supera el máximo</w:t>
+      </w:r>
+      <w:r>
+        <w:t xml:space="preserve"> </w:t>
+      </w:r>
+      <w:r>
+        <w:t xml:space="preserve">de 26 °C y se emite la alerta. El lote de maíz lee 61.5 %, por encima de su umbral de 40 %, y no</w:t>
+      </w:r>
+      <w:r>
+        <w:t xml:space="preserve"> </w:t>
+      </w:r>
+      <w:r>
+        <w:t xml:space="preserve">riega. Pedir una plantilla no registrada lanza</w:t>
+      </w:r>
+      <w:r>
+        <w:t xml:space="preserve"> </w:t>
+      </w:r>
+      <w:r>
+        <w:rPr>
+          <w:rStyle w:val="VerbatimChar"/>
+        </w:rPr>
+        <w:t xml:space="preserve">IllegalArgumentException</w:t>
+      </w:r>
+      <w:r>
+        <w:t xml:space="preserve">.</w:t>
+      </w:r>
+    </w:p>
+    <w:p>
+      <w:r>
+        <w:pict>
+          <v:rect style="width:0;height:1.5pt" o:hralign="center" o:hrstd="t" o:hr="t"/>
+        </w:pict>
+      </w:r>
+    </w:p>
+    <w:p>
+      <w:pPr>
+        <w:pStyle w:val="Heading2"/>
+      </w:pPr>
+      <w:r>
+        <w:t xml:space="preserve">Resultados</w:t>
+      </w:r>
+    </w:p>
+    <w:tbl>
+      <w:tblPr>
+        <w:tblStyle w:val="Table"/>
+        <w:tblW w:type="pct" w:w="5000"/>
+        <w:tblLayout w:type="fixed"/>
+        <w:tblLook w:firstRow="1" w:lastRow="0" w:firstColumn="0" w:lastColumn="0" w:noHBand="0" w:noVBand="0" w:val="0020"/>
+      </w:tblPr>
+      <w:tblGrid>
+        <w:gridCol w:w="1131"/>
+        <w:gridCol w:w="1131"/>
+        <w:gridCol w:w="1131"/>
+        <w:gridCol w:w="1131"/>
+        <w:gridCol w:w="1131"/>
+        <w:gridCol w:w="1131"/>
+        <w:gridCol w:w="1131"/>
+      </w:tblGrid>
+      <w:tr>
+        <w:trPr>
+          <w:tblHeader w:val="on"/>
+        </w:trPr>
+        <w:tc>
+          <w:tcPr/>
+          <w:p>
+            <w:pPr>
+              <w:pStyle w:val="Compact"/>
+            </w:pPr>
+            <w:r>
+              <w:t xml:space="preserve">#</w:t>
+            </w:r>
+          </w:p>
+        </w:tc>
+        <w:tc>
+          <w:tcPr/>
+          <w:p>
+            <w:pPr>
+              <w:pStyle w:val="Compact"/>
+            </w:pPr>
+            <w:r>
+              <w:t xml:space="preserve">Prueba</w:t>
+            </w:r>
+          </w:p>
+        </w:tc>
+        <w:tc>
+          <w:tcPr/>
+          <w:p>
+            <w:pPr>
+              <w:pStyle w:val="Compact"/>
+            </w:pPr>
+            <w:r>
+              <w:t xml:space="preserve">Patrón</w:t>
+            </w:r>
+          </w:p>
+        </w:tc>
+        <w:tc>
+          <w:tcPr/>
+          <w:p>
+            <w:pPr>
+              <w:pStyle w:val="Compact"/>
+            </w:pPr>
+            <w:r>
+              <w:t xml:space="preserve">Resultado esperado</w:t>
+            </w:r>
+          </w:p>
+        </w:tc>
+        <w:tc>
+          <w:tcPr/>
+          <w:p>
+            <w:pPr>
+              <w:pStyle w:val="Compact"/>
+            </w:pPr>
+            <w:r>
+              <w:t xml:space="preserve">Resultado obtenido</w:t>
+            </w:r>
+          </w:p>
+        </w:tc>
+        <w:tc>
+          <w:tcPr/>
+          <w:p>
+            <w:pPr>
+              <w:pStyle w:val="Compact"/>
+            </w:pPr>
+            <w:r>
+              <w:t xml:space="preserve">Estado</w:t>
+            </w:r>
+          </w:p>
+        </w:tc>
+        <w:tc>
+          <w:tcPr/>
+          <w:p>
+            <w:pPr>
+              <w:pStyle w:val="Compact"/>
+            </w:pPr>
+            <w:r>
+              <w:t xml:space="preserve">Captura</w:t>
+            </w:r>
+          </w:p>
+        </w:tc>
+      </w:tr>
+      <w:tr>
+        <w:tc>
+          <w:tcPr/>
+          <w:p>
+            <w:pPr>
+              <w:pStyle w:val="Compact"/>
+            </w:pPr>
+            <w:r>
+              <w:t xml:space="preserve">1</w:t>
+            </w:r>
+          </w:p>
+        </w:tc>
+        <w:tc>
+          <w:tcPr/>
+          <w:p>
+            <w:pPr>
+              <w:pStyle w:val="Compact"/>
+            </w:pPr>
+            <w:r>
+              <w:t xml:space="preserve">Familia de invernadero</w:t>
+            </w:r>
+          </w:p>
+        </w:tc>
+        <w:tc>
+          <w:tcPr/>
+          <w:p>
+            <w:pPr>
+              <w:pStyle w:val="Compact"/>
+            </w:pPr>
+            <w:r>
+              <w:t xml:space="preserve">Abstract Factory</w:t>
+            </w:r>
+          </w:p>
+        </w:tc>
+        <w:tc>
+          <w:tcPr/>
+          <w:p>
+            <w:pPr>
+              <w:pStyle w:val="Compact"/>
+            </w:pPr>
+            <w:r>
+              <w:t xml:space="preserve">Humedad 60–85 %, temperatura 18–28 °C, actuador</w:t>
+            </w:r>
+            <w:r>
+              <w:t xml:space="preserve"> </w:t>
+            </w:r>
+            <w:r>
+              <w:rPr>
+                <w:rStyle w:val="VerbatimChar"/>
+              </w:rPr>
+              <w:t xml:space="preserve">GOTEO</w:t>
+            </w:r>
+          </w:p>
+        </w:tc>
+        <w:tc>
+          <w:tcPr/>
+          <w:p>
+            <w:pPr>
+              <w:pStyle w:val="Compact"/>
+            </w:pPr>
+            <w:r>
+              <w:rPr>
+                <w:rStyle w:val="VerbatimChar"/>
+              </w:rPr>
+              <w:t xml:space="preserve">77.8 %</w:t>
+            </w:r>
+            <w:r>
+              <w:t xml:space="preserve">,</w:t>
+            </w:r>
+            <w:r>
+              <w:t xml:space="preserve"> </w:t>
+            </w:r>
+            <w:r>
+              <w:rPr>
+                <w:rStyle w:val="VerbatimChar"/>
+              </w:rPr>
+              <w:t xml:space="preserve">18.7 C</w:t>
+            </w:r>
+            <w:r>
+              <w:t xml:space="preserve">,</w:t>
+            </w:r>
+            <w:r>
+              <w:t xml:space="preserve"> </w:t>
+            </w:r>
+            <w:r>
+              <w:rPr>
+                <w:rStyle w:val="VerbatimChar"/>
+              </w:rPr>
+              <w:t xml:space="preserve">Actuador: GOTEO</w:t>
+            </w:r>
+          </w:p>
+        </w:tc>
+        <w:tc>
+          <w:tcPr/>
+          <w:p>
+            <w:pPr>
+              <w:pStyle w:val="Compact"/>
+            </w:pPr>
+            <w:r>
+              <w:t xml:space="preserve">✅ OK</w:t>
+            </w:r>
+          </w:p>
+        </w:tc>
+        <w:tc>
+          <w:tcPr/>
+          <w:p>
+            <w:pPr>
+              <w:pStyle w:val="Compact"/>
+            </w:pPr>
+            <w:r>
+              <w:t xml:space="preserve">22</w:t>
+            </w:r>
+          </w:p>
+        </w:tc>
+      </w:tr>
+      <w:tr>
+        <w:tc>
+          <w:tcPr/>
+          <w:p>
+            <w:pPr>
+              <w:pStyle w:val="Compact"/>
+            </w:pPr>
+            <w:r>
+              <w:t xml:space="preserve">2</w:t>
+            </w:r>
+          </w:p>
+        </w:tc>
+        <w:tc>
+          <w:tcPr/>
+          <w:p>
+            <w:pPr>
+              <w:pStyle w:val="Compact"/>
+            </w:pPr>
+            <w:r>
+              <w:t xml:space="preserve">Familia de campo abierto</w:t>
+            </w:r>
+          </w:p>
+        </w:tc>
+        <w:tc>
+          <w:tcPr/>
+          <w:p>
+            <w:pPr>
+              <w:pStyle w:val="Compact"/>
+            </w:pPr>
+            <w:r>
+              <w:t xml:space="preserve">Abstract Factory</w:t>
+            </w:r>
+          </w:p>
+        </w:tc>
+        <w:tc>
+          <w:tcPr/>
+          <w:p>
+            <w:pPr>
+              <w:pStyle w:val="Compact"/>
+            </w:pPr>
+            <w:r>
+              <w:t xml:space="preserve">Humedad 10–90 %, temperatura 5–38 °C, actuador</w:t>
+            </w:r>
+            <w:r>
+              <w:t xml:space="preserve"> </w:t>
+            </w:r>
+            <w:r>
+              <w:rPr>
+                <w:rStyle w:val="VerbatimChar"/>
+              </w:rPr>
+              <w:t xml:space="preserve">ASPERSOR</w:t>
+            </w:r>
+          </w:p>
+        </w:tc>
+        <w:tc>
+          <w:tcPr/>
+          <w:p>
+            <w:pPr>
+              <w:pStyle w:val="Compact"/>
+            </w:pPr>
+            <w:r>
+              <w:rPr>
+                <w:rStyle w:val="VerbatimChar"/>
+              </w:rPr>
+              <w:t xml:space="preserve">33.7 %</w:t>
+            </w:r>
+            <w:r>
+              <w:t xml:space="preserve">,</w:t>
+            </w:r>
+            <w:r>
+              <w:t xml:space="preserve"> </w:t>
+            </w:r>
+            <w:r>
+              <w:rPr>
+                <w:rStyle w:val="VerbatimChar"/>
+              </w:rPr>
+              <w:t xml:space="preserve">36.7 C</w:t>
+            </w:r>
+            <w:r>
+              <w:t xml:space="preserve">,</w:t>
+            </w:r>
+            <w:r>
+              <w:t xml:space="preserve"> </w:t>
+            </w:r>
+            <w:r>
+              <w:rPr>
+                <w:rStyle w:val="VerbatimChar"/>
+              </w:rPr>
+              <w:t xml:space="preserve">Actuador: ASPERSOR</w:t>
+            </w:r>
+          </w:p>
+        </w:tc>
+        <w:tc>
+          <w:tcPr/>
+          <w:p>
+            <w:pPr>
+              <w:pStyle w:val="Compact"/>
+            </w:pPr>
+            <w:r>
+              <w:t xml:space="preserve">✅ OK</w:t>
+            </w:r>
+          </w:p>
+        </w:tc>
+        <w:tc>
+          <w:tcPr/>
+          <w:p>
+            <w:pPr>
+              <w:pStyle w:val="Compact"/>
+            </w:pPr>
+            <w:r>
+              <w:t xml:space="preserve">22</w:t>
+            </w:r>
+          </w:p>
+        </w:tc>
+      </w:tr>
+      <w:tr>
+        <w:tc>
+          <w:tcPr/>
+          <w:p>
+            <w:pPr>
+              <w:pStyle w:val="Compact"/>
+            </w:pPr>
+            <w:r>
+              <w:t xml:space="preserve">3</w:t>
+            </w:r>
+          </w:p>
+        </w:tc>
+        <w:tc>
+          <w:tcPr/>
+          <w:p>
+            <w:pPr>
+              <w:pStyle w:val="Compact"/>
+            </w:pPr>
+            <w:r>
+              <w:t xml:space="preserve">Cliente sin cambios</w:t>
+            </w:r>
+          </w:p>
+        </w:tc>
+        <w:tc>
+          <w:tcPr/>
+          <w:p>
+            <w:pPr>
+              <w:pStyle w:val="Compact"/>
+            </w:pPr>
+            <w:r>
+              <w:t xml:space="preserve">Abstract Factory</w:t>
+            </w:r>
+          </w:p>
+        </w:tc>
+        <w:tc>
+          <w:tcPr/>
+          <w:p>
+            <w:pPr>
+              <w:pStyle w:val="Compact"/>
+            </w:pPr>
+            <w:r>
+              <w:t xml:space="preserve">Mismo método con ambas fábricas; 10 L vs 75 L</w:t>
+            </w:r>
+          </w:p>
+        </w:tc>
+        <w:tc>
+          <w:tcPr/>
+          <w:p>
+            <w:pPr>
+              <w:pStyle w:val="Compact"/>
+            </w:pPr>
+            <w:r>
+              <w:rPr>
+                <w:rStyle w:val="VerbatimChar"/>
+              </w:rPr>
+              <w:t xml:space="preserve">GOTEO ... 10.0 L</w:t>
+            </w:r>
+            <w:r>
+              <w:t xml:space="preserve"> </w:t>
+            </w:r>
+            <w:r>
+              <w:t xml:space="preserve">y</w:t>
+            </w:r>
+            <w:r>
+              <w:t xml:space="preserve"> </w:t>
+            </w:r>
+            <w:r>
+              <w:rPr>
+                <w:rStyle w:val="VerbatimChar"/>
+              </w:rPr>
+              <w:t xml:space="preserve">ASPERSOR ... 75.0 L</w:t>
+            </w:r>
+            <w:r>
+              <w:t xml:space="preserve"> </w:t>
+            </w:r>
+            <w:r>
+              <w:t xml:space="preserve">desde</w:t>
+            </w:r>
+            <w:r>
+              <w:t xml:space="preserve"> </w:t>
+            </w:r>
+            <w:r>
+              <w:rPr>
+                <w:rStyle w:val="VerbatimChar"/>
+              </w:rPr>
+              <w:t xml:space="preserve">instalarYRegar()</w:t>
+            </w:r>
+          </w:p>
+        </w:tc>
+        <w:tc>
+          <w:tcPr/>
+          <w:p>
+            <w:pPr>
+              <w:pStyle w:val="Compact"/>
+            </w:pPr>
+            <w:r>
+              <w:t xml:space="preserve">✅ OK</w:t>
+            </w:r>
+          </w:p>
+        </w:tc>
+        <w:tc>
+          <w:tcPr/>
+          <w:p>
+            <w:pPr>
+              <w:pStyle w:val="Compact"/>
+            </w:pPr>
+            <w:r>
+              <w:t xml:space="preserve">22</w:t>
+            </w:r>
+          </w:p>
+        </w:tc>
+      </w:tr>
+      <w:tr>
+        <w:tc>
+          <w:tcPr/>
+          <w:p>
+            <w:pPr>
+              <w:pStyle w:val="Compact"/>
+            </w:pPr>
+            <w:r>
+              <w:t xml:space="preserve">4</w:t>
+            </w:r>
+          </w:p>
+        </w:tc>
+        <w:tc>
+          <w:tcPr/>
+          <w:p>
+            <w:pPr>
+              <w:pStyle w:val="Compact"/>
+            </w:pPr>
+            <w:r>
+              <w:t xml:space="preserve">Clones desde plantilla</w:t>
+            </w:r>
+          </w:p>
+        </w:tc>
+        <w:tc>
+          <w:tcPr/>
+          <w:p>
+            <w:pPr>
+              <w:pStyle w:val="Compact"/>
+            </w:pPr>
+            <w:r>
+              <w:t xml:space="preserve">Prototype</w:t>
+            </w:r>
+          </w:p>
+        </w:tc>
+        <w:tc>
+          <w:tcPr/>
+          <w:p>
+            <w:pPr>
+              <w:pStyle w:val="Compact"/>
+            </w:pPr>
+            <w:r>
+              <w:t xml:space="preserve">3 lotes con nombre y área propios;</w:t>
+            </w:r>
+            <w:r>
+              <w:t xml:space="preserve"> </w:t>
+            </w:r>
+            <w:r>
+              <w:rPr>
+                <w:rStyle w:val="VerbatimChar"/>
+              </w:rPr>
+              <w:t xml:space="preserve">cafe1 == cafe2</w:t>
+            </w:r>
+            <w:r>
+              <w:t xml:space="preserve"> </w:t>
+            </w:r>
+            <w:r>
+              <w:t xml:space="preserve">es</w:t>
+            </w:r>
+            <w:r>
+              <w:t xml:space="preserve"> </w:t>
+            </w:r>
+            <w:r>
+              <w:rPr>
+                <w:rStyle w:val="VerbatimChar"/>
+              </w:rPr>
+              <w:t xml:space="preserve">false</w:t>
+            </w:r>
+          </w:p>
+        </w:tc>
+        <w:tc>
+          <w:tcPr/>
+          <w:p>
+            <w:pPr>
+              <w:pStyle w:val="Compact"/>
+            </w:pPr>
+            <w:r>
+              <w:rPr>
+                <w:rStyle w:val="VerbatimChar"/>
+              </w:rPr>
+              <w:t xml:space="preserve">Cafe-Norte 1.5 ha</w:t>
+            </w:r>
+            <w:r>
+              <w:t xml:space="preserve">,</w:t>
+            </w:r>
+            <w:r>
+              <w:t xml:space="preserve"> </w:t>
+            </w:r>
+            <w:r>
+              <w:rPr>
+                <w:rStyle w:val="VerbatimChar"/>
+              </w:rPr>
+              <w:t xml:space="preserve">Cafe-Sur 2.0 ha</w:t>
+            </w:r>
+            <w:r>
+              <w:t xml:space="preserve">,</w:t>
+            </w:r>
+            <w:r>
+              <w:t xml:space="preserve"> </w:t>
+            </w:r>
+            <w:r>
+              <w:rPr>
+                <w:rStyle w:val="VerbatimChar"/>
+              </w:rPr>
+              <w:t xml:space="preserve">Maiz-Este 6.0 ha</w:t>
+            </w:r>
+            <w:r>
+              <w:t xml:space="preserve">;</w:t>
+            </w:r>
+            <w:r>
+              <w:t xml:space="preserve"> </w:t>
+            </w:r>
+            <w:r>
+              <w:rPr>
+                <w:rStyle w:val="VerbatimChar"/>
+              </w:rPr>
+              <w:t xml:space="preserve">false</w:t>
+            </w:r>
+          </w:p>
+        </w:tc>
+        <w:tc>
+          <w:tcPr/>
+          <w:p>
+            <w:pPr>
+              <w:pStyle w:val="Compact"/>
+            </w:pPr>
+            <w:r>
+              <w:t xml:space="preserve">✅ OK</w:t>
+            </w:r>
+          </w:p>
+        </w:tc>
+        <w:tc>
+          <w:tcPr/>
+          <w:p>
+            <w:pPr>
+              <w:pStyle w:val="Compact"/>
+            </w:pPr>
+            <w:r>
+              <w:t xml:space="preserve">23</w:t>
+            </w:r>
+          </w:p>
+        </w:tc>
+      </w:tr>
+      <w:tr>
+        <w:tc>
+          <w:tcPr/>
+          <w:p>
+            <w:pPr>
+              <w:pStyle w:val="Compact"/>
+            </w:pPr>
+            <w:r>
+              <w:t xml:space="preserve">5</w:t>
+            </w:r>
+          </w:p>
+        </w:tc>
+        <w:tc>
+          <w:tcPr/>
+          <w:p>
+            <w:pPr>
+              <w:pStyle w:val="Compact"/>
+            </w:pPr>
+            <w:r>
+              <w:t xml:space="preserve">Copia profunda</w:t>
+            </w:r>
+          </w:p>
+        </w:tc>
+        <w:tc>
+          <w:tcPr/>
+          <w:p>
+            <w:pPr>
+              <w:pStyle w:val="Compact"/>
+            </w:pPr>
+            <w:r>
+              <w:t xml:space="preserve">Prototype</w:t>
+            </w:r>
+          </w:p>
+        </w:tc>
+        <w:tc>
+          <w:tcPr/>
+          <w:p>
+            <w:pPr>
+              <w:pStyle w:val="Compact"/>
+            </w:pPr>
+            <w:r>
+              <w:t xml:space="preserve">Clon con 55 % y 3 sensores; plantilla con 70 % y 2</w:t>
+            </w:r>
+          </w:p>
+        </w:tc>
+        <w:tc>
+          <w:tcPr/>
+          <w:p>
+            <w:pPr>
+              <w:pStyle w:val="Compact"/>
+            </w:pPr>
+            <w:r>
+              <w:t xml:space="preserve">Clon</w:t>
+            </w:r>
+            <w:r>
+              <w:t xml:space="preserve"> </w:t>
+            </w:r>
+            <w:r>
+              <w:rPr>
+                <w:rStyle w:val="VerbatimChar"/>
+              </w:rPr>
+              <w:t xml:space="preserve">55.0 %</w:t>
+            </w:r>
+            <w:r>
+              <w:t xml:space="preserve">,</w:t>
+            </w:r>
+            <w:r>
+              <w:t xml:space="preserve"> </w:t>
+            </w:r>
+            <w:r>
+              <w:rPr>
+                <w:rStyle w:val="VerbatimChar"/>
+              </w:rPr>
+              <w:t xml:space="preserve">3 sensores</w:t>
+            </w:r>
+            <w:r>
+              <w:t xml:space="preserve"> </w:t>
+            </w:r>
+            <w:r>
+              <w:t xml:space="preserve">· Plantilla</w:t>
+            </w:r>
+            <w:r>
+              <w:t xml:space="preserve"> </w:t>
+            </w:r>
+            <w:r>
+              <w:rPr>
+                <w:rStyle w:val="VerbatimChar"/>
+              </w:rPr>
+              <w:t xml:space="preserve">70.0 %</w:t>
+            </w:r>
+            <w:r>
+              <w:t xml:space="preserve">,</w:t>
+            </w:r>
+            <w:r>
+              <w:t xml:space="preserve"> </w:t>
+            </w:r>
+            <w:r>
+              <w:rPr>
+                <w:rStyle w:val="VerbatimChar"/>
+              </w:rPr>
+              <w:t xml:space="preserve">2 sensores</w:t>
+            </w:r>
+            <w:r>
+              <w:t xml:space="preserve"> </w:t>
+            </w:r>
+            <w:r>
+              <w:t xml:space="preserve">· compartidos:</w:t>
+            </w:r>
+            <w:r>
+              <w:t xml:space="preserve"> </w:t>
+            </w:r>
+            <w:r>
+              <w:rPr>
+                <w:rStyle w:val="VerbatimChar"/>
+              </w:rPr>
+              <w:t xml:space="preserve">false</w:t>
+            </w:r>
+            <w:r>
+              <w:t xml:space="preserve">,</w:t>
+            </w:r>
+            <w:r>
+              <w:t xml:space="preserve"> </w:t>
+            </w:r>
+            <w:r>
+              <w:rPr>
+                <w:rStyle w:val="VerbatimChar"/>
+              </w:rPr>
+              <w:t xml:space="preserve">false</w:t>
+            </w:r>
+          </w:p>
+        </w:tc>
+        <w:tc>
+          <w:tcPr/>
+          <w:p>
+            <w:pPr>
+              <w:pStyle w:val="Compact"/>
+            </w:pPr>
+            <w:r>
+              <w:t xml:space="preserve">✅ OK</w:t>
+            </w:r>
+          </w:p>
+        </w:tc>
+        <w:tc>
+          <w:tcPr/>
+          <w:p>
+            <w:pPr>
+              <w:pStyle w:val="Compact"/>
+            </w:pPr>
+            <w:r>
+              <w:t xml:space="preserve">23</w:t>
+            </w:r>
+          </w:p>
+        </w:tc>
+      </w:tr>
+      <w:tr>
+        <w:tc>
+          <w:tcPr/>
+          <w:p>
+            <w:pPr>
+              <w:pStyle w:val="Compact"/>
+            </w:pPr>
+            <w:r>
+              <w:t xml:space="preserve">6</w:t>
+            </w:r>
+          </w:p>
+        </w:tc>
+        <w:tc>
+          <w:tcPr/>
+          <w:p>
+            <w:pPr>
+              <w:pStyle w:val="Compact"/>
+            </w:pPr>
+            <w:r>
+              <w:t xml:space="preserve">Clon operando</w:t>
+            </w:r>
+          </w:p>
+        </w:tc>
+        <w:tc>
+          <w:tcPr/>
+          <w:p>
+            <w:pPr>
+              <w:pStyle w:val="Compact"/>
+            </w:pPr>
+            <w:r>
+              <w:t xml:space="preserve">Ambos</w:t>
+            </w:r>
+          </w:p>
+        </w:tc>
+        <w:tc>
+          <w:tcPr/>
+          <w:p>
+            <w:pPr>
+              <w:pStyle w:val="Compact"/>
+            </w:pPr>
+            <w:r>
+              <w:t xml:space="preserve">Cada lote decide con su umbral y riega con su actuador</w:t>
+            </w:r>
+          </w:p>
+        </w:tc>
+        <w:tc>
+          <w:tcPr/>
+          <w:p>
+            <w:pPr>
+              <w:pStyle w:val="Compact"/>
+            </w:pPr>
+            <w:r>
+              <w:t xml:space="preserve">Café</w:t>
+            </w:r>
+            <w:r>
+              <w:t xml:space="preserve"> </w:t>
+            </w:r>
+            <w:r>
+              <w:rPr>
+                <w:rStyle w:val="VerbatimChar"/>
+              </w:rPr>
+              <w:t xml:space="preserve">63.6 %</w:t>
+            </w:r>
+            <w:r>
+              <w:t xml:space="preserve"> </w:t>
+            </w:r>
+            <w:r>
+              <w:t xml:space="preserve">&lt; 70 %: goteo 20 L y alerta por</w:t>
+            </w:r>
+            <w:r>
+              <w:t xml:space="preserve"> </w:t>
+            </w:r>
+            <w:r>
+              <w:rPr>
+                <w:rStyle w:val="VerbatimChar"/>
+              </w:rPr>
+              <w:t xml:space="preserve">26.7 C</w:t>
+            </w:r>
+            <w:r>
+              <w:t xml:space="preserve"> </w:t>
+            </w:r>
+            <w:r>
+              <w:t xml:space="preserve">· Maíz</w:t>
+            </w:r>
+            <w:r>
+              <w:t xml:space="preserve"> </w:t>
+            </w:r>
+            <w:r>
+              <w:rPr>
+                <w:rStyle w:val="VerbatimChar"/>
+              </w:rPr>
+              <w:t xml:space="preserve">61.5 %</w:t>
+            </w:r>
+            <w:r>
+              <w:t xml:space="preserve"> </w:t>
+            </w:r>
+            <w:r>
+              <w:t xml:space="preserve">&gt; 40 %: no riega</w:t>
+            </w:r>
+          </w:p>
+        </w:tc>
+        <w:tc>
+          <w:tcPr/>
+          <w:p>
+            <w:pPr>
+              <w:pStyle w:val="Compact"/>
+            </w:pPr>
+            <w:r>
+              <w:t xml:space="preserve">✅ OK</w:t>
+            </w:r>
+          </w:p>
+        </w:tc>
+        <w:tc>
+          <w:tcPr/>
+          <w:p>
+            <w:pPr>
+              <w:pStyle w:val="Compact"/>
+            </w:pPr>
+            <w:r>
+              <w:t xml:space="preserve">24</w:t>
+            </w:r>
+          </w:p>
+        </w:tc>
+      </w:tr>
+      <w:tr>
+        <w:tc>
+          <w:tcPr/>
+          <w:p>
+            <w:pPr>
+              <w:pStyle w:val="Compact"/>
+            </w:pPr>
+            <w:r>
+              <w:t xml:space="preserve">7</w:t>
+            </w:r>
+          </w:p>
+        </w:tc>
+        <w:tc>
+          <w:tcPr/>
+          <w:p>
+            <w:pPr>
+              <w:pStyle w:val="Compact"/>
+            </w:pPr>
+            <w:r>
+              <w:t xml:space="preserve">Plantilla inexistente</w:t>
+            </w:r>
+          </w:p>
+        </w:tc>
+        <w:tc>
+          <w:tcPr/>
+          <w:p>
+            <w:pPr>
+              <w:pStyle w:val="Compact"/>
+            </w:pPr>
+            <w:r>
+              <w:t xml:space="preserve">Prototype</w:t>
+            </w:r>
+          </w:p>
+        </w:tc>
+        <w:tc>
+          <w:tcPr/>
+          <w:p>
+            <w:pPr>
+              <w:pStyle w:val="Compact"/>
+            </w:pPr>
+            <w:r>
+              <w:rPr>
+                <w:rStyle w:val="VerbatimChar"/>
+              </w:rPr>
+              <w:t xml:space="preserve">IllegalArgumentException</w:t>
+            </w:r>
+            <w:r>
+              <w:t xml:space="preserve"> </w:t>
+            </w:r>
+            <w:r>
+              <w:t xml:space="preserve">con el nombre de la clave</w:t>
+            </w:r>
+          </w:p>
+        </w:tc>
+        <w:tc>
+          <w:tcPr/>
+          <w:p>
+            <w:pPr>
+              <w:pStyle w:val="Compact"/>
+            </w:pPr>
+            <w:r>
+              <w:rPr>
+                <w:rStyle w:val="VerbatimChar"/>
+              </w:rPr>
+              <w:t xml:space="preserve">No existe la plantilla 'papa-paramo'</w:t>
+            </w:r>
+          </w:p>
+        </w:tc>
+        <w:tc>
+          <w:tcPr/>
+          <w:p>
+            <w:pPr>
+              <w:pStyle w:val="Compact"/>
+            </w:pPr>
+            <w:r>
+              <w:t xml:space="preserve">✅ OK</w:t>
+            </w:r>
+          </w:p>
+        </w:tc>
+        <w:tc>
+          <w:tcPr/>
+          <w:p>
+            <w:pPr>
+              <w:pStyle w:val="Compact"/>
+            </w:pPr>
+            <w:r>
+              <w:t xml:space="preserve">24</w:t>
             </w:r>
           </w:p>
         </w:tc>

</xml_diff>

<commit_message>
Agregar diagramas UML a las semanas 3 a 6
- Diagramas de clases en Mermaid (fuente .mmd) renderizados a PNG, en
  diagramas/ dentro de cada semana.
- Singleton, Factory Method, Builder, Abstract Factory y Prototype.
- Cada README gana una sección 'Diagrama UML' antes de las evidencias.
- Word regenerado: 29 imágenes.
</commit_message>
<xml_diff>
--- a/Patrones-de-Software-E195.docx
+++ b/Patrones-de-Software-E195.docx
@@ -2898,6 +2898,246 @@
         <w:pStyle w:val="Heading2"/>
       </w:pPr>
       <w:r>
+        <w:t xml:space="preserve">Diagrama UML</w:t>
+      </w:r>
+    </w:p>
+    <w:p>
+      <w:pPr>
+        <w:pStyle w:val="CaptionedFigure"/>
+      </w:pPr>
+      <w:r>
+        <w:drawing>
+          <wp:inline>
+            <wp:extent cx="5334000" cy="3728357"/>
+            <wp:effectExtent b="0" l="0" r="0" t="0"/>
+            <wp:docPr descr="Diagrama UML del patrón Singleton" title="" id="10" name="Picture"/>
+            <a:graphic>
+              <a:graphicData uri="http://schemas.openxmlformats.org/drawingml/2006/picture">
+                <pic:pic>
+                  <pic:nvPicPr>
+                    <pic:cNvPr descr="semana-3-singleton/diagramas/uml-singleton.png" id="11" name="Picture"/>
+                    <pic:cNvPicPr>
+                      <a:picLocks noChangeArrowheads="1" noChangeAspect="1"/>
+                    </pic:cNvPicPr>
+                  </pic:nvPicPr>
+                  <pic:blipFill>
+                    <a:blip r:embed="rId9"/>
+                    <a:stretch>
+                      <a:fillRect/>
+                    </a:stretch>
+                  </pic:blipFill>
+                  <pic:spPr bwMode="auto">
+                    <a:xfrm>
+                      <a:off x="0" y="0"/>
+                      <a:ext cx="5334000" cy="3728357"/>
+                    </a:xfrm>
+                    <a:prstGeom prst="rect">
+                      <a:avLst/>
+                    </a:prstGeom>
+                    <a:noFill/>
+                    <a:ln w="9525">
+                      <a:noFill/>
+                      <a:headEnd/>
+                      <a:tailEnd/>
+                    </a:ln>
+                  </pic:spPr>
+                </pic:pic>
+              </a:graphicData>
+            </a:graphic>
+          </wp:inline>
+        </w:drawing>
+      </w:r>
+    </w:p>
+    <w:p>
+      <w:pPr>
+        <w:pStyle w:val="ImageCaption"/>
+      </w:pPr>
+      <w:r>
+        <w:t xml:space="preserve">Diagrama UML del patrón Singleton</w:t>
+      </w:r>
+    </w:p>
+    <w:p>
+      <w:pPr>
+        <w:pStyle w:val="BodyText"/>
+      </w:pPr>
+      <w:r>
+        <w:t xml:space="preserve">Los tres elementos del patrón se ven en ambas clases: el atributo estático que guarda la única</w:t>
+      </w:r>
+      <w:r>
+        <w:t xml:space="preserve"> </w:t>
+      </w:r>
+      <w:r>
+        <w:t xml:space="preserve">instancia, el constructor privado que impide el</w:t>
+      </w:r>
+      <w:r>
+        <w:t xml:space="preserve"> </w:t>
+      </w:r>
+      <w:r>
+        <w:rPr>
+          <w:rStyle w:val="VerbatimChar"/>
+        </w:rPr>
+        <w:t xml:space="preserve">new</w:t>
+      </w:r>
+      <w:r>
+        <w:t xml:space="preserve">, y el método estático</w:t>
+      </w:r>
+      <w:r>
+        <w:t xml:space="preserve"> </w:t>
+      </w:r>
+      <w:r>
+        <w:rPr>
+          <w:rStyle w:val="VerbatimChar"/>
+        </w:rPr>
+        <w:t xml:space="preserve">getInstancia()</w:t>
+      </w:r>
+      <w:r>
+        <w:t xml:space="preserve"> </w:t>
+      </w:r>
+      <w:r>
+        <w:t xml:space="preserve">como</w:t>
+      </w:r>
+      <w:r>
+        <w:t xml:space="preserve"> </w:t>
+      </w:r>
+      <w:r>
+        <w:t xml:space="preserve">punto de acceso global. La diferencia está en cómo se crea esa instancia:</w:t>
+      </w:r>
+      <w:r>
+        <w:t xml:space="preserve"> </w:t>
+      </w:r>
+      <w:r>
+        <w:rPr>
+          <w:rStyle w:val="VerbatimChar"/>
+        </w:rPr>
+        <w:t xml:space="preserve">SesionUsuario</w:t>
+      </w:r>
+      <w:r>
+        <w:t xml:space="preserve"> </w:t>
+      </w:r>
+      <w:r>
+        <w:t xml:space="preserve">la crea</w:t>
+      </w:r>
+      <w:r>
+        <w:t xml:space="preserve"> </w:t>
+      </w:r>
+      <w:r>
+        <w:t xml:space="preserve">en la primera llamada (</w:t>
+      </w:r>
+      <w:r>
+        <w:rPr>
+          <w:i/>
+          <w:iCs/>
+        </w:rPr>
+        <w:t xml:space="preserve">lazy</w:t>
+      </w:r>
+      <w:r>
+        <w:t xml:space="preserve">, con</w:t>
+      </w:r>
+      <w:r>
+        <w:t xml:space="preserve"> </w:t>
+      </w:r>
+      <w:r>
+        <w:rPr>
+          <w:rStyle w:val="VerbatimChar"/>
+        </w:rPr>
+        <w:t xml:space="preserve">getInstancia()</w:t>
+      </w:r>
+      <w:r>
+        <w:t xml:space="preserve"> </w:t>
+      </w:r>
+      <w:r>
+        <w:t xml:space="preserve">sincronizado) y</w:t>
+      </w:r>
+      <w:r>
+        <w:t xml:space="preserve"> </w:t>
+      </w:r>
+      <w:r>
+        <w:rPr>
+          <w:rStyle w:val="VerbatimChar"/>
+        </w:rPr>
+        <w:t xml:space="preserve">ConfiguracionSistema</w:t>
+      </w:r>
+      <w:r>
+        <w:t xml:space="preserve"> </w:t>
+      </w:r>
+      <w:r>
+        <w:t xml:space="preserve">al</w:t>
+      </w:r>
+      <w:r>
+        <w:t xml:space="preserve"> </w:t>
+      </w:r>
+      <w:r>
+        <w:t xml:space="preserve">cargar la clase (</w:t>
+      </w:r>
+      <w:r>
+        <w:rPr>
+          <w:i/>
+          <w:iCs/>
+        </w:rPr>
+        <w:t xml:space="preserve">eager</w:t>
+      </w:r>
+      <w:r>
+        <w:t xml:space="preserve">, con</w:t>
+      </w:r>
+      <w:r>
+        <w:t xml:space="preserve"> </w:t>
+      </w:r>
+      <w:r>
+        <w:rPr>
+          <w:rStyle w:val="VerbatimChar"/>
+        </w:rPr>
+        <w:t xml:space="preserve">static final</w:t>
+      </w:r>
+      <w:r>
+        <w:t xml:space="preserve">).</w:t>
+      </w:r>
+      <w:r>
+        <w:t xml:space="preserve"> </w:t>
+      </w:r>
+      <w:r>
+        <w:rPr>
+          <w:rStyle w:val="VerbatimChar"/>
+        </w:rPr>
+        <w:t xml:space="preserve">ModuloRiego</w:t>
+      </w:r>
+      <w:r>
+        <w:t xml:space="preserve"> </w:t>
+      </w:r>
+      <w:r>
+        <w:t xml:space="preserve">muestra el uso típico: obtiene lo que</w:t>
+      </w:r>
+      <w:r>
+        <w:t xml:space="preserve"> </w:t>
+      </w:r>
+      <w:r>
+        <w:t xml:space="preserve">necesita sin recibirlo por parámetro.</w:t>
+      </w:r>
+    </w:p>
+    <w:p>
+      <w:pPr>
+        <w:pStyle w:val="BodyText"/>
+      </w:pPr>
+      <w:r>
+        <w:t xml:space="preserve">Fuente del diagrama:</w:t>
+      </w:r>
+      <w:r>
+        <w:t xml:space="preserve"> </w:t>
+      </w:r>
+      <w:r>
+        <w:rPr>
+          <w:rStyle w:val="VerbatimChar"/>
+        </w:rPr>
+        <w:t xml:space="preserve">diagramas/uml-singleton.mmd</w:t>
+      </w:r>
+      <w:r>
+        <w:t xml:space="preserve">.</w:t>
+      </w:r>
+    </w:p>
+    <w:p>
+      <w:pPr>
+        <w:pStyle w:val="Heading2"/>
+      </w:pPr>
+      <w:r>
         <w:t xml:space="preserve">Evidencias</w:t>
       </w:r>
     </w:p>
@@ -3185,18 +3425,18 @@
           <wp:inline>
             <wp:extent cx="5334000" cy="4174149"/>
             <wp:effectExtent b="0" l="0" r="0" t="0"/>
-            <wp:docPr descr="Captura 1" title="" id="10" name="Picture"/>
+            <wp:docPr descr="Captura 1" title="" id="13" name="Picture"/>
             <a:graphic>
               <a:graphicData uri="http://schemas.openxmlformats.org/drawingml/2006/picture">
                 <pic:pic>
                   <pic:nvPicPr>
-                    <pic:cNvPr descr="semana-3-singleton/evidencias/captura_1.png" id="11" name="Picture"/>
+                    <pic:cNvPr descr="semana-3-singleton/evidencias/captura_1.png" id="14" name="Picture"/>
                     <pic:cNvPicPr>
                       <a:picLocks noChangeArrowheads="1" noChangeAspect="1"/>
                     </pic:cNvPicPr>
                   </pic:nvPicPr>
                   <pic:blipFill>
-                    <a:blip r:embed="rId9"/>
+                    <a:blip r:embed="rId12"/>
                     <a:stretch>
                       <a:fillRect/>
                     </a:stretch>
@@ -3443,18 +3683,18 @@
           <wp:inline>
             <wp:extent cx="5334000" cy="2158228"/>
             <wp:effectExtent b="0" l="0" r="0" t="0"/>
-            <wp:docPr descr="Captura 2" title="" id="13" name="Picture"/>
+            <wp:docPr descr="Captura 2" title="" id="16" name="Picture"/>
             <a:graphic>
               <a:graphicData uri="http://schemas.openxmlformats.org/drawingml/2006/picture">
                 <pic:pic>
                   <pic:nvPicPr>
-                    <pic:cNvPr descr="semana-3-singleton/evidencias/captura_2.png" id="14" name="Picture"/>
+                    <pic:cNvPr descr="semana-3-singleton/evidencias/captura_2.png" id="17" name="Picture"/>
                     <pic:cNvPicPr>
                       <a:picLocks noChangeArrowheads="1" noChangeAspect="1"/>
                     </pic:cNvPicPr>
                   </pic:nvPicPr>
                   <pic:blipFill>
-                    <a:blip r:embed="rId12"/>
+                    <a:blip r:embed="rId15"/>
                     <a:stretch>
                       <a:fillRect/>
                     </a:stretch>
@@ -3612,18 +3852,18 @@
           <wp:inline>
             <wp:extent cx="5334000" cy="1424491"/>
             <wp:effectExtent b="0" l="0" r="0" t="0"/>
-            <wp:docPr descr="Captura 3" title="" id="16" name="Picture"/>
+            <wp:docPr descr="Captura 3" title="" id="19" name="Picture"/>
             <a:graphic>
               <a:graphicData uri="http://schemas.openxmlformats.org/drawingml/2006/picture">
                 <pic:pic>
                   <pic:nvPicPr>
-                    <pic:cNvPr descr="semana-3-singleton/evidencias/captura_3.png" id="17" name="Picture"/>
+                    <pic:cNvPr descr="semana-3-singleton/evidencias/captura_3.png" id="20" name="Picture"/>
                     <pic:cNvPicPr>
                       <a:picLocks noChangeArrowheads="1" noChangeAspect="1"/>
                     </pic:cNvPicPr>
                   </pic:nvPicPr>
                   <pic:blipFill>
-                    <a:blip r:embed="rId15"/>
+                    <a:blip r:embed="rId18"/>
                     <a:stretch>
                       <a:fillRect/>
                     </a:stretch>
@@ -3765,18 +4005,18 @@
           <wp:inline>
             <wp:extent cx="5334000" cy="3584820"/>
             <wp:effectExtent b="0" l="0" r="0" t="0"/>
-            <wp:docPr descr="Captura 4" title="" id="19" name="Picture"/>
+            <wp:docPr descr="Captura 4" title="" id="22" name="Picture"/>
             <a:graphic>
               <a:graphicData uri="http://schemas.openxmlformats.org/drawingml/2006/picture">
                 <pic:pic>
                   <pic:nvPicPr>
-                    <pic:cNvPr descr="semana-3-singleton/evidencias/captura_4.png" id="20" name="Picture"/>
+                    <pic:cNvPr descr="semana-3-singleton/evidencias/captura_4.png" id="23" name="Picture"/>
                     <pic:cNvPicPr>
                       <a:picLocks noChangeArrowheads="1" noChangeAspect="1"/>
                     </pic:cNvPicPr>
                   </pic:nvPicPr>
                   <pic:blipFill>
-                    <a:blip r:embed="rId18"/>
+                    <a:blip r:embed="rId21"/>
                     <a:stretch>
                       <a:fillRect/>
                     </a:stretch>
@@ -4235,18 +4475,18 @@
           <wp:inline>
             <wp:extent cx="5334000" cy="2262711"/>
             <wp:effectExtent b="0" l="0" r="0" t="0"/>
-            <wp:docPr descr="Captura 5" title="" id="22" name="Picture"/>
+            <wp:docPr descr="Captura 5" title="" id="25" name="Picture"/>
             <a:graphic>
               <a:graphicData uri="http://schemas.openxmlformats.org/drawingml/2006/picture">
                 <pic:pic>
                   <pic:nvPicPr>
-                    <pic:cNvPr descr="semana-3-singleton/evidencias/captura_5.png" id="23" name="Picture"/>
+                    <pic:cNvPr descr="semana-3-singleton/evidencias/captura_5.png" id="26" name="Picture"/>
                     <pic:cNvPicPr>
                       <a:picLocks noChangeArrowheads="1" noChangeAspect="1"/>
                     </pic:cNvPicPr>
                   </pic:nvPicPr>
                   <pic:blipFill>
-                    <a:blip r:embed="rId21"/>
+                    <a:blip r:embed="rId24"/>
                     <a:stretch>
                       <a:fillRect/>
                     </a:stretch>
@@ -4483,18 +4723,18 @@
           <wp:inline>
             <wp:extent cx="5334000" cy="4200361"/>
             <wp:effectExtent b="0" l="0" r="0" t="0"/>
-            <wp:docPr descr="Captura 6" title="" id="25" name="Picture"/>
+            <wp:docPr descr="Captura 6" title="" id="28" name="Picture"/>
             <a:graphic>
               <a:graphicData uri="http://schemas.openxmlformats.org/drawingml/2006/picture">
                 <pic:pic>
                   <pic:nvPicPr>
-                    <pic:cNvPr descr="semana-3-singleton/evidencias/captura_6.png" id="26" name="Picture"/>
+                    <pic:cNvPr descr="semana-3-singleton/evidencias/captura_6.png" id="29" name="Picture"/>
                     <pic:cNvPicPr>
                       <a:picLocks noChangeArrowheads="1" noChangeAspect="1"/>
                     </pic:cNvPicPr>
                   </pic:nvPicPr>
                   <pic:blipFill>
-                    <a:blip r:embed="rId24"/>
+                    <a:blip r:embed="rId27"/>
                     <a:stretch>
                       <a:fillRect/>
                     </a:stretch>
@@ -5841,24 +6081,7 @@
         <w:pStyle w:val="Heading2"/>
       </w:pPr>
       <w:r>
-        <w:t xml:space="preserve">Evidencias de la Semana 4</w:t>
-      </w:r>
-    </w:p>
-    <w:p>
-      <w:pPr>
-        <w:pStyle w:val="Heading3"/>
-      </w:pPr>
-      <w:r>
-        <w:t xml:space="preserve">Captura 7 — La interfaz</w:t>
-      </w:r>
-      <w:r>
-        <w:t xml:space="preserve"> </w:t>
-      </w:r>
-      <w:r>
-        <w:rPr>
-          <w:rStyle w:val="VerbatimChar"/>
-        </w:rPr>
-        <w:t xml:space="preserve">Sensor</w:t>
+        <w:t xml:space="preserve">Diagrama UML de la Semana 4</w:t>
       </w:r>
     </w:p>
     <w:p>
@@ -5868,20 +6091,225 @@
       <w:r>
         <w:drawing>
           <wp:inline>
-            <wp:extent cx="5334000" cy="2151835"/>
+            <wp:extent cx="5334000" cy="3326946"/>
             <wp:effectExtent b="0" l="0" r="0" t="0"/>
-            <wp:docPr descr="Captura 7" title="" id="28" name="Picture"/>
+            <wp:docPr descr="Diagrama UML del patrón Factory Method" title="" id="31" name="Picture"/>
             <a:graphic>
               <a:graphicData uri="http://schemas.openxmlformats.org/drawingml/2006/picture">
                 <pic:pic>
                   <pic:nvPicPr>
-                    <pic:cNvPr descr="semana-4-factory-method/evidencias/captura_7.png" id="29" name="Picture"/>
+                    <pic:cNvPr descr="semana-4-factory-method/diagramas/uml-factory-method.png" id="32" name="Picture"/>
                     <pic:cNvPicPr>
                       <a:picLocks noChangeArrowheads="1" noChangeAspect="1"/>
                     </pic:cNvPicPr>
                   </pic:nvPicPr>
                   <pic:blipFill>
-                    <a:blip r:embed="rId27"/>
+                    <a:blip r:embed="rId30"/>
+                    <a:stretch>
+                      <a:fillRect/>
+                    </a:stretch>
+                  </pic:blipFill>
+                  <pic:spPr bwMode="auto">
+                    <a:xfrm>
+                      <a:off x="0" y="0"/>
+                      <a:ext cx="5334000" cy="3326946"/>
+                    </a:xfrm>
+                    <a:prstGeom prst="rect">
+                      <a:avLst/>
+                    </a:prstGeom>
+                    <a:noFill/>
+                    <a:ln w="9525">
+                      <a:noFill/>
+                      <a:headEnd/>
+                      <a:tailEnd/>
+                    </a:ln>
+                  </pic:spPr>
+                </pic:pic>
+              </a:graphicData>
+            </a:graphic>
+          </wp:inline>
+        </w:drawing>
+      </w:r>
+    </w:p>
+    <w:p>
+      <w:pPr>
+        <w:pStyle w:val="ImageCaption"/>
+      </w:pPr>
+      <w:r>
+        <w:t xml:space="preserve">Diagrama UML del patrón Factory Method</w:t>
+      </w:r>
+    </w:p>
+    <w:p>
+      <w:pPr>
+        <w:pStyle w:val="BodyText"/>
+      </w:pPr>
+      <w:r>
+        <w:t xml:space="preserve">Se ven las dos jerarquías paralelas que exige el patrón: la de productos, encabezada por la</w:t>
+      </w:r>
+      <w:r>
+        <w:t xml:space="preserve"> </w:t>
+      </w:r>
+      <w:r>
+        <w:t xml:space="preserve">interfaz</w:t>
+      </w:r>
+      <w:r>
+        <w:t xml:space="preserve"> </w:t>
+      </w:r>
+      <w:r>
+        <w:rPr>
+          <w:rStyle w:val="VerbatimChar"/>
+        </w:rPr>
+        <w:t xml:space="preserve">Sensor</w:t>
+      </w:r>
+      <w:r>
+        <w:t xml:space="preserve">, y la de creadores, encabezada por la clase abstracta</w:t>
+      </w:r>
+      <w:r>
+        <w:t xml:space="preserve"> </w:t>
+      </w:r>
+      <w:r>
+        <w:rPr>
+          <w:rStyle w:val="VerbatimChar"/>
+        </w:rPr>
+        <w:t xml:space="preserve">CreadorSensor</w:t>
+      </w:r>
+      <w:r>
+        <w:t xml:space="preserve">. El</w:t>
+      </w:r>
+      <w:r>
+        <w:t xml:space="preserve"> </w:t>
+      </w:r>
+      <w:r>
+        <w:rPr>
+          <w:i/>
+          <w:iCs/>
+        </w:rPr>
+        <w:t xml:space="preserve">factory method</w:t>
+      </w:r>
+      <w:r>
+        <w:t xml:space="preserve"> </w:t>
+      </w:r>
+      <w:r>
+        <w:t xml:space="preserve">es</w:t>
+      </w:r>
+      <w:r>
+        <w:t xml:space="preserve"> </w:t>
+      </w:r>
+      <w:r>
+        <w:rPr>
+          <w:rStyle w:val="VerbatimChar"/>
+        </w:rPr>
+        <w:t xml:space="preserve">crearSensor()</w:t>
+      </w:r>
+      <w:r>
+        <w:t xml:space="preserve">, en cursiva por ser abstracto: cada creador concreto lo</w:t>
+      </w:r>
+      <w:r>
+        <w:t xml:space="preserve"> </w:t>
+      </w:r>
+      <w:r>
+        <w:t xml:space="preserve">implementa devolviendo su propio producto.</w:t>
+      </w:r>
+      <w:r>
+        <w:t xml:space="preserve"> </w:t>
+      </w:r>
+      <w:r>
+        <w:rPr>
+          <w:rStyle w:val="VerbatimChar"/>
+        </w:rPr>
+        <w:t xml:space="preserve">tomarLectura()</w:t>
+      </w:r>
+      <w:r>
+        <w:t xml:space="preserve"> </w:t>
+      </w:r>
+      <w:r>
+        <w:t xml:space="preserve">es la operación real del sistema y</w:t>
+      </w:r>
+      <w:r>
+        <w:t xml:space="preserve"> </w:t>
+      </w:r>
+      <w:r>
+        <w:t xml:space="preserve">trabaja contra la interfaz</w:t>
+      </w:r>
+      <w:r>
+        <w:t xml:space="preserve"> </w:t>
+      </w:r>
+      <w:r>
+        <w:rPr>
+          <w:rStyle w:val="VerbatimChar"/>
+        </w:rPr>
+        <w:t xml:space="preserve">Sensor</w:t>
+      </w:r>
+      <w:r>
+        <w:t xml:space="preserve">, por eso no conoce ninguna clase concreta.</w:t>
+      </w:r>
+    </w:p>
+    <w:p>
+      <w:pPr>
+        <w:pStyle w:val="BodyText"/>
+      </w:pPr>
+      <w:r>
+        <w:t xml:space="preserve">Fuente del diagrama:</w:t>
+      </w:r>
+      <w:r>
+        <w:t xml:space="preserve"> </w:t>
+      </w:r>
+      <w:r>
+        <w:rPr>
+          <w:rStyle w:val="VerbatimChar"/>
+        </w:rPr>
+        <w:t xml:space="preserve">diagramas/uml-factory-method.mmd</w:t>
+      </w:r>
+      <w:r>
+        <w:t xml:space="preserve">.</w:t>
+      </w:r>
+    </w:p>
+    <w:p>
+      <w:pPr>
+        <w:pStyle w:val="Heading2"/>
+      </w:pPr>
+      <w:r>
+        <w:t xml:space="preserve">Evidencias de la Semana 4</w:t>
+      </w:r>
+    </w:p>
+    <w:p>
+      <w:pPr>
+        <w:pStyle w:val="Heading3"/>
+      </w:pPr>
+      <w:r>
+        <w:t xml:space="preserve">Captura 7 — La interfaz</w:t>
+      </w:r>
+      <w:r>
+        <w:t xml:space="preserve"> </w:t>
+      </w:r>
+      <w:r>
+        <w:rPr>
+          <w:rStyle w:val="VerbatimChar"/>
+        </w:rPr>
+        <w:t xml:space="preserve">Sensor</w:t>
+      </w:r>
+    </w:p>
+    <w:p>
+      <w:pPr>
+        <w:pStyle w:val="CaptionedFigure"/>
+      </w:pPr>
+      <w:r>
+        <w:drawing>
+          <wp:inline>
+            <wp:extent cx="5334000" cy="2151835"/>
+            <wp:effectExtent b="0" l="0" r="0" t="0"/>
+            <wp:docPr descr="Captura 7" title="" id="34" name="Picture"/>
+            <a:graphic>
+              <a:graphicData uri="http://schemas.openxmlformats.org/drawingml/2006/picture">
+                <pic:pic>
+                  <pic:nvPicPr>
+                    <pic:cNvPr descr="semana-4-factory-method/evidencias/captura_7.png" id="35" name="Picture"/>
+                    <pic:cNvPicPr>
+                      <a:picLocks noChangeArrowheads="1" noChangeAspect="1"/>
+                    </pic:cNvPicPr>
+                  </pic:nvPicPr>
+                  <pic:blipFill>
+                    <a:blip r:embed="rId33"/>
                     <a:stretch>
                       <a:fillRect/>
                     </a:stretch>
@@ -6039,18 +6467,18 @@
           <wp:inline>
             <wp:extent cx="5334000" cy="4522926"/>
             <wp:effectExtent b="0" l="0" r="0" t="0"/>
-            <wp:docPr descr="Captura 8" title="" id="31" name="Picture"/>
+            <wp:docPr descr="Captura 8" title="" id="37" name="Picture"/>
             <a:graphic>
               <a:graphicData uri="http://schemas.openxmlformats.org/drawingml/2006/picture">
                 <pic:pic>
                   <pic:nvPicPr>
-                    <pic:cNvPr descr="semana-4-factory-method/evidencias/captura_8.png" id="32" name="Picture"/>
+                    <pic:cNvPr descr="semana-4-factory-method/evidencias/captura_8.png" id="38" name="Picture"/>
                     <pic:cNvPicPr>
                       <a:picLocks noChangeArrowheads="1" noChangeAspect="1"/>
                     </pic:cNvPicPr>
                   </pic:nvPicPr>
                   <pic:blipFill>
-                    <a:blip r:embed="rId30"/>
+                    <a:blip r:embed="rId36"/>
                     <a:stretch>
                       <a:fillRect/>
                     </a:stretch>
@@ -6182,18 +6610,18 @@
           <wp:inline>
             <wp:extent cx="5334000" cy="2991101"/>
             <wp:effectExtent b="0" l="0" r="0" t="0"/>
-            <wp:docPr descr="Captura 9" title="" id="34" name="Picture"/>
+            <wp:docPr descr="Captura 9" title="" id="40" name="Picture"/>
             <a:graphic>
               <a:graphicData uri="http://schemas.openxmlformats.org/drawingml/2006/picture">
                 <pic:pic>
                   <pic:nvPicPr>
-                    <pic:cNvPr descr="semana-4-factory-method/evidencias/captura_9.png" id="35" name="Picture"/>
+                    <pic:cNvPr descr="semana-4-factory-method/evidencias/captura_9.png" id="41" name="Picture"/>
                     <pic:cNvPicPr>
                       <a:picLocks noChangeArrowheads="1" noChangeAspect="1"/>
                     </pic:cNvPicPr>
                   </pic:nvPicPr>
                   <pic:blipFill>
-                    <a:blip r:embed="rId33"/>
+                    <a:blip r:embed="rId39"/>
                     <a:stretch>
                       <a:fillRect/>
                     </a:stretch>
@@ -6420,18 +6848,18 @@
           <wp:inline>
             <wp:extent cx="5334000" cy="2028743"/>
             <wp:effectExtent b="0" l="0" r="0" t="0"/>
-            <wp:docPr descr="Captura 10" title="" id="37" name="Picture"/>
+            <wp:docPr descr="Captura 10" title="" id="43" name="Picture"/>
             <a:graphic>
               <a:graphicData uri="http://schemas.openxmlformats.org/drawingml/2006/picture">
                 <pic:pic>
                   <pic:nvPicPr>
-                    <pic:cNvPr descr="semana-4-factory-method/evidencias/captura_10.png" id="38" name="Picture"/>
+                    <pic:cNvPr descr="semana-4-factory-method/evidencias/captura_10.png" id="44" name="Picture"/>
                     <pic:cNvPicPr>
                       <a:picLocks noChangeArrowheads="1" noChangeAspect="1"/>
                     </pic:cNvPicPr>
                   </pic:nvPicPr>
                   <pic:blipFill>
-                    <a:blip r:embed="rId36"/>
+                    <a:blip r:embed="rId42"/>
                     <a:stretch>
                       <a:fillRect/>
                     </a:stretch>
@@ -6564,18 +6992,18 @@
           <wp:inline>
             <wp:extent cx="5334000" cy="5865216"/>
             <wp:effectExtent b="0" l="0" r="0" t="0"/>
-            <wp:docPr descr="Captura 11" title="" id="40" name="Picture"/>
+            <wp:docPr descr="Captura 11" title="" id="46" name="Picture"/>
             <a:graphic>
               <a:graphicData uri="http://schemas.openxmlformats.org/drawingml/2006/picture">
                 <pic:pic>
                   <pic:nvPicPr>
-                    <pic:cNvPr descr="semana-4-factory-method/evidencias/captura_11.png" id="41" name="Picture"/>
+                    <pic:cNvPr descr="semana-4-factory-method/evidencias/captura_11.png" id="47" name="Picture"/>
                     <pic:cNvPicPr>
                       <a:picLocks noChangeArrowheads="1" noChangeAspect="1"/>
                     </pic:cNvPicPr>
                   </pic:nvPicPr>
                   <pic:blipFill>
-                    <a:blip r:embed="rId39"/>
+                    <a:blip r:embed="rId45"/>
                     <a:stretch>
                       <a:fillRect/>
                     </a:stretch>
@@ -6771,18 +7199,18 @@
           <wp:inline>
             <wp:extent cx="5334000" cy="2750795"/>
             <wp:effectExtent b="0" l="0" r="0" t="0"/>
-            <wp:docPr descr="Captura 12" title="" id="43" name="Picture"/>
+            <wp:docPr descr="Captura 12" title="" id="49" name="Picture"/>
             <a:graphic>
               <a:graphicData uri="http://schemas.openxmlformats.org/drawingml/2006/picture">
                 <pic:pic>
                   <pic:nvPicPr>
-                    <pic:cNvPr descr="semana-4-factory-method/evidencias/captura_12.png" id="44" name="Picture"/>
+                    <pic:cNvPr descr="semana-4-factory-method/evidencias/captura_12.png" id="50" name="Picture"/>
                     <pic:cNvPicPr>
                       <a:picLocks noChangeArrowheads="1" noChangeAspect="1"/>
                     </pic:cNvPicPr>
                   </pic:nvPicPr>
                   <pic:blipFill>
-                    <a:blip r:embed="rId42"/>
+                    <a:blip r:embed="rId48"/>
                     <a:stretch>
                       <a:fillRect/>
                     </a:stretch>
@@ -9072,6 +9500,205 @@
         <w:pStyle w:val="Heading2"/>
       </w:pPr>
       <w:r>
+        <w:t xml:space="preserve">Diagrama UML</w:t>
+      </w:r>
+    </w:p>
+    <w:p>
+      <w:pPr>
+        <w:pStyle w:val="CaptionedFigure"/>
+      </w:pPr>
+      <w:r>
+        <w:drawing>
+          <wp:inline>
+            <wp:extent cx="5334000" cy="1204232"/>
+            <wp:effectExtent b="0" l="0" r="0" t="0"/>
+            <wp:docPr descr="Diagrama UML del patrón Builder" title="" id="52" name="Picture"/>
+            <a:graphic>
+              <a:graphicData uri="http://schemas.openxmlformats.org/drawingml/2006/picture">
+                <pic:pic>
+                  <pic:nvPicPr>
+                    <pic:cNvPr descr="semana-5-builder/diagramas/uml-builder.png" id="53" name="Picture"/>
+                    <pic:cNvPicPr>
+                      <a:picLocks noChangeArrowheads="1" noChangeAspect="1"/>
+                    </pic:cNvPicPr>
+                  </pic:nvPicPr>
+                  <pic:blipFill>
+                    <a:blip r:embed="rId51"/>
+                    <a:stretch>
+                      <a:fillRect/>
+                    </a:stretch>
+                  </pic:blipFill>
+                  <pic:spPr bwMode="auto">
+                    <a:xfrm>
+                      <a:off x="0" y="0"/>
+                      <a:ext cx="5334000" cy="1204232"/>
+                    </a:xfrm>
+                    <a:prstGeom prst="rect">
+                      <a:avLst/>
+                    </a:prstGeom>
+                    <a:noFill/>
+                    <a:ln w="9525">
+                      <a:noFill/>
+                      <a:headEnd/>
+                      <a:tailEnd/>
+                    </a:ln>
+                  </pic:spPr>
+                </pic:pic>
+              </a:graphicData>
+            </a:graphic>
+          </wp:inline>
+        </w:drawing>
+      </w:r>
+    </w:p>
+    <w:p>
+      <w:pPr>
+        <w:pStyle w:val="ImageCaption"/>
+      </w:pPr>
+      <w:r>
+        <w:t xml:space="preserve">Diagrama UML del patrón Builder</w:t>
+      </w:r>
+    </w:p>
+    <w:p>
+      <w:pPr>
+        <w:pStyle w:val="BodyText"/>
+      </w:pPr>
+      <w:r>
+        <w:rPr>
+          <w:rStyle w:val="VerbatimChar"/>
+        </w:rPr>
+        <w:t xml:space="preserve">DirectorReportes</w:t>
+      </w:r>
+      <w:r>
+        <w:t xml:space="preserve"> </w:t>
+      </w:r>
+      <w:r>
+        <w:t xml:space="preserve">solo conoce la interfaz</w:t>
+      </w:r>
+      <w:r>
+        <w:t xml:space="preserve"> </w:t>
+      </w:r>
+      <w:r>
+        <w:rPr>
+          <w:rStyle w:val="VerbatimChar"/>
+        </w:rPr>
+        <w:t xml:space="preserve">ReporteBuilder</w:t>
+      </w:r>
+      <w:r>
+        <w:t xml:space="preserve">, nunca al builder concreto ni al</w:t>
+      </w:r>
+      <w:r>
+        <w:t xml:space="preserve"> </w:t>
+      </w:r>
+      <w:r>
+        <w:t xml:space="preserve">producto que este arma.</w:t>
+      </w:r>
+      <w:r>
+        <w:t xml:space="preserve"> </w:t>
+      </w:r>
+      <w:r>
+        <w:rPr>
+          <w:rStyle w:val="VerbatimChar"/>
+        </w:rPr>
+        <w:t xml:space="preserve">ReporteConsolaBuilder</w:t>
+      </w:r>
+      <w:r>
+        <w:t xml:space="preserve"> </w:t>
+      </w:r>
+      <w:r>
+        <w:t xml:space="preserve">acumula las partes y es el único que construye</w:t>
+      </w:r>
+      <w:r>
+        <w:t xml:space="preserve"> </w:t>
+      </w:r>
+      <w:r>
+        <w:rPr>
+          <w:rStyle w:val="VerbatimChar"/>
+        </w:rPr>
+        <w:t xml:space="preserve">ReporteFinca</w:t>
+      </w:r>
+      <w:r>
+        <w:t xml:space="preserve">, cuyo constructor es de paquete: por eso ningún otro objeto puede crear un reporte</w:t>
+      </w:r>
+      <w:r>
+        <w:t xml:space="preserve"> </w:t>
+      </w:r>
+      <w:r>
+        <w:t xml:space="preserve">a medio armar. La flecha punteada de</w:t>
+      </w:r>
+      <w:r>
+        <w:t xml:space="preserve"> </w:t>
+      </w:r>
+      <w:r>
+        <w:rPr>
+          <w:rStyle w:val="VerbatimChar"/>
+        </w:rPr>
+        <w:t xml:space="preserve">ReporteConsolaBuilder</w:t>
+      </w:r>
+      <w:r>
+        <w:t xml:space="preserve"> </w:t>
+      </w:r>
+      <w:r>
+        <w:t xml:space="preserve">a</w:t>
+      </w:r>
+      <w:r>
+        <w:t xml:space="preserve"> </w:t>
+      </w:r>
+      <w:r>
+        <w:rPr>
+          <w:rStyle w:val="VerbatimChar"/>
+        </w:rPr>
+        <w:t xml:space="preserve">ReporteFinca</w:t>
+      </w:r>
+      <w:r>
+        <w:t xml:space="preserve"> </w:t>
+      </w:r>
+      <w:r>
+        <w:t xml:space="preserve">es la creación del</w:t>
+      </w:r>
+      <w:r>
+        <w:t xml:space="preserve"> </w:t>
+      </w:r>
+      <w:r>
+        <w:t xml:space="preserve">producto en</w:t>
+      </w:r>
+      <w:r>
+        <w:t xml:space="preserve"> </w:t>
+      </w:r>
+      <w:r>
+        <w:rPr>
+          <w:rStyle w:val="VerbatimChar"/>
+        </w:rPr>
+        <w:t xml:space="preserve">construir()</w:t>
+      </w:r>
+      <w:r>
+        <w:t xml:space="preserve">.</w:t>
+      </w:r>
+    </w:p>
+    <w:p>
+      <w:pPr>
+        <w:pStyle w:val="BodyText"/>
+      </w:pPr>
+      <w:r>
+        <w:t xml:space="preserve">Fuente del diagrama:</w:t>
+      </w:r>
+      <w:r>
+        <w:t xml:space="preserve"> </w:t>
+      </w:r>
+      <w:r>
+        <w:rPr>
+          <w:rStyle w:val="VerbatimChar"/>
+        </w:rPr>
+        <w:t xml:space="preserve">diagramas/uml-builder.mmd</w:t>
+      </w:r>
+      <w:r>
+        <w:t xml:space="preserve">.</w:t>
+      </w:r>
+    </w:p>
+    <w:p>
+      <w:pPr>
+        <w:pStyle w:val="Heading2"/>
+      </w:pPr>
+      <w:r>
         <w:t xml:space="preserve">Evidencias</w:t>
       </w:r>
     </w:p>
@@ -9368,18 +9995,18 @@
           <wp:inline>
             <wp:extent cx="5334000" cy="1658790"/>
             <wp:effectExtent b="0" l="0" r="0" t="0"/>
-            <wp:docPr descr="Captura 13" title="" id="46" name="Picture"/>
+            <wp:docPr descr="Captura 13" title="" id="55" name="Picture"/>
             <a:graphic>
               <a:graphicData uri="http://schemas.openxmlformats.org/drawingml/2006/picture">
                 <pic:pic>
                   <pic:nvPicPr>
-                    <pic:cNvPr descr="semana-5-builder/evidencias/captura_13.png" id="47" name="Picture"/>
+                    <pic:cNvPr descr="semana-5-builder/evidencias/captura_13.png" id="56" name="Picture"/>
                     <pic:cNvPicPr>
                       <a:picLocks noChangeArrowheads="1" noChangeAspect="1"/>
                     </pic:cNvPicPr>
                   </pic:nvPicPr>
                   <pic:blipFill>
-                    <a:blip r:embed="rId45"/>
+                    <a:blip r:embed="rId54"/>
                     <a:stretch>
                       <a:fillRect/>
                     </a:stretch>
@@ -9536,18 +10163,18 @@
           <wp:inline>
             <wp:extent cx="5334000" cy="2183847"/>
             <wp:effectExtent b="0" l="0" r="0" t="0"/>
-            <wp:docPr descr="Captura 14" title="" id="49" name="Picture"/>
+            <wp:docPr descr="Captura 14" title="" id="58" name="Picture"/>
             <a:graphic>
               <a:graphicData uri="http://schemas.openxmlformats.org/drawingml/2006/picture">
                 <pic:pic>
                   <pic:nvPicPr>
-                    <pic:cNvPr descr="semana-5-builder/evidencias/captura_14.png" id="50" name="Picture"/>
+                    <pic:cNvPr descr="semana-5-builder/evidencias/captura_14.png" id="59" name="Picture"/>
                     <pic:cNvPicPr>
                       <a:picLocks noChangeArrowheads="1" noChangeAspect="1"/>
                     </pic:cNvPicPr>
                   </pic:nvPicPr>
                   <pic:blipFill>
-                    <a:blip r:embed="rId48"/>
+                    <a:blip r:embed="rId57"/>
                     <a:stretch>
                       <a:fillRect/>
                     </a:stretch>
@@ -9689,18 +10316,18 @@
           <wp:inline>
             <wp:extent cx="5334000" cy="3138094"/>
             <wp:effectExtent b="0" l="0" r="0" t="0"/>
-            <wp:docPr descr="Captura 15" title="" id="52" name="Picture"/>
+            <wp:docPr descr="Captura 15" title="" id="61" name="Picture"/>
             <a:graphic>
               <a:graphicData uri="http://schemas.openxmlformats.org/drawingml/2006/picture">
                 <pic:pic>
                   <pic:nvPicPr>
-                    <pic:cNvPr descr="semana-5-builder/evidencias/captura_15.png" id="53" name="Picture"/>
+                    <pic:cNvPr descr="semana-5-builder/evidencias/captura_15.png" id="62" name="Picture"/>
                     <pic:cNvPicPr>
                       <a:picLocks noChangeArrowheads="1" noChangeAspect="1"/>
                     </pic:cNvPicPr>
                   </pic:nvPicPr>
                   <pic:blipFill>
-                    <a:blip r:embed="rId51"/>
+                    <a:blip r:embed="rId60"/>
                     <a:stretch>
                       <a:fillRect/>
                     </a:stretch>
@@ -9875,18 +10502,18 @@
           <wp:inline>
             <wp:extent cx="5334000" cy="4130842"/>
             <wp:effectExtent b="0" l="0" r="0" t="0"/>
-            <wp:docPr descr="Captura 16" title="" id="55" name="Picture"/>
+            <wp:docPr descr="Captura 16" title="" id="64" name="Picture"/>
             <a:graphic>
               <a:graphicData uri="http://schemas.openxmlformats.org/drawingml/2006/picture">
                 <pic:pic>
                   <pic:nvPicPr>
-                    <pic:cNvPr descr="semana-5-builder/evidencias/captura_16.png" id="56" name="Picture"/>
+                    <pic:cNvPr descr="semana-5-builder/evidencias/captura_16.png" id="65" name="Picture"/>
                     <pic:cNvPicPr>
                       <a:picLocks noChangeArrowheads="1" noChangeAspect="1"/>
                     </pic:cNvPicPr>
                   </pic:nvPicPr>
                   <pic:blipFill>
-                    <a:blip r:embed="rId54"/>
+                    <a:blip r:embed="rId63"/>
                     <a:stretch>
                       <a:fillRect/>
                     </a:stretch>
@@ -9997,18 +10624,18 @@
           <wp:inline>
             <wp:extent cx="5334000" cy="6407371"/>
             <wp:effectExtent b="0" l="0" r="0" t="0"/>
-            <wp:docPr descr="Captura 17" title="" id="58" name="Picture"/>
+            <wp:docPr descr="Captura 17" title="" id="67" name="Picture"/>
             <a:graphic>
               <a:graphicData uri="http://schemas.openxmlformats.org/drawingml/2006/picture">
                 <pic:pic>
                   <pic:nvPicPr>
-                    <pic:cNvPr descr="semana-5-builder/evidencias/captura_17.png" id="59" name="Picture"/>
+                    <pic:cNvPr descr="semana-5-builder/evidencias/captura_17.png" id="68" name="Picture"/>
                     <pic:cNvPicPr>
                       <a:picLocks noChangeArrowheads="1" noChangeAspect="1"/>
                     </pic:cNvPicPr>
                   </pic:nvPicPr>
                   <pic:blipFill>
-                    <a:blip r:embed="rId57"/>
+                    <a:blip r:embed="rId66"/>
                     <a:stretch>
                       <a:fillRect/>
                     </a:stretch>
@@ -10134,18 +10761,18 @@
           <wp:inline>
             <wp:extent cx="5334000" cy="3303245"/>
             <wp:effectExtent b="0" l="0" r="0" t="0"/>
-            <wp:docPr descr="Captura 18" title="" id="61" name="Picture"/>
+            <wp:docPr descr="Captura 18" title="" id="70" name="Picture"/>
             <a:graphic>
               <a:graphicData uri="http://schemas.openxmlformats.org/drawingml/2006/picture">
                 <pic:pic>
                   <pic:nvPicPr>
-                    <pic:cNvPr descr="semana-5-builder/evidencias/captura_18.png" id="62" name="Picture"/>
+                    <pic:cNvPr descr="semana-5-builder/evidencias/captura_18.png" id="71" name="Picture"/>
                     <pic:cNvPicPr>
                       <a:picLocks noChangeArrowheads="1" noChangeAspect="1"/>
                     </pic:cNvPicPr>
                   </pic:nvPicPr>
                   <pic:blipFill>
-                    <a:blip r:embed="rId60"/>
+                    <a:blip r:embed="rId69"/>
                     <a:stretch>
                       <a:fillRect/>
                     </a:stretch>
@@ -12090,6 +12717,221 @@
     </w:p>
     <w:p>
       <w:pPr>
+        <w:pStyle w:val="Heading3"/>
+      </w:pPr>
+      <w:r>
+        <w:t xml:space="preserve">Diagrama UML del Abstract Factory</w:t>
+      </w:r>
+    </w:p>
+    <w:p>
+      <w:pPr>
+        <w:pStyle w:val="CaptionedFigure"/>
+      </w:pPr>
+      <w:r>
+        <w:drawing>
+          <wp:inline>
+            <wp:extent cx="5334000" cy="3095625"/>
+            <wp:effectExtent b="0" l="0" r="0" t="0"/>
+            <wp:docPr descr="Diagrama UML del patrón Abstract Factory" title="" id="73" name="Picture"/>
+            <a:graphic>
+              <a:graphicData uri="http://schemas.openxmlformats.org/drawingml/2006/picture">
+                <pic:pic>
+                  <pic:nvPicPr>
+                    <pic:cNvPr descr="semana-6-abstract-factory-prototype/diagramas/uml-abstract-factory.png" id="74" name="Picture"/>
+                    <pic:cNvPicPr>
+                      <a:picLocks noChangeArrowheads="1" noChangeAspect="1"/>
+                    </pic:cNvPicPr>
+                  </pic:nvPicPr>
+                  <pic:blipFill>
+                    <a:blip r:embed="rId72"/>
+                    <a:stretch>
+                      <a:fillRect/>
+                    </a:stretch>
+                  </pic:blipFill>
+                  <pic:spPr bwMode="auto">
+                    <a:xfrm>
+                      <a:off x="0" y="0"/>
+                      <a:ext cx="5334000" cy="3095625"/>
+                    </a:xfrm>
+                    <a:prstGeom prst="rect">
+                      <a:avLst/>
+                    </a:prstGeom>
+                    <a:noFill/>
+                    <a:ln w="9525">
+                      <a:noFill/>
+                      <a:headEnd/>
+                      <a:tailEnd/>
+                    </a:ln>
+                  </pic:spPr>
+                </pic:pic>
+              </a:graphicData>
+            </a:graphic>
+          </wp:inline>
+        </w:drawing>
+      </w:r>
+    </w:p>
+    <w:p>
+      <w:pPr>
+        <w:pStyle w:val="ImageCaption"/>
+      </w:pPr>
+      <w:r>
+        <w:t xml:space="preserve">Diagrama UML del patrón Abstract Factory</w:t>
+      </w:r>
+    </w:p>
+    <w:p>
+      <w:pPr>
+        <w:pStyle w:val="BodyText"/>
+      </w:pPr>
+      <w:r>
+        <w:t xml:space="preserve">La fábrica abstracta declara un método por producto y cada fábrica concreta crea, en exclusiva,</w:t>
+      </w:r>
+      <w:r>
+        <w:t xml:space="preserve"> </w:t>
+      </w:r>
+      <w:r>
+        <w:t xml:space="preserve">los productos de su familia: las flechas de creación de</w:t>
+      </w:r>
+      <w:r>
+        <w:t xml:space="preserve"> </w:t>
+      </w:r>
+      <w:r>
+        <w:rPr>
+          <w:rStyle w:val="VerbatimChar"/>
+        </w:rPr>
+        <w:t xml:space="preserve">FabricaInvernadero</w:t>
+      </w:r>
+      <w:r>
+        <w:t xml:space="preserve"> </w:t>
+      </w:r>
+      <w:r>
+        <w:t xml:space="preserve">apuntan solo a</w:t>
+      </w:r>
+      <w:r>
+        <w:t xml:space="preserve"> </w:t>
+      </w:r>
+      <w:r>
+        <w:rPr>
+          <w:rStyle w:val="VerbatimChar"/>
+        </w:rPr>
+        <w:t xml:space="preserve">SensorHumedadInvernadero</w:t>
+      </w:r>
+      <w:r>
+        <w:t xml:space="preserve">,</w:t>
+      </w:r>
+      <w:r>
+        <w:t xml:space="preserve"> </w:t>
+      </w:r>
+      <w:r>
+        <w:rPr>
+          <w:rStyle w:val="VerbatimChar"/>
+        </w:rPr>
+        <w:t xml:space="preserve">SensorTemperaturaInvernadero</w:t>
+      </w:r>
+      <w:r>
+        <w:t xml:space="preserve"> </w:t>
+      </w:r>
+      <w:r>
+        <w:t xml:space="preserve">y</w:t>
+      </w:r>
+      <w:r>
+        <w:t xml:space="preserve"> </w:t>
+      </w:r>
+      <w:r>
+        <w:rPr>
+          <w:rStyle w:val="VerbatimChar"/>
+        </w:rPr>
+        <w:t xml:space="preserve">RiegoGoteo</w:t>
+      </w:r>
+      <w:r>
+        <w:t xml:space="preserve">.</w:t>
+      </w:r>
+      <w:r>
+        <w:t xml:space="preserve"> </w:t>
+      </w:r>
+      <w:r>
+        <w:rPr>
+          <w:rStyle w:val="VerbatimChar"/>
+        </w:rPr>
+        <w:t xml:space="preserve">EstacionMonitoreo</w:t>
+      </w:r>
+      <w:r>
+        <w:t xml:space="preserve"> </w:t>
+      </w:r>
+      <w:r>
+        <w:t xml:space="preserve">depende únicamente de las tres interfaces —</w:t>
+      </w:r>
+      <w:r>
+        <w:rPr>
+          <w:rStyle w:val="VerbatimChar"/>
+        </w:rPr>
+        <w:t xml:space="preserve">FabricaEquipamiento</w:t>
+      </w:r>
+      <w:r>
+        <w:t xml:space="preserve">,</w:t>
+      </w:r>
+      <w:r>
+        <w:t xml:space="preserve"> </w:t>
+      </w:r>
+      <w:r>
+        <w:rPr>
+          <w:rStyle w:val="VerbatimChar"/>
+        </w:rPr>
+        <w:t xml:space="preserve">Sensor</w:t>
+      </w:r>
+      <w:r>
+        <w:t xml:space="preserve"> </w:t>
+      </w:r>
+      <w:r>
+        <w:t xml:space="preserve">y</w:t>
+      </w:r>
+      <w:r>
+        <w:t xml:space="preserve"> </w:t>
+      </w:r>
+      <w:r>
+        <w:rPr>
+          <w:rStyle w:val="VerbatimChar"/>
+        </w:rPr>
+        <w:t xml:space="preserve">ActuadorRiego</w:t>
+      </w:r>
+      <w:r>
+        <w:t xml:space="preserve">—, que</w:t>
+      </w:r>
+      <w:r>
+        <w:t xml:space="preserve"> </w:t>
+      </w:r>
+      <w:r>
+        <w:t xml:space="preserve">es lo que le permite funcionar igual con cualquier zona.</w:t>
+      </w:r>
+    </w:p>
+    <w:p>
+      <w:pPr>
+        <w:pStyle w:val="BodyText"/>
+      </w:pPr>
+      <w:r>
+        <w:t xml:space="preserve">Fuente del diagrama:</w:t>
+      </w:r>
+      <w:r>
+        <w:t xml:space="preserve"> </w:t>
+      </w:r>
+      <w:r>
+        <w:rPr>
+          <w:rStyle w:val="VerbatimChar"/>
+        </w:rPr>
+        <w:t xml:space="preserve">diagramas/uml-abstract-factory.mmd</w:t>
+      </w:r>
+      <w:r>
+        <w:t xml:space="preserve">.</w:t>
+      </w:r>
+    </w:p>
+    <w:p>
+      <w:r>
+        <w:pict>
+          <v:rect style="width:0;height:1.5pt" o:hralign="center" o:hrstd="t" o:hr="t"/>
+        </w:pict>
+      </w:r>
+    </w:p>
+    <w:p>
+      <w:pPr>
         <w:pStyle w:val="Heading2"/>
       </w:pPr>
       <w:r>
@@ -12843,6 +13685,219 @@
     </w:p>
     <w:p>
       <w:pPr>
+        <w:pStyle w:val="Heading3"/>
+      </w:pPr>
+      <w:r>
+        <w:t xml:space="preserve">Diagrama UML del Prototype</w:t>
+      </w:r>
+    </w:p>
+    <w:p>
+      <w:pPr>
+        <w:pStyle w:val="CaptionedFigure"/>
+      </w:pPr>
+      <w:r>
+        <w:drawing>
+          <wp:inline>
+            <wp:extent cx="5334000" cy="2034267"/>
+            <wp:effectExtent b="0" l="0" r="0" t="0"/>
+            <wp:docPr descr="Diagrama UML del patrón Prototype" title="" id="76" name="Picture"/>
+            <a:graphic>
+              <a:graphicData uri="http://schemas.openxmlformats.org/drawingml/2006/picture">
+                <pic:pic>
+                  <pic:nvPicPr>
+                    <pic:cNvPr descr="semana-6-abstract-factory-prototype/diagramas/uml-prototype.png" id="77" name="Picture"/>
+                    <pic:cNvPicPr>
+                      <a:picLocks noChangeArrowheads="1" noChangeAspect="1"/>
+                    </pic:cNvPicPr>
+                  </pic:nvPicPr>
+                  <pic:blipFill>
+                    <a:blip r:embed="rId75"/>
+                    <a:stretch>
+                      <a:fillRect/>
+                    </a:stretch>
+                  </pic:blipFill>
+                  <pic:spPr bwMode="auto">
+                    <a:xfrm>
+                      <a:off x="0" y="0"/>
+                      <a:ext cx="5334000" cy="2034267"/>
+                    </a:xfrm>
+                    <a:prstGeom prst="rect">
+                      <a:avLst/>
+                    </a:prstGeom>
+                    <a:noFill/>
+                    <a:ln w="9525">
+                      <a:noFill/>
+                      <a:headEnd/>
+                      <a:tailEnd/>
+                    </a:ln>
+                  </pic:spPr>
+                </pic:pic>
+              </a:graphicData>
+            </a:graphic>
+          </wp:inline>
+        </w:drawing>
+      </w:r>
+    </w:p>
+    <w:p>
+      <w:pPr>
+        <w:pStyle w:val="ImageCaption"/>
+      </w:pPr>
+      <w:r>
+        <w:t xml:space="preserve">Diagrama UML del patrón Prototype</w:t>
+      </w:r>
+    </w:p>
+    <w:p>
+      <w:pPr>
+        <w:pStyle w:val="BodyText"/>
+      </w:pPr>
+      <w:r>
+        <w:t xml:space="preserve">El diagrama distingue con la notación lo que el código decide en</w:t>
+      </w:r>
+      <w:r>
+        <w:t xml:space="preserve"> </w:t>
+      </w:r>
+      <w:r>
+        <w:rPr>
+          <w:rStyle w:val="VerbatimChar"/>
+        </w:rPr>
+        <w:t xml:space="preserve">clone()</w:t>
+      </w:r>
+      <w:r>
+        <w:t xml:space="preserve">: la relación con</w:t>
+      </w:r>
+      <w:r>
+        <w:t xml:space="preserve"> </w:t>
+      </w:r>
+      <w:r>
+        <w:rPr>
+          <w:rStyle w:val="VerbatimChar"/>
+        </w:rPr>
+        <w:t xml:space="preserve">UmbralesLote</w:t>
+      </w:r>
+      <w:r>
+        <w:t xml:space="preserve"> </w:t>
+      </w:r>
+      <w:r>
+        <w:t xml:space="preserve">es de</w:t>
+      </w:r>
+      <w:r>
+        <w:t xml:space="preserve"> </w:t>
+      </w:r>
+      <w:r>
+        <w:rPr>
+          <w:b/>
+          <w:bCs/>
+        </w:rPr>
+        <w:t xml:space="preserve">composición</w:t>
+      </w:r>
+      <w:r>
+        <w:t xml:space="preserve"> </w:t>
+      </w:r>
+      <w:r>
+        <w:t xml:space="preserve">(rombo lleno) porque cada lote tiene los suyos y se duplican</w:t>
+      </w:r>
+      <w:r>
+        <w:t xml:space="preserve"> </w:t>
+      </w:r>
+      <w:r>
+        <w:t xml:space="preserve">al clonar; las relaciones con</w:t>
+      </w:r>
+      <w:r>
+        <w:t xml:space="preserve"> </w:t>
+      </w:r>
+      <w:r>
+        <w:rPr>
+          <w:rStyle w:val="VerbatimChar"/>
+        </w:rPr>
+        <w:t xml:space="preserve">Sensor</w:t>
+      </w:r>
+      <w:r>
+        <w:t xml:space="preserve"> </w:t>
+      </w:r>
+      <w:r>
+        <w:t xml:space="preserve">y</w:t>
+      </w:r>
+      <w:r>
+        <w:t xml:space="preserve"> </w:t>
+      </w:r>
+      <w:r>
+        <w:rPr>
+          <w:rStyle w:val="VerbatimChar"/>
+        </w:rPr>
+        <w:t xml:space="preserve">ActuadorRiego</w:t>
+      </w:r>
+      <w:r>
+        <w:t xml:space="preserve"> </w:t>
+      </w:r>
+      <w:r>
+        <w:t xml:space="preserve">son de</w:t>
+      </w:r>
+      <w:r>
+        <w:t xml:space="preserve"> </w:t>
+      </w:r>
+      <w:r>
+        <w:rPr>
+          <w:b/>
+          <w:bCs/>
+        </w:rPr>
+        <w:t xml:space="preserve">agregación</w:t>
+      </w:r>
+      <w:r>
+        <w:t xml:space="preserve"> </w:t>
+      </w:r>
+      <w:r>
+        <w:t xml:space="preserve">(rombo vacío) porque</w:t>
+      </w:r>
+      <w:r>
+        <w:t xml:space="preserve"> </w:t>
+      </w:r>
+      <w:r>
+        <w:t xml:space="preserve">esas instancias se comparten entre el prototipo y sus clones.</w:t>
+      </w:r>
+      <w:r>
+        <w:t xml:space="preserve"> </w:t>
+      </w:r>
+      <w:r>
+        <w:rPr>
+          <w:rStyle w:val="VerbatimChar"/>
+        </w:rPr>
+        <w:t xml:space="preserve">CatalogoLotes</w:t>
+      </w:r>
+      <w:r>
+        <w:t xml:space="preserve"> </w:t>
+      </w:r>
+      <w:r>
+        <w:t xml:space="preserve">guarda las plantillas</w:t>
+      </w:r>
+      <w:r>
+        <w:t xml:space="preserve"> </w:t>
+      </w:r>
+      <w:r>
+        <w:t xml:space="preserve">y entrega siempre una copia.</w:t>
+      </w:r>
+    </w:p>
+    <w:p>
+      <w:pPr>
+        <w:pStyle w:val="BodyText"/>
+      </w:pPr>
+      <w:r>
+        <w:t xml:space="preserve">Fuente del diagrama:</w:t>
+      </w:r>
+      <w:r>
+        <w:t xml:space="preserve"> </w:t>
+      </w:r>
+      <w:r>
+        <w:rPr>
+          <w:rStyle w:val="VerbatimChar"/>
+        </w:rPr>
+        <w:t xml:space="preserve">diagramas/uml-prototype.mmd</w:t>
+      </w:r>
+      <w:r>
+        <w:t xml:space="preserve">.</w:t>
+      </w:r>
+    </w:p>
+    <w:p>
+      <w:pPr>
         <w:pStyle w:val="Heading2"/>
       </w:pPr>
       <w:r>
@@ -13133,18 +14188,18 @@
           <wp:inline>
             <wp:extent cx="5334000" cy="2043606"/>
             <wp:effectExtent b="0" l="0" r="0" t="0"/>
-            <wp:docPr descr="Captura 19" title="" id="64" name="Picture"/>
+            <wp:docPr descr="Captura 19" title="" id="79" name="Picture"/>
             <a:graphic>
               <a:graphicData uri="http://schemas.openxmlformats.org/drawingml/2006/picture">
                 <pic:pic>
                   <pic:nvPicPr>
-                    <pic:cNvPr descr="semana-6-abstract-factory-prototype/evidencias/captura_19.png" id="65" name="Picture"/>
+                    <pic:cNvPr descr="semana-6-abstract-factory-prototype/evidencias/captura_19.png" id="80" name="Picture"/>
                     <pic:cNvPicPr>
                       <a:picLocks noChangeArrowheads="1" noChangeAspect="1"/>
                     </pic:cNvPicPr>
                   </pic:nvPicPr>
                   <pic:blipFill>
-                    <a:blip r:embed="rId63"/>
+                    <a:blip r:embed="rId78"/>
                     <a:stretch>
                       <a:fillRect/>
                     </a:stretch>
@@ -13280,18 +14335,18 @@
           <wp:inline>
             <wp:extent cx="5334000" cy="1149703"/>
             <wp:effectExtent b="0" l="0" r="0" t="0"/>
-            <wp:docPr descr="Captura 20" title="" id="67" name="Picture"/>
+            <wp:docPr descr="Captura 20" title="" id="82" name="Picture"/>
             <a:graphic>
               <a:graphicData uri="http://schemas.openxmlformats.org/drawingml/2006/picture">
                 <pic:pic>
                   <pic:nvPicPr>
-                    <pic:cNvPr descr="semana-6-abstract-factory-prototype/evidencias/captura_20.png" id="68" name="Picture"/>
+                    <pic:cNvPr descr="semana-6-abstract-factory-prototype/evidencias/captura_20.png" id="83" name="Picture"/>
                     <pic:cNvPicPr>
                       <a:picLocks noChangeArrowheads="1" noChangeAspect="1"/>
                     </pic:cNvPicPr>
                   </pic:nvPicPr>
                   <pic:blipFill>
-                    <a:blip r:embed="rId66"/>
+                    <a:blip r:embed="rId81"/>
                     <a:stretch>
                       <a:fillRect/>
                     </a:stretch>
@@ -13442,18 +14497,18 @@
           <wp:inline>
             <wp:extent cx="5334000" cy="2347951"/>
             <wp:effectExtent b="0" l="0" r="0" t="0"/>
-            <wp:docPr descr="Captura 21" title="" id="70" name="Picture"/>
+            <wp:docPr descr="Captura 21" title="" id="85" name="Picture"/>
             <a:graphic>
               <a:graphicData uri="http://schemas.openxmlformats.org/drawingml/2006/picture">
                 <pic:pic>
                   <pic:nvPicPr>
-                    <pic:cNvPr descr="semana-6-abstract-factory-prototype/evidencias/captura_21.png" id="71" name="Picture"/>
+                    <pic:cNvPr descr="semana-6-abstract-factory-prototype/evidencias/captura_21.png" id="86" name="Picture"/>
                     <pic:cNvPicPr>
                       <a:picLocks noChangeArrowheads="1" noChangeAspect="1"/>
                     </pic:cNvPicPr>
                   </pic:nvPicPr>
                   <pic:blipFill>
-                    <a:blip r:embed="rId69"/>
+                    <a:blip r:embed="rId84"/>
                     <a:stretch>
                       <a:fillRect/>
                     </a:stretch>
@@ -13583,18 +14638,18 @@
           <wp:inline>
             <wp:extent cx="5334000" cy="2919432"/>
             <wp:effectExtent b="0" l="0" r="0" t="0"/>
-            <wp:docPr descr="Captura 22" title="" id="73" name="Picture"/>
+            <wp:docPr descr="Captura 22" title="" id="88" name="Picture"/>
             <a:graphic>
               <a:graphicData uri="http://schemas.openxmlformats.org/drawingml/2006/picture">
                 <pic:pic>
                   <pic:nvPicPr>
-                    <pic:cNvPr descr="semana-6-abstract-factory-prototype/evidencias/captura_22.png" id="74" name="Picture"/>
+                    <pic:cNvPr descr="semana-6-abstract-factory-prototype/evidencias/captura_22.png" id="89" name="Picture"/>
                     <pic:cNvPicPr>
                       <a:picLocks noChangeArrowheads="1" noChangeAspect="1"/>
                     </pic:cNvPicPr>
                   </pic:nvPicPr>
                   <pic:blipFill>
-                    <a:blip r:embed="rId72"/>
+                    <a:blip r:embed="rId87"/>
                     <a:stretch>
                       <a:fillRect/>
                     </a:stretch>
@@ -13729,18 +14784,18 @@
           <wp:inline>
             <wp:extent cx="5334000" cy="1207202"/>
             <wp:effectExtent b="0" l="0" r="0" t="0"/>
-            <wp:docPr descr="Captura 23" title="" id="76" name="Picture"/>
+            <wp:docPr descr="Captura 23" title="" id="91" name="Picture"/>
             <a:graphic>
               <a:graphicData uri="http://schemas.openxmlformats.org/drawingml/2006/picture">
                 <pic:pic>
                   <pic:nvPicPr>
-                    <pic:cNvPr descr="semana-6-abstract-factory-prototype/evidencias/captura_23.png" id="77" name="Picture"/>
+                    <pic:cNvPr descr="semana-6-abstract-factory-prototype/evidencias/captura_23.png" id="92" name="Picture"/>
                     <pic:cNvPicPr>
                       <a:picLocks noChangeArrowheads="1" noChangeAspect="1"/>
                     </pic:cNvPicPr>
                   </pic:nvPicPr>
                   <pic:blipFill>
-                    <a:blip r:embed="rId75"/>
+                    <a:blip r:embed="rId90"/>
                     <a:stretch>
                       <a:fillRect/>
                     </a:stretch>
@@ -13905,18 +14960,18 @@
           <wp:inline>
             <wp:extent cx="5334000" cy="1908245"/>
             <wp:effectExtent b="0" l="0" r="0" t="0"/>
-            <wp:docPr descr="Captura 24" title="" id="79" name="Picture"/>
+            <wp:docPr descr="Captura 24" title="" id="94" name="Picture"/>
             <a:graphic>
               <a:graphicData uri="http://schemas.openxmlformats.org/drawingml/2006/picture">
                 <pic:pic>
                   <pic:nvPicPr>
-                    <pic:cNvPr descr="semana-6-abstract-factory-prototype/evidencias/captura_24.png" id="80" name="Picture"/>
+                    <pic:cNvPr descr="semana-6-abstract-factory-prototype/evidencias/captura_24.png" id="95" name="Picture"/>
                     <pic:cNvPicPr>
                       <a:picLocks noChangeArrowheads="1" noChangeAspect="1"/>
                     </pic:cNvPicPr>
                   </pic:nvPicPr>
                   <pic:blipFill>
-                    <a:blip r:embed="rId78"/>
+                    <a:blip r:embed="rId93"/>
                     <a:stretch>
                       <a:fillRect/>
                     </a:stretch>

</xml_diff>